<commit_message>
update thesis v5 + include ML docs
</commit_message>
<xml_diff>
--- a/Docs/Tesina_de_grado_Franco_Olivero_v1.2.docx
+++ b/Docs/Tesina_de_grado_Franco_Olivero_v1.2.docx
@@ -34,7 +34,7 @@
           <w:lang w:val="en-US"/>
         </w:rPr>
         <w:drawing>
-          <wp:inline distT="0" distB="0" distL="0" distR="0" wp14:anchorId="018FE07F" wp14:editId="440441F0">
+          <wp:inline distT="0" distB="0" distL="0" distR="0" wp14:anchorId="018FE07F" wp14:editId="7010524B">
             <wp:extent cx="1673352" cy="1481328"/>
             <wp:effectExtent l="0" t="0" r="3175" b="5080"/>
             <wp:docPr id="1" name="image2.jpg" descr="http://www.econ.uba.ar/www/institutos/epistemologia/fsdf.jpg"/>
@@ -3471,19 +3471,8 @@
           <w:color w:val="000000"/>
           <w:lang w:val="es-AR" w:eastAsia="es-AR"/>
         </w:rPr>
-        <w:t xml:space="preserve">machine </w:t>
-      </w:r>
-      <w:proofErr w:type="spellStart"/>
-      <w:r>
-        <w:rPr>
-          <w:i/>
-          <w:iCs/>
-          <w:color w:val="000000"/>
-          <w:lang w:val="es-AR" w:eastAsia="es-AR"/>
-        </w:rPr>
-        <w:t>learning</w:t>
-      </w:r>
-      <w:proofErr w:type="spellEnd"/>
+        <w:t>machine learning</w:t>
+      </w:r>
       <w:r>
         <w:rPr>
           <w:color w:val="000000"/>
@@ -3564,13 +3553,43 @@
         <w:rPr>
           <w:rFonts w:eastAsiaTheme="majorEastAsia"/>
         </w:rPr>
-        <w:t>. Luego, se describe el funcionamiento de los modelos existentes para proyectar la mortalidad y, finalmente, se introducen los conceptos principales del aprendizaje automático</w:t>
+        <w:t xml:space="preserve">. Luego, se describe el funcionamiento </w:t>
       </w:r>
       <w:r>
         <w:rPr>
           <w:rFonts w:eastAsiaTheme="majorEastAsia"/>
         </w:rPr>
-        <w:t xml:space="preserve"> que se aplicarán.</w:t>
+        <w:t>del modelo “clásico” de Lee-Carter</w:t>
+      </w:r>
+      <w:r>
+        <w:rPr>
+          <w:rFonts w:eastAsiaTheme="majorEastAsia"/>
+        </w:rPr>
+        <w:t xml:space="preserve"> para proyectar </w:t>
+      </w:r>
+      <w:r>
+        <w:rPr>
+          <w:rFonts w:eastAsiaTheme="majorEastAsia"/>
+        </w:rPr>
+        <w:t xml:space="preserve">tasas de </w:t>
+      </w:r>
+      <w:r>
+        <w:rPr>
+          <w:rFonts w:eastAsiaTheme="majorEastAsia"/>
+        </w:rPr>
+        <w:t>mortalidad y, finalmente, se introducen los conceptos principales del aprendizaje automático</w:t>
+      </w:r>
+      <w:r>
+        <w:rPr>
+          <w:rFonts w:eastAsiaTheme="majorEastAsia"/>
+        </w:rPr>
+        <w:t xml:space="preserve"> que se aplicarán</w:t>
+      </w:r>
+      <w:r>
+        <w:rPr>
+          <w:rFonts w:eastAsiaTheme="majorEastAsia"/>
+        </w:rPr>
+        <w:t xml:space="preserve"> al modelo.</w:t>
       </w:r>
     </w:p>
     <w:p>
@@ -7086,7 +7105,21 @@
         <w:rPr>
           <w:lang w:val="en-US"/>
         </w:rPr>
-        <w:t xml:space="preserve"> en </w:t>
+        <w:t xml:space="preserve"> </w:t>
+      </w:r>
+      <w:proofErr w:type="spellStart"/>
+      <w:r>
+        <w:rPr>
+          <w:lang w:val="en-US"/>
+        </w:rPr>
+        <w:t>en</w:t>
+      </w:r>
+      <w:proofErr w:type="spellEnd"/>
+      <w:r>
+        <w:rPr>
+          <w:lang w:val="en-US"/>
+        </w:rPr>
+        <w:t xml:space="preserve"> </w:t>
       </w:r>
       <w:proofErr w:type="spellStart"/>
       <w:r>
@@ -10179,7 +10212,6 @@
             <w:rFonts w:ascii="Cambria Math" w:hAnsi="Cambria Math"/>
             <w:sz w:val="20"/>
             <w:szCs w:val="20"/>
-            <w:lang w:val="en-US"/>
           </w:rPr>
           <m:t>+</m:t>
         </m:r>
@@ -10223,7 +10255,6 @@
                 <w:rFonts w:ascii="Cambria Math" w:hAnsi="Cambria Math"/>
                 <w:sz w:val="20"/>
                 <w:szCs w:val="20"/>
-                <w:lang w:val="en-US"/>
               </w:rPr>
               <m:t>,</m:t>
             </m:r>
@@ -11148,23 +11179,7 @@
                 <w:sz w:val="20"/>
                 <w:szCs w:val="20"/>
               </w:rPr>
-              <m:t>1</m:t>
-            </m:r>
-            <m:r>
-              <w:rPr>
-                <w:rFonts w:ascii="Cambria Math" w:hAnsi="Cambria Math"/>
-                <w:sz w:val="20"/>
-                <w:szCs w:val="20"/>
-              </w:rPr>
-              <m:t>,</m:t>
-            </m:r>
-            <m:r>
-              <w:rPr>
-                <w:rFonts w:ascii="Cambria Math" w:hAnsi="Cambria Math"/>
-                <w:sz w:val="20"/>
-                <w:szCs w:val="20"/>
-              </w:rPr>
-              <m:t>1</m:t>
+              <m:t>1,1</m:t>
             </m:r>
           </m:sub>
         </m:sSub>
@@ -11374,7 +11389,19 @@
         <w:t xml:space="preserve">. </w:t>
       </w:r>
       <w:r>
-        <w:t xml:space="preserve">Mediante la aproximación de rango (1) de </w:t>
+        <w:t xml:space="preserve">Mediante </w:t>
+      </w:r>
+      <w:r>
+        <w:t>una</w:t>
+      </w:r>
+      <w:r>
+        <w:t xml:space="preserve"> aproximación </w:t>
+      </w:r>
+      <w:r>
+        <w:t xml:space="preserve">matricial </w:t>
+      </w:r>
+      <w:r>
+        <w:t xml:space="preserve">de rango (1) de </w:t>
       </w:r>
       <m:oMath>
         <m:sSub>
@@ -11419,6 +11446,9 @@
       </w:r>
       <w:r>
         <w:t xml:space="preserve"> </w:t>
+      </w:r>
+      <w:r>
+        <w:t xml:space="preserve">y la aplicación del teorema de Eckart-Young </w:t>
       </w:r>
       <w:r>
         <w:t xml:space="preserve">se </w:t>
@@ -11516,6 +11546,46 @@
                   <w:sz w:val="20"/>
                   <w:szCs w:val="20"/>
                 </w:rPr>
+                <m:t>U</m:t>
+              </m:r>
+            </m:e>
+            <m:sub>
+              <m:r>
+                <w:rPr>
+                  <w:rFonts w:ascii="Cambria Math" w:hAnsi="Cambria Math"/>
+                  <w:sz w:val="20"/>
+                  <w:szCs w:val="20"/>
+                </w:rPr>
+                <m:t>:,1</m:t>
+              </m:r>
+            </m:sub>
+          </m:sSub>
+          <m:r>
+            <w:rPr>
+              <w:rFonts w:ascii="Cambria Math" w:hAnsi="Cambria Math"/>
+              <w:sz w:val="20"/>
+              <w:szCs w:val="20"/>
+            </w:rPr>
+            <m:t>​=(</m:t>
+          </m:r>
+          <m:sSub>
+            <m:sSubPr>
+              <m:ctrlPr>
+                <w:rPr>
+                  <w:rFonts w:ascii="Cambria Math" w:hAnsi="Cambria Math"/>
+                  <w:i/>
+                  <w:sz w:val="20"/>
+                  <w:szCs w:val="20"/>
+                </w:rPr>
+              </m:ctrlPr>
+            </m:sSubPr>
+            <m:e>
+              <m:r>
+                <w:rPr>
+                  <w:rFonts w:ascii="Cambria Math" w:hAnsi="Cambria Math"/>
+                  <w:sz w:val="20"/>
+                  <w:szCs w:val="20"/>
+                </w:rPr>
                 <m:t>u</m:t>
               </m:r>
             </m:e>
@@ -11526,14 +11596,228 @@
                   <w:sz w:val="20"/>
                   <w:szCs w:val="20"/>
                 </w:rPr>
-                <m:t>1</m:t>
+                <m:t>1,1</m:t>
               </m:r>
             </m:sub>
           </m:sSub>
+          <m:r>
+            <w:rPr>
+              <w:rFonts w:ascii="Cambria Math" w:hAnsi="Cambria Math"/>
+              <w:sz w:val="20"/>
+              <w:szCs w:val="20"/>
+            </w:rPr>
+            <m:t>,</m:t>
+          </m:r>
+          <m:sSub>
+            <m:sSubPr>
+              <m:ctrlPr>
+                <w:rPr>
+                  <w:rFonts w:ascii="Cambria Math" w:hAnsi="Cambria Math"/>
+                  <w:i/>
+                  <w:sz w:val="20"/>
+                  <w:szCs w:val="20"/>
+                </w:rPr>
+              </m:ctrlPr>
+            </m:sSubPr>
+            <m:e>
+              <m:r>
+                <w:rPr>
+                  <w:rFonts w:ascii="Cambria Math" w:hAnsi="Cambria Math"/>
+                  <w:sz w:val="20"/>
+                  <w:szCs w:val="20"/>
+                </w:rPr>
+                <m:t>u</m:t>
+              </m:r>
+            </m:e>
+            <m:sub>
+              <m:r>
+                <w:rPr>
+                  <w:rFonts w:ascii="Cambria Math" w:hAnsi="Cambria Math"/>
+                  <w:sz w:val="20"/>
+                  <w:szCs w:val="20"/>
+                </w:rPr>
+                <m:t>2</m:t>
+              </m:r>
+              <m:r>
+                <w:rPr>
+                  <w:rFonts w:ascii="Cambria Math" w:hAnsi="Cambria Math"/>
+                  <w:sz w:val="20"/>
+                  <w:szCs w:val="20"/>
+                </w:rPr>
+                <m:t>,1</m:t>
+              </m:r>
+            </m:sub>
+          </m:sSub>
+          <m:r>
+            <w:rPr>
+              <w:rFonts w:ascii="Cambria Math" w:hAnsi="Cambria Math"/>
+              <w:sz w:val="20"/>
+              <w:szCs w:val="20"/>
+            </w:rPr>
+            <m:t xml:space="preserve">,…, </m:t>
+          </m:r>
+          <m:sSub>
+            <m:sSubPr>
+              <m:ctrlPr>
+                <w:rPr>
+                  <w:rFonts w:ascii="Cambria Math" w:hAnsi="Cambria Math"/>
+                  <w:i/>
+                  <w:sz w:val="20"/>
+                  <w:szCs w:val="20"/>
+                </w:rPr>
+              </m:ctrlPr>
+            </m:sSubPr>
+            <m:e>
+              <m:r>
+                <w:rPr>
+                  <w:rFonts w:ascii="Cambria Math" w:hAnsi="Cambria Math"/>
+                  <w:sz w:val="20"/>
+                  <w:szCs w:val="20"/>
+                </w:rPr>
+                <m:t>u</m:t>
+              </m:r>
+            </m:e>
+            <m:sub>
+              <m:sSub>
+                <m:sSubPr>
+                  <m:ctrlPr>
+                    <w:rPr>
+                      <w:rFonts w:ascii="Cambria Math" w:hAnsi="Cambria Math"/>
+                      <w:i/>
+                      <w:sz w:val="20"/>
+                      <w:szCs w:val="20"/>
+                    </w:rPr>
+                  </m:ctrlPr>
+                </m:sSubPr>
+                <m:e>
+                  <m:r>
+                    <w:rPr>
+                      <w:rFonts w:ascii="Cambria Math" w:hAnsi="Cambria Math"/>
+                      <w:sz w:val="20"/>
+                      <w:szCs w:val="20"/>
+                    </w:rPr>
+                    <m:t>n</m:t>
+                  </m:r>
+                </m:e>
+                <m:sub>
+                  <m:r>
+                    <w:rPr>
+                      <w:rFonts w:ascii="Cambria Math" w:hAnsi="Cambria Math"/>
+                      <w:sz w:val="20"/>
+                      <w:szCs w:val="20"/>
+                    </w:rPr>
+                    <m:t>x</m:t>
+                  </m:r>
+                </m:sub>
+              </m:sSub>
+              <m:r>
+                <w:rPr>
+                  <w:rFonts w:ascii="Cambria Math" w:hAnsi="Cambria Math"/>
+                  <w:sz w:val="20"/>
+                  <w:szCs w:val="20"/>
+                </w:rPr>
+                <m:t>,1</m:t>
+              </m:r>
+            </m:sub>
+          </m:sSub>
+          <m:r>
+            <w:rPr>
+              <w:rFonts w:ascii="Cambria Math" w:hAnsi="Cambria Math"/>
+              <w:sz w:val="20"/>
+              <w:szCs w:val="20"/>
+            </w:rPr>
+            <m:t>​​)</m:t>
+          </m:r>
+          <m:r>
+            <w:rPr>
+              <w:rFonts w:ascii="Cambria Math" w:hAnsi="Cambria Math"/>
+              <w:sz w:val="20"/>
+              <w:szCs w:val="20"/>
+            </w:rPr>
+            <m:t>∈</m:t>
+          </m:r>
+          <m:sSup>
+            <m:sSupPr>
+              <m:ctrlPr>
+                <w:rPr>
+                  <w:rFonts w:ascii="Cambria Math" w:hAnsi="Cambria Math"/>
+                  <w:i/>
+                  <w:sz w:val="20"/>
+                  <w:szCs w:val="20"/>
+                </w:rPr>
+              </m:ctrlPr>
+            </m:sSupPr>
+            <m:e>
+              <m:r>
+                <w:rPr>
+                  <w:rFonts w:ascii="Cambria Math" w:hAnsi="Cambria Math"/>
+                  <w:sz w:val="20"/>
+                  <w:szCs w:val="20"/>
+                </w:rPr>
+                <m:t>R</m:t>
+              </m:r>
+            </m:e>
+            <m:sup>
+              <m:r>
+                <w:rPr>
+                  <w:rFonts w:ascii="Cambria Math" w:hAnsi="Cambria Math"/>
+                  <w:sz w:val="20"/>
+                  <w:szCs w:val="20"/>
+                </w:rPr>
+                <m:t>1</m:t>
+              </m:r>
+              <m:r>
+                <w:rPr>
+                  <w:rFonts w:ascii="Cambria Math" w:hAnsi="Cambria Math"/>
+                  <w:sz w:val="20"/>
+                  <w:szCs w:val="20"/>
+                </w:rPr>
+                <m:t>×</m:t>
+              </m:r>
+              <m:sSub>
+                <m:sSubPr>
+                  <m:ctrlPr>
+                    <w:rPr>
+                      <w:rFonts w:ascii="Cambria Math" w:hAnsi="Cambria Math"/>
+                      <w:i/>
+                      <w:sz w:val="20"/>
+                      <w:szCs w:val="20"/>
+                    </w:rPr>
+                  </m:ctrlPr>
+                </m:sSubPr>
+                <m:e>
+                  <m:r>
+                    <w:rPr>
+                      <w:rFonts w:ascii="Cambria Math" w:hAnsi="Cambria Math"/>
+                      <w:sz w:val="20"/>
+                      <w:szCs w:val="20"/>
+                    </w:rPr>
+                    <m:t>n</m:t>
+                  </m:r>
+                </m:e>
+                <m:sub>
+                  <m:r>
+                    <w:rPr>
+                      <w:rFonts w:ascii="Cambria Math" w:hAnsi="Cambria Math"/>
+                      <w:sz w:val="20"/>
+                      <w:szCs w:val="20"/>
+                    </w:rPr>
+                    <m:t>x</m:t>
+                  </m:r>
+                </m:sub>
+              </m:sSub>
+            </m:sup>
+          </m:sSup>
         </m:oMath>
       </m:oMathPara>
     </w:p>
     <w:p>
+      <w:pPr>
+        <w:rPr>
+          <w:sz w:val="20"/>
+          <w:szCs w:val="20"/>
+        </w:rPr>
+      </w:pPr>
       <m:oMathPara>
         <m:oMath>
           <m:acc>
@@ -11592,6 +11876,344 @@
             </w:rPr>
             <m:t xml:space="preserve">= </m:t>
           </m:r>
+          <m:r>
+            <w:rPr>
+              <w:rFonts w:ascii="Cambria Math" w:hAnsi="Cambria Math"/>
+              <w:sz w:val="20"/>
+              <w:szCs w:val="20"/>
+            </w:rPr>
+            <m:t xml:space="preserve"> </m:t>
+          </m:r>
+          <m:sSubSup>
+            <m:sSubSupPr>
+              <m:ctrlPr>
+                <w:rPr>
+                  <w:rFonts w:ascii="Cambria Math" w:hAnsi="Cambria Math"/>
+                  <w:i/>
+                  <w:sz w:val="20"/>
+                  <w:szCs w:val="20"/>
+                </w:rPr>
+              </m:ctrlPr>
+            </m:sSubSupPr>
+            <m:e>
+              <m:r>
+                <w:rPr>
+                  <w:rFonts w:ascii="Cambria Math" w:hAnsi="Cambria Math"/>
+                  <w:sz w:val="20"/>
+                  <w:szCs w:val="20"/>
+                </w:rPr>
+                <m:t>V</m:t>
+              </m:r>
+            </m:e>
+            <m:sub>
+              <m:r>
+                <w:rPr>
+                  <w:rFonts w:ascii="Cambria Math" w:hAnsi="Cambria Math"/>
+                  <w:sz w:val="20"/>
+                  <w:szCs w:val="20"/>
+                </w:rPr>
+                <m:t>1</m:t>
+              </m:r>
+              <m:r>
+                <w:rPr>
+                  <w:rFonts w:ascii="Cambria Math" w:hAnsi="Cambria Math"/>
+                  <w:sz w:val="20"/>
+                  <w:szCs w:val="20"/>
+                </w:rPr>
+                <m:t>,</m:t>
+              </m:r>
+              <m:r>
+                <w:rPr>
+                  <w:rFonts w:ascii="Cambria Math" w:hAnsi="Cambria Math"/>
+                  <w:sz w:val="20"/>
+                  <w:szCs w:val="20"/>
+                </w:rPr>
+                <m:t>:</m:t>
+              </m:r>
+            </m:sub>
+            <m:sup>
+              <m:r>
+                <w:rPr>
+                  <w:rFonts w:ascii="Cambria Math" w:hAnsi="Cambria Math"/>
+                  <w:sz w:val="20"/>
+                  <w:szCs w:val="20"/>
+                </w:rPr>
+                <m:t>T</m:t>
+              </m:r>
+            </m:sup>
+          </m:sSubSup>
+          <m:r>
+            <w:rPr>
+              <w:rFonts w:ascii="Cambria Math" w:hAnsi="Cambria Math"/>
+              <w:sz w:val="20"/>
+              <w:szCs w:val="20"/>
+            </w:rPr>
+            <m:t>​=(</m:t>
+          </m:r>
+          <m:sSub>
+            <m:sSubPr>
+              <m:ctrlPr>
+                <w:rPr>
+                  <w:rFonts w:ascii="Cambria Math" w:hAnsi="Cambria Math"/>
+                  <w:i/>
+                  <w:sz w:val="20"/>
+                  <w:szCs w:val="20"/>
+                </w:rPr>
+              </m:ctrlPr>
+            </m:sSubPr>
+            <m:e>
+              <m:r>
+                <w:rPr>
+                  <w:rFonts w:ascii="Cambria Math" w:hAnsi="Cambria Math"/>
+                  <w:sz w:val="20"/>
+                  <w:szCs w:val="20"/>
+                </w:rPr>
+                <m:t>v</m:t>
+              </m:r>
+            </m:e>
+            <m:sub>
+              <m:r>
+                <w:rPr>
+                  <w:rFonts w:ascii="Cambria Math" w:hAnsi="Cambria Math"/>
+                  <w:sz w:val="20"/>
+                  <w:szCs w:val="20"/>
+                </w:rPr>
+                <m:t>1</m:t>
+              </m:r>
+              <m:r>
+                <w:rPr>
+                  <w:rFonts w:ascii="Cambria Math" w:hAnsi="Cambria Math"/>
+                  <w:sz w:val="20"/>
+                  <w:szCs w:val="20"/>
+                </w:rPr>
+                <m:t>,1</m:t>
+              </m:r>
+            </m:sub>
+          </m:sSub>
+          <m:r>
+            <w:rPr>
+              <w:rFonts w:ascii="Cambria Math" w:hAnsi="Cambria Math"/>
+              <w:sz w:val="20"/>
+              <w:szCs w:val="20"/>
+            </w:rPr>
+            <m:t>,</m:t>
+          </m:r>
+          <m:sSub>
+            <m:sSubPr>
+              <m:ctrlPr>
+                <w:rPr>
+                  <w:rFonts w:ascii="Cambria Math" w:hAnsi="Cambria Math"/>
+                  <w:i/>
+                  <w:sz w:val="20"/>
+                  <w:szCs w:val="20"/>
+                </w:rPr>
+              </m:ctrlPr>
+            </m:sSubPr>
+            <m:e>
+              <m:r>
+                <w:rPr>
+                  <w:rFonts w:ascii="Cambria Math" w:hAnsi="Cambria Math"/>
+                  <w:sz w:val="20"/>
+                  <w:szCs w:val="20"/>
+                </w:rPr>
+                <m:t>v</m:t>
+              </m:r>
+            </m:e>
+            <m:sub>
+              <m:r>
+                <w:rPr>
+                  <w:rFonts w:ascii="Cambria Math" w:hAnsi="Cambria Math"/>
+                  <w:sz w:val="20"/>
+                  <w:szCs w:val="20"/>
+                </w:rPr>
+                <m:t>1</m:t>
+              </m:r>
+              <m:r>
+                <w:rPr>
+                  <w:rFonts w:ascii="Cambria Math" w:hAnsi="Cambria Math"/>
+                  <w:sz w:val="20"/>
+                  <w:szCs w:val="20"/>
+                </w:rPr>
+                <m:t>,</m:t>
+              </m:r>
+              <m:r>
+                <w:rPr>
+                  <w:rFonts w:ascii="Cambria Math" w:hAnsi="Cambria Math"/>
+                  <w:sz w:val="20"/>
+                  <w:szCs w:val="20"/>
+                </w:rPr>
+                <m:t>2</m:t>
+              </m:r>
+            </m:sub>
+          </m:sSub>
+          <m:r>
+            <w:rPr>
+              <w:rFonts w:ascii="Cambria Math" w:hAnsi="Cambria Math"/>
+              <w:sz w:val="20"/>
+              <w:szCs w:val="20"/>
+            </w:rPr>
+            <m:t xml:space="preserve">,…, </m:t>
+          </m:r>
+          <m:sSub>
+            <m:sSubPr>
+              <m:ctrlPr>
+                <w:rPr>
+                  <w:rFonts w:ascii="Cambria Math" w:hAnsi="Cambria Math"/>
+                  <w:i/>
+                  <w:sz w:val="20"/>
+                  <w:szCs w:val="20"/>
+                </w:rPr>
+              </m:ctrlPr>
+            </m:sSubPr>
+            <m:e>
+              <m:r>
+                <w:rPr>
+                  <w:rFonts w:ascii="Cambria Math" w:hAnsi="Cambria Math"/>
+                  <w:sz w:val="20"/>
+                  <w:szCs w:val="20"/>
+                </w:rPr>
+                <m:t>u</m:t>
+              </m:r>
+            </m:e>
+            <m:sub>
+              <m:r>
+                <w:rPr>
+                  <w:rFonts w:ascii="Cambria Math" w:hAnsi="Cambria Math"/>
+                  <w:sz w:val="20"/>
+                  <w:szCs w:val="20"/>
+                </w:rPr>
+                <m:t>1</m:t>
+              </m:r>
+              <m:r>
+                <w:rPr>
+                  <w:rFonts w:ascii="Cambria Math" w:hAnsi="Cambria Math"/>
+                  <w:sz w:val="20"/>
+                  <w:szCs w:val="20"/>
+                </w:rPr>
+                <m:t>,</m:t>
+              </m:r>
+              <m:sSub>
+                <m:sSubPr>
+                  <m:ctrlPr>
+                    <w:rPr>
+                      <w:rFonts w:ascii="Cambria Math" w:hAnsi="Cambria Math"/>
+                      <w:i/>
+                      <w:sz w:val="20"/>
+                      <w:szCs w:val="20"/>
+                    </w:rPr>
+                  </m:ctrlPr>
+                </m:sSubPr>
+                <m:e>
+                  <m:r>
+                    <w:rPr>
+                      <w:rFonts w:ascii="Cambria Math" w:hAnsi="Cambria Math"/>
+                      <w:sz w:val="20"/>
+                      <w:szCs w:val="20"/>
+                    </w:rPr>
+                    <m:t>n</m:t>
+                  </m:r>
+                </m:e>
+                <m:sub>
+                  <m:r>
+                    <w:rPr>
+                      <w:rFonts w:ascii="Cambria Math" w:hAnsi="Cambria Math"/>
+                      <w:sz w:val="20"/>
+                      <w:szCs w:val="20"/>
+                    </w:rPr>
+                    <m:t>t</m:t>
+                  </m:r>
+                </m:sub>
+              </m:sSub>
+            </m:sub>
+          </m:sSub>
+          <m:r>
+            <w:rPr>
+              <w:rFonts w:ascii="Cambria Math" w:hAnsi="Cambria Math"/>
+              <w:sz w:val="20"/>
+              <w:szCs w:val="20"/>
+            </w:rPr>
+            <m:t>​​)</m:t>
+          </m:r>
+          <m:r>
+            <w:rPr>
+              <w:rFonts w:ascii="Cambria Math" w:hAnsi="Cambria Math"/>
+              <w:sz w:val="20"/>
+              <w:szCs w:val="20"/>
+            </w:rPr>
+            <m:t>∈</m:t>
+          </m:r>
+          <m:sSup>
+            <m:sSupPr>
+              <m:ctrlPr>
+                <w:rPr>
+                  <w:rFonts w:ascii="Cambria Math" w:hAnsi="Cambria Math"/>
+                  <w:i/>
+                  <w:sz w:val="20"/>
+                  <w:szCs w:val="20"/>
+                </w:rPr>
+              </m:ctrlPr>
+            </m:sSupPr>
+            <m:e>
+              <m:r>
+                <w:rPr>
+                  <w:rFonts w:ascii="Cambria Math" w:hAnsi="Cambria Math"/>
+                  <w:sz w:val="20"/>
+                  <w:szCs w:val="20"/>
+                </w:rPr>
+                <m:t>R</m:t>
+              </m:r>
+            </m:e>
+            <m:sup>
+              <m:sSub>
+                <m:sSubPr>
+                  <m:ctrlPr>
+                    <w:rPr>
+                      <w:rFonts w:ascii="Cambria Math" w:hAnsi="Cambria Math"/>
+                      <w:i/>
+                      <w:sz w:val="20"/>
+                      <w:szCs w:val="20"/>
+                    </w:rPr>
+                  </m:ctrlPr>
+                </m:sSubPr>
+                <m:e>
+                  <m:r>
+                    <w:rPr>
+                      <w:rFonts w:ascii="Cambria Math" w:hAnsi="Cambria Math"/>
+                      <w:sz w:val="20"/>
+                      <w:szCs w:val="20"/>
+                    </w:rPr>
+                    <m:t>n</m:t>
+                  </m:r>
+                </m:e>
+                <m:sub>
+                  <m:r>
+                    <w:rPr>
+                      <w:rFonts w:ascii="Cambria Math" w:hAnsi="Cambria Math"/>
+                      <w:sz w:val="20"/>
+                      <w:szCs w:val="20"/>
+                    </w:rPr>
+                    <m:t>t</m:t>
+                  </m:r>
+                </m:sub>
+              </m:sSub>
+              <m:r>
+                <w:rPr>
+                  <w:rFonts w:ascii="Cambria Math" w:hAnsi="Cambria Math"/>
+                  <w:sz w:val="20"/>
+                  <w:szCs w:val="20"/>
+                </w:rPr>
+                <m:t>×</m:t>
+              </m:r>
+              <m:r>
+                <w:rPr>
+                  <w:rFonts w:ascii="Cambria Math" w:hAnsi="Cambria Math"/>
+                  <w:sz w:val="20"/>
+                  <w:szCs w:val="20"/>
+                </w:rPr>
+                <m:t>1</m:t>
+              </m:r>
+            </m:sup>
+          </m:sSup>
         </m:oMath>
       </m:oMathPara>
     </w:p>
@@ -11913,6 +12535,28 @@
         <w:t xml:space="preserve"> para obtener una solución única de los parámetros. </w:t>
       </w:r>
     </w:p>
+    <w:p>
+      <w:commentRangeStart w:id="16"/>
+      <w:r>
+        <w:t xml:space="preserve">Existen otras metodologías para la estimación de parámetros como la estimación por máxima similitud y la minimización de cuadrados ponderados. Sin embargo, estás metodologías alternativas no resultan </w:t>
+      </w:r>
+      <w:r>
+        <w:t xml:space="preserve">materialmente </w:t>
+      </w:r>
+      <w:r>
+        <w:t>diferente</w:t>
+      </w:r>
+      <w:r>
+        <w:t xml:space="preserve">s. En base a lo observado en …. </w:t>
+      </w:r>
+      <w:commentRangeEnd w:id="16"/>
+      <w:r>
+        <w:rPr>
+          <w:rStyle w:val="CommentReference"/>
+        </w:rPr>
+        <w:commentReference w:id="16"/>
+      </w:r>
+    </w:p>
     <w:p/>
     <w:p>
       <w:pPr>
@@ -11922,15 +12566,42 @@
           <w:numId w:val="17"/>
         </w:numPr>
       </w:pPr>
-      <w:bookmarkStart w:id="16" w:name="_Toc211124588"/>
+      <w:bookmarkStart w:id="17" w:name="_Toc211124588"/>
       <w:r>
         <w:t>Proyección de Mortalidad</w:t>
       </w:r>
-      <w:bookmarkEnd w:id="16"/>
+      <w:bookmarkEnd w:id="17"/>
     </w:p>
     <w:p>
       <w:r>
-        <w:t xml:space="preserve">Finalmente, el índice </w:t>
+        <w:t xml:space="preserve">Para </w:t>
+      </w:r>
+      <w:r>
+        <w:t xml:space="preserve">la proyección de </w:t>
+      </w:r>
+      <w:r>
+        <w:t xml:space="preserve">mortalidad se </w:t>
+      </w:r>
+      <w:r>
+        <w:t xml:space="preserve">emplea </w:t>
+      </w:r>
+      <w:r>
+        <w:t xml:space="preserve">un modelo de series temporales </w:t>
+      </w:r>
+      <w:r>
+        <w:t xml:space="preserve">del tipo </w:t>
+      </w:r>
+      <w:r>
+        <w:t xml:space="preserve">ARIMA </w:t>
+      </w:r>
+      <w:r>
+        <w:t xml:space="preserve">en el cual </w:t>
+      </w:r>
+      <w:r>
+        <w:t>e</w:t>
+      </w:r>
+      <w:r>
+        <w:t xml:space="preserve">l índice </w:t>
       </w:r>
       <m:oMath>
         <m:sSub>
@@ -11966,16 +12637,163 @@
         </m:sSub>
       </m:oMath>
       <w:r>
-        <w:t xml:space="preserve">se proyecta a futuro empleando un modelo </w:t>
-      </w:r>
-      <w:r>
-        <w:t xml:space="preserve">estocástico </w:t>
-      </w:r>
-      <w:r>
-        <w:t>de series temporales</w:t>
-      </w:r>
-      <w:r>
-        <w:t>.</w:t>
+        <w:t xml:space="preserve"> </w:t>
+      </w:r>
+      <w:r>
+        <w:t xml:space="preserve">se </w:t>
+      </w:r>
+      <w:r>
+        <w:t xml:space="preserve">extrapola </w:t>
+      </w:r>
+      <w:r>
+        <w:t xml:space="preserve">de forma </w:t>
+      </w:r>
+      <w:r>
+        <w:t>estocástic</w:t>
+      </w:r>
+      <w:r>
+        <w:t>a</w:t>
+      </w:r>
+      <w:r>
+        <w:t xml:space="preserve"> hacía años futuros</w:t>
+      </w:r>
+      <w:r>
+        <w:t xml:space="preserve">. En general, </w:t>
+      </w:r>
+      <w:r>
+        <w:t>en la práctica este modelo se suele corresponder con un ARIMA</w:t>
+      </w:r>
+      <w:r>
+        <w:t>(</w:t>
+      </w:r>
+      <w:r>
+        <w:t>0</w:t>
+      </w:r>
+      <w:r>
+        <w:t xml:space="preserve">,1,0), </w:t>
+      </w:r>
+      <w:r>
+        <w:t xml:space="preserve">conocido como </w:t>
+      </w:r>
+      <w:r>
+        <w:t>un modelo de camino aleatorio con tendencia constante</w:t>
+      </w:r>
+      <w:r>
+        <w:t>. Este enfoque implica que el nivel de mortalidad (</w:t>
+      </w:r>
+      <m:oMath>
+        <m:sSub>
+          <m:sSubPr>
+            <m:ctrlPr>
+              <w:rPr>
+                <w:rFonts w:ascii="Cambria Math" w:hAnsi="Cambria Math"/>
+              </w:rPr>
+            </m:ctrlPr>
+          </m:sSubPr>
+          <m:e>
+            <m:r>
+              <w:rPr>
+                <w:rFonts w:ascii="Cambria Math" w:hAnsi="Cambria Math"/>
+              </w:rPr>
+              <m:t>k</m:t>
+            </m:r>
+            <m:ctrlPr>
+              <w:rPr>
+                <w:rFonts w:ascii="Cambria Math" w:hAnsi="Cambria Math"/>
+                <w:i/>
+              </w:rPr>
+            </m:ctrlPr>
+          </m:e>
+          <m:sub>
+            <m:r>
+              <w:rPr>
+                <w:rFonts w:ascii="Cambria Math" w:hAnsi="Cambria Math"/>
+              </w:rPr>
+              <m:t>t</m:t>
+            </m:r>
+          </m:sub>
+        </m:sSub>
+        <m:r>
+          <w:rPr>
+            <w:rFonts w:ascii="Cambria Math" w:hAnsi="Cambria Math"/>
+          </w:rPr>
+          <m:t>)</m:t>
+        </m:r>
+      </m:oMath>
+      <w:r>
+        <w:t xml:space="preserve"> sigue un proceso estocástico alrededor de una tendencia </w:t>
+      </w:r>
+      <w:commentRangeStart w:id="18"/>
+      <w:r>
+        <w:lastRenderedPageBreak/>
+        <w:t xml:space="preserve">promedio. Este modelo surge como resultado del proceso de análisis y selección del modelo que mejor se ajuste al vector estimado </w:t>
+      </w:r>
+      <m:oMath>
+        <m:acc>
+          <m:accPr>
+            <m:ctrlPr>
+              <w:rPr>
+                <w:rFonts w:ascii="Cambria Math" w:hAnsi="Cambria Math"/>
+                <w:sz w:val="20"/>
+                <w:szCs w:val="20"/>
+                <w:lang w:val="en-US"/>
+              </w:rPr>
+            </m:ctrlPr>
+          </m:accPr>
+          <m:e>
+            <m:sSub>
+              <m:sSubPr>
+                <m:ctrlPr>
+                  <w:rPr>
+                    <w:rFonts w:ascii="Cambria Math" w:hAnsi="Cambria Math"/>
+                    <w:sz w:val="20"/>
+                    <w:szCs w:val="20"/>
+                    <w:lang w:val="en-US"/>
+                  </w:rPr>
+                </m:ctrlPr>
+              </m:sSubPr>
+              <m:e>
+                <m:r>
+                  <w:rPr>
+                    <w:rFonts w:ascii="Cambria Math" w:hAnsi="Cambria Math"/>
+                    <w:sz w:val="20"/>
+                    <w:szCs w:val="20"/>
+                    <w:lang w:val="en-US"/>
+                  </w:rPr>
+                  <m:t>k</m:t>
+                </m:r>
+              </m:e>
+              <m:sub>
+                <m:r>
+                  <w:rPr>
+                    <w:rFonts w:ascii="Cambria Math" w:hAnsi="Cambria Math"/>
+                    <w:sz w:val="20"/>
+                    <w:szCs w:val="20"/>
+                    <w:lang w:val="en-US"/>
+                  </w:rPr>
+                  <m:t>t</m:t>
+                </m:r>
+              </m:sub>
+            </m:sSub>
+          </m:e>
+        </m:acc>
+      </m:oMath>
+      <w:r>
+        <w:rPr>
+          <w:sz w:val="20"/>
+          <w:szCs w:val="20"/>
+        </w:rPr>
+        <w:t xml:space="preserve"> </w:t>
+      </w:r>
+      <w:r>
+        <w:t>bajo criterios estadísticos.</w:t>
+      </w:r>
+      <w:commentRangeEnd w:id="18"/>
+      <w:r>
+        <w:rPr>
+          <w:rStyle w:val="CommentReference"/>
+        </w:rPr>
+        <w:commentReference w:id="18"/>
       </w:r>
     </w:p>
     <w:p/>
@@ -11987,12 +12805,26 @@
           <w:numId w:val="24"/>
         </w:numPr>
       </w:pPr>
-      <w:bookmarkStart w:id="17" w:name="_Toc211124589"/>
+      <w:bookmarkStart w:id="19" w:name="_Toc211124589"/>
       <w:r>
         <w:t>Aprendizaje Automático</w:t>
       </w:r>
-      <w:bookmarkEnd w:id="17"/>
+      <w:bookmarkEnd w:id="19"/>
     </w:p>
+    <w:p>
+      <w:commentRangeStart w:id="20"/>
+      <w:r>
+        <w:t>El aprendizaje automático (o “machine learning”) es una rama de la inteligencia artificial que desarrolla algoritmos con la capacidad de distinguir patrones a partir de datos sin ser programados explícitamente para cada tarea. Estos modelos se utilizan para predecir, clasificar o tomar decisiones en función de observaciones pasadas. En particular, en esta tesina se tratarán modelos supervisados, donde los modelos “aprenden” a partir de información conocida para predecir una variable continua. Las siguientes secciones describen los algoritmos bajo alcance.</w:t>
+      </w:r>
+      <w:commentRangeEnd w:id="20"/>
+      <w:r>
+        <w:rPr>
+          <w:rStyle w:val="CommentReference"/>
+        </w:rPr>
+        <w:commentReference w:id="20"/>
+      </w:r>
+    </w:p>
+    <w:p/>
     <w:p>
       <w:pPr>
         <w:pStyle w:val="Heading3"/>
@@ -12001,26 +12833,21 @@
           <w:numId w:val="17"/>
         </w:numPr>
       </w:pPr>
-      <w:bookmarkStart w:id="18" w:name="_Toc211124595"/>
-      <w:bookmarkStart w:id="19" w:name="_Toc211124590"/>
-      <w:r>
-        <w:rPr>
-          <w:lang w:val="es-AR"/>
-        </w:rPr>
-        <w:t>4.</w:t>
-      </w:r>
-      <w:r>
-        <w:t xml:space="preserve">8. </w:t>
-      </w:r>
+      <w:bookmarkStart w:id="21" w:name="_Toc211124590"/>
+      <w:bookmarkStart w:id="22" w:name="_Toc211124595"/>
       <w:proofErr w:type="spellStart"/>
       <w:r>
-        <w:t>Random</w:t>
+        <w:t>Decision</w:t>
       </w:r>
       <w:proofErr w:type="spellEnd"/>
       <w:r>
-        <w:t xml:space="preserve"> Forest</w:t>
-      </w:r>
-      <w:bookmarkEnd w:id="18"/>
+        <w:t xml:space="preserve"> </w:t>
+      </w:r>
+      <w:proofErr w:type="spellStart"/>
+      <w:r>
+        <w:t>Trees</w:t>
+      </w:r>
+      <w:proofErr w:type="spellEnd"/>
     </w:p>
     <w:p>
       <w:r>
@@ -12035,11 +12862,16 @@
           <w:i/>
           <w:iCs/>
         </w:rPr>
-        <w:t>ranger</w:t>
+        <w:t>rpart</w:t>
       </w:r>
       <w:proofErr w:type="spellEnd"/>
       <w:r>
-        <w:t xml:space="preserve">”. El proceso de generación de este modelo es operacionalmente análogo al de los árboles de decisión del segmento anterior. Se genera un modelo de </w:t>
+        <w:t xml:space="preserve">”. </w:t>
+      </w:r>
+    </w:p>
+    <w:p>
+      <w:r>
+        <w:t xml:space="preserve">El proceso por el que se arma el modelo predictivo consiste en particionar la data del mes de prueba en 5 </w:t>
       </w:r>
       <w:proofErr w:type="spellStart"/>
       <w:r>
@@ -12047,11 +12879,11 @@
           <w:i/>
           <w:iCs/>
         </w:rPr>
-        <w:t>random</w:t>
+        <w:t>folds</w:t>
       </w:r>
       <w:proofErr w:type="spellEnd"/>
       <w:r>
-        <w:t xml:space="preserve"> </w:t>
+        <w:t xml:space="preserve"> y generar un árbol de decisión simple con la información contenida en 4 de ellos para luego probarlo en el </w:t>
       </w:r>
       <w:proofErr w:type="spellStart"/>
       <w:r>
@@ -12059,24 +12891,23 @@
           <w:i/>
           <w:iCs/>
         </w:rPr>
-        <w:t>forest</w:t>
+        <w:t>fold</w:t>
       </w:r>
       <w:proofErr w:type="spellEnd"/>
       <w:r>
-        <w:t xml:space="preserve">, se lo entrena con validación cruzada y luego se maximizan las ganancias mediante la optimización de los </w:t>
+        <w:t xml:space="preserve"> restante. Se realiza un cálculo de la ganancia de aplicar el programa de incentivos a ese conjunto de data de prueba y se multiplica por 5 para que sea representativo de el set de datos sin particionar. Luego se repite este proceso análogamente 4 veces más para tener una ganancia estimada para cada conjunto de </w:t>
       </w:r>
       <w:proofErr w:type="spellStart"/>
       <w:r>
-        <w:t>hiperparámetros</w:t>
+        <w:t>folds</w:t>
       </w:r>
       <w:proofErr w:type="spellEnd"/>
       <w:r>
-        <w:t xml:space="preserve"> relacionados a este método utilizando los mismos métodos de optimización bayesiana ya descriptos.  </w:t>
+        <w:t xml:space="preserve"> y se promedia. </w:t>
       </w:r>
     </w:p>
     <w:p>
       <w:r>
-        <w:lastRenderedPageBreak/>
         <w:t xml:space="preserve">Los </w:t>
       </w:r>
       <w:proofErr w:type="spellStart"/>
@@ -12085,333 +12916,60 @@
       </w:r>
       <w:proofErr w:type="spellEnd"/>
       <w:r>
-        <w:t xml:space="preserve"> que se maximizan son:</w:t>
+        <w:t xml:space="preserve"> de estos árboles son determinados mediante la maximización de la función de ganancia por un proceso de iteración. Para ello se toma todo el conjunto de operaciones antes descripto (un árbol entrenado con validación cruzada) y se itera 150 veces a través de las funciones de la librería de R </w:t>
+      </w:r>
+      <w:r>
+        <w:t>"</w:t>
+      </w:r>
+      <w:proofErr w:type="spellStart"/>
+      <w:r>
+        <w:rPr>
+          <w:i/>
+          <w:iCs/>
+        </w:rPr>
+        <w:t>mlrMBO</w:t>
+      </w:r>
+      <w:proofErr w:type="spellEnd"/>
+      <w:r>
+        <w:t>"</w:t>
+      </w:r>
+      <w:r>
+        <w:t xml:space="preserve"> que es una opción práctica operacionalmente para realizar el proceso de optimización bayesiana de </w:t>
+      </w:r>
+      <w:proofErr w:type="spellStart"/>
+      <w:r>
+        <w:t>hiperparámetros</w:t>
+      </w:r>
+      <w:proofErr w:type="spellEnd"/>
+      <w:r>
+        <w:t xml:space="preserve">. La búsqueda que realiza el programa sigue la lógica de generar una pequeña base de datos con </w:t>
+      </w:r>
+      <w:proofErr w:type="spellStart"/>
+      <w:r>
+        <w:t>hiperparámetros</w:t>
+      </w:r>
+      <w:proofErr w:type="spellEnd"/>
+      <w:r>
+        <w:t xml:space="preserve"> y ganancias y luego generar modelos predictivos que permita optimizar dónde buscar los </w:t>
+      </w:r>
+      <w:proofErr w:type="spellStart"/>
+      <w:r>
+        <w:t>hiperparámetros</w:t>
+      </w:r>
+      <w:proofErr w:type="spellEnd"/>
+      <w:r>
+        <w:t xml:space="preserve"> del siguiente árbol en función de incrementar las ganancias obtenidas.</w:t>
       </w:r>
     </w:p>
     <w:p>
-      <w:pPr>
-        <w:rPr>
-          <w:lang w:val="es-AR"/>
-        </w:rPr>
-      </w:pPr>
-      <w:r>
-        <w:rPr>
-          <w:lang w:val="es-AR"/>
-        </w:rPr>
-        <w:t>-</w:t>
-      </w:r>
-      <w:proofErr w:type="spellStart"/>
-      <w:r>
-        <w:rPr>
-          <w:i/>
-          <w:iCs/>
-          <w:lang w:val="es-AR"/>
-        </w:rPr>
-        <w:t>num.trees</w:t>
-      </w:r>
-      <w:proofErr w:type="spellEnd"/>
-      <w:r>
-        <w:t xml:space="preserve">: número de árboles a incluir en el modelo de </w:t>
-      </w:r>
-      <w:proofErr w:type="spellStart"/>
-      <w:r>
-        <w:rPr>
-          <w:i/>
-          <w:iCs/>
-        </w:rPr>
-        <w:t>Random</w:t>
-      </w:r>
-      <w:proofErr w:type="spellEnd"/>
-      <w:r>
-        <w:rPr>
-          <w:i/>
-          <w:iCs/>
-        </w:rPr>
-        <w:t xml:space="preserve"> Forest</w:t>
-      </w:r>
-      <w:r>
-        <w:rPr>
-          <w:i/>
-          <w:iCs/>
-        </w:rPr>
-        <w:t>.</w:t>
-      </w:r>
-    </w:p>
-    <w:p>
-      <w:pPr>
-        <w:rPr>
-          <w:lang w:val="es-AR"/>
-        </w:rPr>
-      </w:pPr>
-      <w:r>
-        <w:rPr>
-          <w:lang w:val="es-AR"/>
-        </w:rPr>
-        <w:t xml:space="preserve"> -</w:t>
-      </w:r>
-      <w:proofErr w:type="spellStart"/>
-      <w:r>
-        <w:rPr>
-          <w:i/>
-          <w:iCs/>
-          <w:lang w:val="es-AR"/>
-        </w:rPr>
-        <w:t>mtry</w:t>
-      </w:r>
-      <w:proofErr w:type="spellEnd"/>
-      <w:r>
-        <w:rPr>
-          <w:lang w:val="es-AR"/>
-        </w:rPr>
-        <w:t xml:space="preserve">: </w:t>
-      </w:r>
-      <w:r>
-        <w:t xml:space="preserve">número de variables predictoras como candidatas en cada ramificación. Por defecto, </w:t>
-      </w:r>
-      <w:r>
-        <w:t>para</w:t>
-      </w:r>
-      <w:r>
-        <w:t xml:space="preserve"> problemas de clasificación </w:t>
-      </w:r>
-      <w:r>
-        <w:t>viene dado por</w:t>
-      </w:r>
-      <w:r>
-        <w:t xml:space="preserve"> la raíz cuadrada del número de variables, y para</w:t>
-      </w:r>
-      <w:r>
-        <w:t xml:space="preserve"> la</w:t>
-      </w:r>
-      <w:r>
-        <w:t xml:space="preserve"> regresión</w:t>
-      </w:r>
-      <w:r>
-        <w:t>, el</w:t>
-      </w:r>
-      <w:r>
-        <w:t xml:space="preserve"> número de variables dividido entre 3.</w:t>
-      </w:r>
-    </w:p>
-    <w:p>
-      <w:r>
-        <w:rPr>
-          <w:lang w:val="es-AR"/>
-        </w:rPr>
-        <w:t xml:space="preserve">- </w:t>
-      </w:r>
-      <w:proofErr w:type="spellStart"/>
-      <w:r>
-        <w:rPr>
-          <w:i/>
-          <w:iCs/>
-          <w:lang w:val="es-AR"/>
-        </w:rPr>
-        <w:t>min.node</w:t>
-      </w:r>
-      <w:proofErr w:type="spellEnd"/>
-      <w:r>
-        <w:rPr>
-          <w:i/>
-          <w:iCs/>
-          <w:lang w:val="es-AR"/>
-        </w:rPr>
-        <w:t>.</w:t>
-      </w:r>
-      <w:proofErr w:type="spellStart"/>
-      <w:r>
-        <w:rPr>
-          <w:i/>
-          <w:iCs/>
-        </w:rPr>
-        <w:t>size</w:t>
-      </w:r>
-      <w:proofErr w:type="spellEnd"/>
-      <w:r>
-        <w:rPr>
-          <w:i/>
-          <w:iCs/>
-        </w:rPr>
-        <w:t>:</w:t>
-      </w:r>
-      <w:r>
-        <w:t xml:space="preserve"> mínimo número de muestras dentro de los nodos terminales. Para casos de clasificación, por defecto será 2, y para regresión será 5.</w:t>
-      </w:r>
-    </w:p>
-    <w:p>
-      <w:r>
-        <w:rPr>
-          <w:lang w:val="es-AR"/>
-        </w:rPr>
-        <w:t>-</w:t>
-      </w:r>
-      <w:proofErr w:type="spellStart"/>
-      <w:r>
-        <w:rPr>
-          <w:i/>
-          <w:iCs/>
-          <w:lang w:val="es-AR"/>
-        </w:rPr>
-        <w:t>max.depth</w:t>
-      </w:r>
-      <w:proofErr w:type="spellEnd"/>
-      <w:r>
-        <w:t>: máximo número de nodos terminales. Por defecto, no se planifica un proceso de poda, dejando crecer los árboles hasta su límite máximo.</w:t>
-      </w:r>
-    </w:p>
-    <w:p>
-      <w:r>
-        <w:rPr>
-          <w:lang w:val="es-AR"/>
-        </w:rPr>
-        <w:t xml:space="preserve"> </w:t>
-      </w:r>
-      <w:r>
-        <w:t xml:space="preserve">El modelo generado no puede ser visualizado gráficamente con un árbol como en el modelo anterior ni a través de la formación de una ecuación con coeficientes por cada variable predictora como es el caso de la regresión logística debido a su gran complejidad. Es por ello se adjuntan directamente los resultados obtenidos en la sección de resultados. </w:t>
-      </w:r>
-    </w:p>
-    <w:p/>
-    <w:p>
-      <w:pPr>
-        <w:pStyle w:val="Heading3"/>
-        <w:numPr>
-          <w:ilvl w:val="2"/>
-          <w:numId w:val="17"/>
-        </w:numPr>
-      </w:pPr>
-      <w:bookmarkStart w:id="20" w:name="_Toc211124594"/>
-      <w:r>
-        <w:t>4.</w:t>
-      </w:r>
-      <w:r>
-        <w:t>7</w:t>
-      </w:r>
-      <w:r>
-        <w:t>. Árboles de decisión</w:t>
-      </w:r>
-      <w:bookmarkEnd w:id="20"/>
-    </w:p>
-    <w:p>
-      <w:r>
-        <w:t>Se comienza</w:t>
-      </w:r>
-      <w:r>
-        <w:t xml:space="preserve"> a generar árboles de decisión en R Studio utilizando la librería “</w:t>
-      </w:r>
-      <w:proofErr w:type="spellStart"/>
-      <w:r>
-        <w:rPr>
-          <w:i/>
-          <w:iCs/>
-        </w:rPr>
-        <w:t>rpart</w:t>
-      </w:r>
-      <w:proofErr w:type="spellEnd"/>
-      <w:r>
-        <w:t xml:space="preserve">”. </w:t>
-      </w:r>
-    </w:p>
-    <w:p>
-      <w:r>
-        <w:t xml:space="preserve">El proceso por el que se arma el modelo predictivo consiste en particionar la data del mes de prueba en 5 </w:t>
-      </w:r>
-      <w:proofErr w:type="spellStart"/>
-      <w:r>
-        <w:rPr>
-          <w:i/>
-          <w:iCs/>
-        </w:rPr>
-        <w:t>folds</w:t>
-      </w:r>
-      <w:proofErr w:type="spellEnd"/>
-      <w:r>
-        <w:t xml:space="preserve"> y generar un árbol de decisión simple con la información contenida en 4 de ellos para luego probarlo en el </w:t>
-      </w:r>
-      <w:proofErr w:type="spellStart"/>
-      <w:r>
-        <w:rPr>
-          <w:i/>
-          <w:iCs/>
-        </w:rPr>
-        <w:t>fold</w:t>
-      </w:r>
-      <w:proofErr w:type="spellEnd"/>
-      <w:r>
-        <w:t xml:space="preserve"> restante. Se realiza un cálculo de la ganancia de aplicar el programa de incentivos a ese conjunto de data de prueba y se multiplica por 5 para que sea representativo de el set de datos sin particionar. Luego se repite este proceso análogamente 4 veces más para tener una ganancia estimada para cada conjunto de </w:t>
-      </w:r>
-      <w:proofErr w:type="spellStart"/>
-      <w:r>
-        <w:t>folds</w:t>
-      </w:r>
-      <w:proofErr w:type="spellEnd"/>
-      <w:r>
-        <w:t xml:space="preserve"> y se promedia. </w:t>
-      </w:r>
-    </w:p>
-    <w:p>
-      <w:r>
-        <w:t xml:space="preserve">Los </w:t>
-      </w:r>
-      <w:proofErr w:type="spellStart"/>
-      <w:r>
-        <w:t>hiperparámetros</w:t>
-      </w:r>
-      <w:proofErr w:type="spellEnd"/>
-      <w:r>
-        <w:t xml:space="preserve"> de estos árboles son determinados mediante la maximización de la función de ganancia por un proceso de iteración. Para ello se toma todo el conjunto de operaciones antes descripto (un árbol entrenado con validación cruzada) y se itera 150 veces a través de las funciones de la librería de R </w:t>
-      </w:r>
-      <w:r>
-        <w:t>"</w:t>
-      </w:r>
-      <w:proofErr w:type="spellStart"/>
-      <w:r>
-        <w:rPr>
-          <w:i/>
-          <w:iCs/>
-        </w:rPr>
-        <w:t>mlrMBO</w:t>
-      </w:r>
-      <w:proofErr w:type="spellEnd"/>
-      <w:r>
-        <w:t>"</w:t>
-      </w:r>
-      <w:r>
-        <w:t xml:space="preserve"> que es una opción práctica operacionalmente para realizar el proceso de optimización bayesiana de </w:t>
-      </w:r>
-      <w:proofErr w:type="spellStart"/>
-      <w:r>
-        <w:t>hiperparámetros</w:t>
-      </w:r>
-      <w:proofErr w:type="spellEnd"/>
-      <w:r>
-        <w:t xml:space="preserve">. La búsqueda que realiza el programa sigue la lógica de generar una pequeña base de datos con </w:t>
-      </w:r>
-      <w:proofErr w:type="spellStart"/>
-      <w:r>
-        <w:t>hiperparámetros</w:t>
-      </w:r>
-      <w:proofErr w:type="spellEnd"/>
-      <w:r>
-        <w:t xml:space="preserve"> y ganancias y luego generar modelos predictivos que permita optimizar dónde buscar los </w:t>
-      </w:r>
-      <w:proofErr w:type="spellStart"/>
-      <w:r>
-        <w:t>hiperparámetros</w:t>
-      </w:r>
-      <w:proofErr w:type="spellEnd"/>
-      <w:r>
-        <w:t xml:space="preserve"> del siguiente árbol en función de incrementar las ganancias obtenidas.</w:t>
-      </w:r>
-    </w:p>
-    <w:p>
-      <w:r>
-        <w:lastRenderedPageBreak/>
+      <w:r>
         <w:t>A continuación, se muestran los primeros dos niveles del árbol generado con las variables más importantes seleccionadas:</w:t>
       </w:r>
     </w:p>
     <w:p>
       <w:proofErr w:type="spellStart"/>
       <w:r>
+        <w:lastRenderedPageBreak/>
         <w:t>ctrx_quarter</w:t>
       </w:r>
       <w:proofErr w:type="spellEnd"/>
@@ -12441,7 +12999,7 @@
           <w:noProof/>
         </w:rPr>
         <w:drawing>
-          <wp:inline distT="0" distB="0" distL="0" distR="0" wp14:anchorId="1069D745" wp14:editId="47742DA2">
+          <wp:inline distT="0" distB="0" distL="0" distR="0" wp14:anchorId="28A9B65C" wp14:editId="11C5B846">
             <wp:extent cx="5731510" cy="2749550"/>
             <wp:effectExtent l="0" t="0" r="2540" b="0"/>
             <wp:docPr id="12" name="Imagen 12" descr="Diagrama&#10;&#10;Descripción generada automáticamente"/>
@@ -12514,23 +13072,22 @@
           <w:numId w:val="17"/>
         </w:numPr>
       </w:pPr>
-      <w:bookmarkStart w:id="21" w:name="_Toc211124596"/>
-      <w:r>
-        <w:t xml:space="preserve">4.9. </w:t>
-      </w:r>
       <w:proofErr w:type="spellStart"/>
       <w:r>
-        <w:t>LightGBM</w:t>
-      </w:r>
-      <w:bookmarkEnd w:id="21"/>
+        <w:t>Random</w:t>
+      </w:r>
       <w:proofErr w:type="spellEnd"/>
       <w:r>
-        <w:t xml:space="preserve"> </w:t>
-      </w:r>
+        <w:t xml:space="preserve"> Forest</w:t>
+      </w:r>
+      <w:bookmarkEnd w:id="22"/>
     </w:p>
     <w:p>
       <w:r>
-        <w:t>Como en los otros modelos utilizados en R Studio, se instalan las librerías necesarias, en particular se instala “</w:t>
+        <w:t>Se comienza</w:t>
+      </w:r>
+      <w:r>
+        <w:t xml:space="preserve"> a generar árboles de decisión en R Studio utilizando la librería “</w:t>
       </w:r>
       <w:proofErr w:type="spellStart"/>
       <w:r>
@@ -12538,33 +13095,11 @@
           <w:i/>
           <w:iCs/>
         </w:rPr>
-        <w:t>lightgbm</w:t>
+        <w:t>ranger</w:t>
       </w:r>
       <w:proofErr w:type="spellEnd"/>
       <w:r>
-        <w:t>” con la que se</w:t>
-      </w:r>
-      <w:r>
-        <w:t xml:space="preserve"> comienza</w:t>
-      </w:r>
-      <w:r>
-        <w:t xml:space="preserve"> a generar los modelos. Nuevamente se define la función ganancia a maximizar a través de la elección de </w:t>
-      </w:r>
-      <w:proofErr w:type="spellStart"/>
-      <w:r>
-        <w:t>hiperparámetros</w:t>
-      </w:r>
-      <w:proofErr w:type="spellEnd"/>
-      <w:r>
-        <w:t xml:space="preserve">. Estos están limitados entre ciertos rangos. Luego se diseña el proceso de tal forma que se alcance una ganancia máxima iterando en el conjunto del </w:t>
-      </w:r>
-      <w:proofErr w:type="spellStart"/>
-      <w:r>
-        <w:t>dataset</w:t>
-      </w:r>
-      <w:proofErr w:type="spellEnd"/>
-      <w:r>
-        <w:t xml:space="preserve"> de prueba, pero de forma fragmentada mediante el proceso de </w:t>
+        <w:t xml:space="preserve">”. El proceso de generación de este modelo es operacionalmente análogo al de los árboles de decisión del segmento anterior. Se genera un modelo de </w:t>
       </w:r>
       <w:proofErr w:type="spellStart"/>
       <w:r>
@@ -12572,167 +13107,227 @@
           <w:i/>
           <w:iCs/>
         </w:rPr>
-        <w:t>cross</w:t>
+        <w:t>random</w:t>
       </w:r>
       <w:proofErr w:type="spellEnd"/>
+      <w:r>
+        <w:t xml:space="preserve"> </w:t>
+      </w:r>
+      <w:proofErr w:type="spellStart"/>
       <w:r>
         <w:rPr>
           <w:i/>
           <w:iCs/>
         </w:rPr>
-        <w:t xml:space="preserve"> </w:t>
+        <w:t>forest</w:t>
+      </w:r>
+      <w:proofErr w:type="spellEnd"/>
+      <w:r>
+        <w:t xml:space="preserve">, se lo entrena con validación cruzada y luego se maximizan las ganancias mediante la optimización de los </w:t>
+      </w:r>
+      <w:proofErr w:type="spellStart"/>
+      <w:r>
+        <w:t>hiperparámetros</w:t>
+      </w:r>
+      <w:proofErr w:type="spellEnd"/>
+      <w:r>
+        <w:t xml:space="preserve"> relacionados a este método utilizando los mismos métodos de optimización bayesiana ya descriptos.  </w:t>
+      </w:r>
+    </w:p>
+    <w:p>
+      <w:r>
+        <w:t xml:space="preserve">Los </w:t>
+      </w:r>
+      <w:proofErr w:type="spellStart"/>
+      <w:r>
+        <w:t>hiperparámetros</w:t>
+      </w:r>
+      <w:proofErr w:type="spellEnd"/>
+      <w:r>
+        <w:t xml:space="preserve"> que se maximizan son:</w:t>
+      </w:r>
+    </w:p>
+    <w:p>
+      <w:pPr>
+        <w:rPr>
+          <w:lang w:val="es-AR"/>
+        </w:rPr>
+      </w:pPr>
+      <w:r>
+        <w:rPr>
+          <w:lang w:val="es-AR"/>
+        </w:rPr>
+        <w:t>-</w:t>
       </w:r>
       <w:proofErr w:type="spellStart"/>
       <w:r>
         <w:rPr>
           <w:i/>
           <w:iCs/>
-        </w:rPr>
-        <w:t>validation</w:t>
+          <w:lang w:val="es-AR"/>
+        </w:rPr>
+        <w:t>num.trees</w:t>
       </w:r>
       <w:proofErr w:type="spellEnd"/>
       <w:r>
-        <w:t xml:space="preserve">. </w:t>
+        <w:t xml:space="preserve">: número de árboles a incluir en el modelo de </w:t>
+      </w:r>
+      <w:proofErr w:type="spellStart"/>
+      <w:r>
+        <w:rPr>
+          <w:i/>
+          <w:iCs/>
+        </w:rPr>
+        <w:t>Random</w:t>
+      </w:r>
+      <w:proofErr w:type="spellEnd"/>
+      <w:r>
+        <w:rPr>
+          <w:i/>
+          <w:iCs/>
+        </w:rPr>
+        <w:t xml:space="preserve"> Forest</w:t>
+      </w:r>
+      <w:r>
+        <w:rPr>
+          <w:i/>
+          <w:iCs/>
+        </w:rPr>
+        <w:t>.</w:t>
       </w:r>
     </w:p>
     <w:p>
-      <w:r>
-        <w:t xml:space="preserve">Estos </w:t>
+      <w:pPr>
+        <w:rPr>
+          <w:lang w:val="es-AR"/>
+        </w:rPr>
+      </w:pPr>
+      <w:r>
+        <w:rPr>
+          <w:lang w:val="es-AR"/>
+        </w:rPr>
+        <w:lastRenderedPageBreak/>
+        <w:t xml:space="preserve"> -</w:t>
       </w:r>
       <w:proofErr w:type="spellStart"/>
       <w:r>
-        <w:t>hiperparámetros</w:t>
+        <w:rPr>
+          <w:i/>
+          <w:iCs/>
+          <w:lang w:val="es-AR"/>
+        </w:rPr>
+        <w:t>mtry</w:t>
       </w:r>
       <w:proofErr w:type="spellEnd"/>
       <w:r>
-        <w:t xml:space="preserve"> a optimizar son:</w:t>
+        <w:rPr>
+          <w:lang w:val="es-AR"/>
+        </w:rPr>
+        <w:t xml:space="preserve">: </w:t>
+      </w:r>
+      <w:r>
+        <w:t xml:space="preserve">número de variables predictoras como candidatas en cada ramificación. Por defecto, </w:t>
+      </w:r>
+      <w:r>
+        <w:t>para</w:t>
+      </w:r>
+      <w:r>
+        <w:t xml:space="preserve"> problemas de clasificación </w:t>
+      </w:r>
+      <w:r>
+        <w:t>viene dado por</w:t>
+      </w:r>
+      <w:r>
+        <w:t xml:space="preserve"> la raíz cuadrada del número de variables, y para</w:t>
+      </w:r>
+      <w:r>
+        <w:t xml:space="preserve"> la</w:t>
+      </w:r>
+      <w:r>
+        <w:t xml:space="preserve"> regresión</w:t>
+      </w:r>
+      <w:r>
+        <w:t>, el</w:t>
+      </w:r>
+      <w:r>
+        <w:t xml:space="preserve"> número de variables dividido entre 3.</w:t>
       </w:r>
     </w:p>
     <w:p>
-      <w:pPr>
-        <w:shd w:val="clear" w:color="auto" w:fill="FFFFFF"/>
-      </w:pPr>
-      <w:r>
-        <w:lastRenderedPageBreak/>
-        <w:t>-</w:t>
+      <w:r>
+        <w:rPr>
+          <w:lang w:val="es-AR"/>
+        </w:rPr>
+        <w:t xml:space="preserve">- </w:t>
       </w:r>
       <w:proofErr w:type="spellStart"/>
       <w:r>
-        <w:t>Num_leaves</w:t>
+        <w:rPr>
+          <w:i/>
+          <w:iCs/>
+          <w:lang w:val="es-AR"/>
+        </w:rPr>
+        <w:t>min.node</w:t>
       </w:r>
       <w:proofErr w:type="spellEnd"/>
       <w:r>
-        <w:t xml:space="preserve">: Controla el número de hojas de un árbol. </w:t>
+        <w:rPr>
+          <w:i/>
+          <w:iCs/>
+          <w:lang w:val="es-AR"/>
+        </w:rPr>
+        <w:t>.</w:t>
       </w:r>
       <w:proofErr w:type="spellStart"/>
       <w:r>
-        <w:t>LightGBM</w:t>
+        <w:rPr>
+          <w:i/>
+          <w:iCs/>
+        </w:rPr>
+        <w:t>size</w:t>
       </w:r>
       <w:proofErr w:type="spellEnd"/>
       <w:r>
-        <w:t xml:space="preserve"> utiliza un algoritmo de crecimiento de árboles por hojas, por lo que </w:t>
-      </w:r>
-      <w:proofErr w:type="spellStart"/>
-      <w:r>
-        <w:t>num_leaves</w:t>
-      </w:r>
-      <w:proofErr w:type="spellEnd"/>
-      <w:r>
-        <w:t xml:space="preserve"> es el parámetro principal para controlar la complejidad del árbol.</w:t>
+        <w:rPr>
+          <w:i/>
+          <w:iCs/>
+        </w:rPr>
+        <w:t>:</w:t>
+      </w:r>
+      <w:r>
+        <w:t xml:space="preserve"> mínimo número de muestras dentro de los nodos terminales. Para casos de clasificación, por defecto será 2, y para regresión será 5.</w:t>
       </w:r>
     </w:p>
     <w:p>
-      <w:pPr>
-        <w:shd w:val="clear" w:color="auto" w:fill="FFFFFF"/>
-      </w:pPr>
-      <w:r>
+      <w:r>
+        <w:rPr>
+          <w:lang w:val="es-AR"/>
+        </w:rPr>
         <w:t>-</w:t>
       </w:r>
       <w:proofErr w:type="spellStart"/>
       <w:r>
-        <w:t>Min_data_in_leaf</w:t>
+        <w:rPr>
+          <w:i/>
+          <w:iCs/>
+          <w:lang w:val="es-AR"/>
+        </w:rPr>
+        <w:t>max.depth</w:t>
       </w:r>
       <w:proofErr w:type="spellEnd"/>
       <w:r>
-        <w:t>: </w:t>
-      </w:r>
-      <w:r>
-        <w:t>Determina</w:t>
-      </w:r>
-      <w:r>
-        <w:t xml:space="preserve"> el número mínimo de muestras necesarias para estar en una hoja, lo cual es muy importante para </w:t>
-      </w:r>
-      <w:r>
-        <w:t xml:space="preserve">el </w:t>
-      </w:r>
-      <w:r>
-        <w:t xml:space="preserve">control </w:t>
-      </w:r>
-      <w:r>
-        <w:t>d</w:t>
-      </w:r>
-      <w:r>
-        <w:t>el sobreajuste.</w:t>
+        <w:t>: máximo número de nodos terminales. Por defecto, no se planifica un proceso de poda, dejando crecer los árboles hasta su límite máximo.</w:t>
       </w:r>
     </w:p>
     <w:p>
-      <w:pPr>
-        <w:shd w:val="clear" w:color="auto" w:fill="FFFFFF"/>
-        <w:jc w:val="left"/>
-      </w:pPr>
-      <w:r>
-        <w:t>-</w:t>
-      </w:r>
-      <w:proofErr w:type="spellStart"/>
-      <w:r>
-        <w:t>Feature_fraction</w:t>
-      </w:r>
-      <w:proofErr w:type="spellEnd"/>
-      <w:r>
-        <w:t>: </w:t>
-      </w:r>
-      <w:r>
-        <w:t>Es la</w:t>
-      </w:r>
-      <w:r>
-        <w:t xml:space="preserve"> proporción de características que se seleccionan al azar en cada nodo.</w:t>
-      </w:r>
-    </w:p>
-    <w:p>
-      <w:pPr>
-        <w:shd w:val="clear" w:color="auto" w:fill="FFFFFF"/>
-      </w:pPr>
-      <w:r>
-        <w:t xml:space="preserve">Finalmente, la salida del modelo para el conjunto de datos de prueba determina el conjunto de casos (clientes) con una alta probabilidad de fuga de la compañía,  y, por el contrario, al conjunto de casos con una baja probabilidad de fuga, es decir, de continuidad en la misma. A estos datos resultantes se le aplica la función ganancia, generando así un valor potencial de ingresos del programa de estímulos. </w:t>
-      </w:r>
-    </w:p>
-    <w:p>
-      <w:r>
-        <w:t xml:space="preserve">Al igual que en el caso de </w:t>
-      </w:r>
-      <w:proofErr w:type="spellStart"/>
-      <w:r>
-        <w:rPr>
-          <w:i/>
-          <w:iCs/>
-        </w:rPr>
-        <w:t>Random</w:t>
-      </w:r>
-      <w:proofErr w:type="spellEnd"/>
-      <w:r>
-        <w:rPr>
-          <w:i/>
-          <w:iCs/>
-        </w:rPr>
-        <w:t xml:space="preserve"> Forest,</w:t>
-      </w:r>
-      <w:r>
-        <w:t xml:space="preserve"> ver gráficamente o con estimadores o fórmulas este modelo predictivo no es posible, por ello directamente se muestran los resultados en la sección siguiente.</w:t>
-      </w:r>
-    </w:p>
-    <w:p>
-      <w:r>
-        <w:t xml:space="preserve">Con respecto a las características de la corrida de este modelo se destaca una mayor rapidez con respecto a los otros modelos predictivos, sin embargo, con estos volúmenes de datos no representa una mejora de tiempos significativa. </w:t>
+      <w:r>
+        <w:rPr>
+          <w:lang w:val="es-AR"/>
+        </w:rPr>
+        <w:t xml:space="preserve"> </w:t>
+      </w:r>
+      <w:r>
+        <w:t xml:space="preserve">El modelo generado no puede ser visualizado gráficamente con un árbol como en el modelo anterior ni a través de la formación de una ecuación con coeficientes por cada variable predictora como es el caso de la regresión logística debido a su gran complejidad. Es por ello se adjuntan directamente los resultados obtenidos en la sección de resultados. </w:t>
       </w:r>
     </w:p>
     <w:p/>
@@ -12746,9 +13341,242 @@
       </w:pPr>
       <w:proofErr w:type="spellStart"/>
       <w:r>
+        <w:t>Gradient</w:t>
+      </w:r>
+      <w:proofErr w:type="spellEnd"/>
+      <w:r>
+        <w:t xml:space="preserve"> </w:t>
+      </w:r>
+      <w:proofErr w:type="spellStart"/>
+      <w:r>
+        <w:t>Boosting</w:t>
+      </w:r>
+      <w:proofErr w:type="spellEnd"/>
+      <w:r>
+        <w:t xml:space="preserve"> </w:t>
+      </w:r>
+    </w:p>
+    <w:p>
+      <w:r>
+        <w:t>Como en los otros modelos utilizados en R Studio, se instalan las librerías necesarias, en particular se instala “</w:t>
+      </w:r>
+      <w:proofErr w:type="spellStart"/>
+      <w:r>
+        <w:rPr>
+          <w:i/>
+          <w:iCs/>
+        </w:rPr>
+        <w:t>lightgbm</w:t>
+      </w:r>
+      <w:proofErr w:type="spellEnd"/>
+      <w:r>
+        <w:t>” con la que se</w:t>
+      </w:r>
+      <w:r>
+        <w:t xml:space="preserve"> comienza</w:t>
+      </w:r>
+      <w:r>
+        <w:t xml:space="preserve"> a generar los modelos. Nuevamente se define la función ganancia a maximizar a través de la elección de </w:t>
+      </w:r>
+      <w:proofErr w:type="spellStart"/>
+      <w:r>
+        <w:t>hiperparámetros</w:t>
+      </w:r>
+      <w:proofErr w:type="spellEnd"/>
+      <w:r>
+        <w:t xml:space="preserve">. Estos están limitados entre ciertos rangos. Luego se diseña el proceso de tal forma que se alcance una ganancia máxima iterando en el conjunto del </w:t>
+      </w:r>
+      <w:proofErr w:type="spellStart"/>
+      <w:r>
+        <w:t>dataset</w:t>
+      </w:r>
+      <w:proofErr w:type="spellEnd"/>
+      <w:r>
+        <w:t xml:space="preserve"> de prueba, pero de forma fragmentada mediante el proceso de </w:t>
+      </w:r>
+      <w:proofErr w:type="spellStart"/>
+      <w:r>
+        <w:rPr>
+          <w:i/>
+          <w:iCs/>
+        </w:rPr>
+        <w:t>cross</w:t>
+      </w:r>
+      <w:proofErr w:type="spellEnd"/>
+      <w:r>
+        <w:rPr>
+          <w:i/>
+          <w:iCs/>
+        </w:rPr>
+        <w:t xml:space="preserve"> </w:t>
+      </w:r>
+      <w:proofErr w:type="spellStart"/>
+      <w:r>
+        <w:rPr>
+          <w:i/>
+          <w:iCs/>
+        </w:rPr>
+        <w:t>validation</w:t>
+      </w:r>
+      <w:proofErr w:type="spellEnd"/>
+      <w:r>
+        <w:t xml:space="preserve">. </w:t>
+      </w:r>
+    </w:p>
+    <w:p>
+      <w:r>
+        <w:t xml:space="preserve">Estos </w:t>
+      </w:r>
+      <w:proofErr w:type="spellStart"/>
+      <w:r>
+        <w:t>hiperparámetros</w:t>
+      </w:r>
+      <w:proofErr w:type="spellEnd"/>
+      <w:r>
+        <w:t xml:space="preserve"> a optimizar son:</w:t>
+      </w:r>
+    </w:p>
+    <w:p>
+      <w:pPr>
+        <w:shd w:val="clear" w:color="auto" w:fill="FFFFFF"/>
+      </w:pPr>
+      <w:r>
+        <w:t>-</w:t>
+      </w:r>
+      <w:proofErr w:type="spellStart"/>
+      <w:r>
+        <w:t>Num_leaves</w:t>
+      </w:r>
+      <w:proofErr w:type="spellEnd"/>
+      <w:r>
+        <w:t xml:space="preserve">: Controla el número de hojas de un árbol. </w:t>
+      </w:r>
+      <w:proofErr w:type="spellStart"/>
+      <w:r>
+        <w:t>LightGBM</w:t>
+      </w:r>
+      <w:proofErr w:type="spellEnd"/>
+      <w:r>
+        <w:t xml:space="preserve"> utiliza un algoritmo de crecimiento de árboles por hojas, por lo que </w:t>
+      </w:r>
+      <w:proofErr w:type="spellStart"/>
+      <w:r>
+        <w:t>num_leaves</w:t>
+      </w:r>
+      <w:proofErr w:type="spellEnd"/>
+      <w:r>
+        <w:t xml:space="preserve"> es el parámetro principal para controlar la complejidad del árbol.</w:t>
+      </w:r>
+    </w:p>
+    <w:p>
+      <w:pPr>
+        <w:shd w:val="clear" w:color="auto" w:fill="FFFFFF"/>
+      </w:pPr>
+      <w:r>
+        <w:t>-</w:t>
+      </w:r>
+      <w:proofErr w:type="spellStart"/>
+      <w:r>
+        <w:t>Min_data_in_leaf</w:t>
+      </w:r>
+      <w:proofErr w:type="spellEnd"/>
+      <w:r>
+        <w:t>: </w:t>
+      </w:r>
+      <w:r>
+        <w:t>Determina</w:t>
+      </w:r>
+      <w:r>
+        <w:t xml:space="preserve"> el número mínimo de muestras necesarias para estar en una hoja, lo cual es muy importante para </w:t>
+      </w:r>
+      <w:r>
+        <w:t xml:space="preserve">el </w:t>
+      </w:r>
+      <w:r>
+        <w:t xml:space="preserve">control </w:t>
+      </w:r>
+      <w:r>
+        <w:t>d</w:t>
+      </w:r>
+      <w:r>
+        <w:t>el sobreajuste.</w:t>
+      </w:r>
+    </w:p>
+    <w:p>
+      <w:pPr>
+        <w:shd w:val="clear" w:color="auto" w:fill="FFFFFF"/>
+        <w:jc w:val="left"/>
+      </w:pPr>
+      <w:r>
+        <w:t>-</w:t>
+      </w:r>
+      <w:proofErr w:type="spellStart"/>
+      <w:r>
+        <w:t>Feature_fraction</w:t>
+      </w:r>
+      <w:proofErr w:type="spellEnd"/>
+      <w:r>
+        <w:t>: </w:t>
+      </w:r>
+      <w:r>
+        <w:t>Es la</w:t>
+      </w:r>
+      <w:r>
+        <w:t xml:space="preserve"> proporción de características que se seleccionan al azar en cada nodo.</w:t>
+      </w:r>
+    </w:p>
+    <w:p>
+      <w:pPr>
+        <w:shd w:val="clear" w:color="auto" w:fill="FFFFFF"/>
+      </w:pPr>
+      <w:r>
+        <w:t xml:space="preserve">Finalmente, la salida del modelo para el conjunto de datos de prueba determina el conjunto de casos (clientes) con una alta probabilidad de fuga de la compañía,  y, por el contrario, al conjunto de casos con una baja probabilidad de fuga, es decir, de continuidad en la misma. A estos datos resultantes se le aplica la función ganancia, generando así un valor potencial de ingresos del programa de estímulos. </w:t>
+      </w:r>
+    </w:p>
+    <w:p>
+      <w:r>
+        <w:lastRenderedPageBreak/>
+        <w:t xml:space="preserve">Al igual que en el caso de </w:t>
+      </w:r>
+      <w:proofErr w:type="spellStart"/>
+      <w:r>
+        <w:rPr>
+          <w:i/>
+          <w:iCs/>
+        </w:rPr>
+        <w:t>Random</w:t>
+      </w:r>
+      <w:proofErr w:type="spellEnd"/>
+      <w:r>
+        <w:rPr>
+          <w:i/>
+          <w:iCs/>
+        </w:rPr>
+        <w:t xml:space="preserve"> Forest,</w:t>
+      </w:r>
+      <w:r>
+        <w:t xml:space="preserve"> ver gráficamente o con estimadores o fórmulas este modelo predictivo no es posible, por ello directamente se muestran los resultados en la sección siguiente.</w:t>
+      </w:r>
+    </w:p>
+    <w:p>
+      <w:r>
+        <w:t xml:space="preserve">Con respecto a las características de la corrida de este modelo se destaca una mayor rapidez con respecto a los otros modelos predictivos, sin embargo, con estos volúmenes de datos no representa una mejora de tiempos significativa. </w:t>
+      </w:r>
+    </w:p>
+    <w:p/>
+    <w:p>
+      <w:pPr>
+        <w:pStyle w:val="Heading3"/>
+        <w:numPr>
+          <w:ilvl w:val="2"/>
+          <w:numId w:val="17"/>
+        </w:numPr>
+      </w:pPr>
+      <w:proofErr w:type="spellStart"/>
+      <w:r>
         <w:t>Overfitting</w:t>
       </w:r>
-      <w:bookmarkEnd w:id="19"/>
+      <w:bookmarkEnd w:id="21"/>
       <w:proofErr w:type="spellEnd"/>
     </w:p>
     <w:p>
@@ -12915,14 +13743,7 @@
         <w:rPr>
           <w:lang w:val="es-AR"/>
         </w:rPr>
-        <w:t xml:space="preserve"> cuando el modelo es perfecto </w:t>
-      </w:r>
-      <w:r>
-        <w:rPr>
-          <w:lang w:val="es-AR"/>
-        </w:rPr>
-        <w:lastRenderedPageBreak/>
-        <w:t xml:space="preserve">prediciendo en los datos donde se </w:t>
+        <w:t xml:space="preserve"> cuando el modelo es perfecto prediciendo en los datos donde se </w:t>
       </w:r>
       <w:r>
         <w:rPr>
@@ -13090,6 +13911,7 @@
         <w:rPr>
           <w:lang w:val="es-AR"/>
         </w:rPr>
+        <w:lastRenderedPageBreak/>
         <w:t xml:space="preserve">Figura </w:t>
       </w:r>
       <w:r>
@@ -13262,7 +14084,7 @@
           <w:numId w:val="17"/>
         </w:numPr>
       </w:pPr>
-      <w:bookmarkStart w:id="22" w:name="_Toc211124591"/>
+      <w:bookmarkStart w:id="23" w:name="_Toc211124591"/>
       <w:r>
         <w:t>Cross-</w:t>
       </w:r>
@@ -13270,7 +14092,7 @@
       <w:r>
         <w:t>Validation</w:t>
       </w:r>
-      <w:bookmarkEnd w:id="22"/>
+      <w:bookmarkEnd w:id="23"/>
       <w:proofErr w:type="spellEnd"/>
       <w:r>
         <w:t xml:space="preserve"> </w:t>
@@ -13453,7 +14275,6 @@
         <w:rPr>
           <w:lang w:val="es-AR"/>
         </w:rPr>
-        <w:lastRenderedPageBreak/>
         <w:t>Se ejemplifica lo explicado con la siguiente figura:</w:t>
       </w:r>
     </w:p>
@@ -13562,7 +14383,7 @@
           <w:b/>
         </w:rPr>
       </w:pPr>
-      <w:bookmarkStart w:id="23" w:name="_Toc211124592"/>
+      <w:bookmarkStart w:id="24" w:name="_Toc211124592"/>
       <w:r>
         <w:rPr>
           <w:rStyle w:val="Heading1Char"/>
@@ -13577,7 +14398,7 @@
         </w:rPr>
         <w:t>Lee-Carter y Aprendizaje Automático</w:t>
       </w:r>
-      <w:bookmarkEnd w:id="23"/>
+      <w:bookmarkEnd w:id="24"/>
     </w:p>
     <w:p>
       <w:pPr>
@@ -13591,7 +14412,7 @@
           <w:b/>
         </w:rPr>
       </w:pPr>
-      <w:bookmarkStart w:id="24" w:name="_Toc211124597"/>
+      <w:bookmarkStart w:id="25" w:name="_Toc211124597"/>
       <w:r>
         <w:rPr>
           <w:rStyle w:val="Heading1Char"/>
@@ -13599,17 +14420,17 @@
         </w:rPr>
         <w:t>Aplicación del Modelo</w:t>
       </w:r>
-      <w:bookmarkEnd w:id="24"/>
+      <w:bookmarkEnd w:id="25"/>
     </w:p>
     <w:p>
       <w:pPr>
         <w:pStyle w:val="Heading2"/>
       </w:pPr>
-      <w:bookmarkStart w:id="25" w:name="_Toc211124598"/>
+      <w:bookmarkStart w:id="26" w:name="_Toc211124598"/>
       <w:r>
         <w:t>3.1. Planteo de la situación inicial</w:t>
       </w:r>
-      <w:bookmarkEnd w:id="25"/>
+      <w:bookmarkEnd w:id="26"/>
     </w:p>
     <w:p>
       <w:pPr>
@@ -13685,191 +14506,16 @@
         <w:t xml:space="preserve"> Hay que dedicar tiempo y esfuerzo a sustituirlos. Ser capaz de predecir cuándo es probable que un cliente se vaya, y ofrecerle incentivos para que se quede, puede suponer un gran ahorro para una empresa.</w:t>
       </w:r>
     </w:p>
-    <w:p>
-      <w:pPr>
-        <w:rPr>
-          <w:lang w:val="es-AR"/>
-        </w:rPr>
-      </w:pPr>
-    </w:p>
-    <w:p>
-      <w:pPr>
-        <w:rPr>
-          <w:lang w:val="es-AR"/>
-        </w:rPr>
-      </w:pPr>
-      <w:r>
-        <w:rPr>
-          <w:lang w:val="es-AR"/>
-        </w:rPr>
-        <w:t>Por tanto, entender qué es lo que mantiene a los clientes comprometidos es un conocimiento extremadamente valioso, ya que puede ayudarle a desarrollar sus estrategias de retención y a poner en marcha prácticas operativas destinadas a evitar que los clientes se marchen.</w:t>
-      </w:r>
-    </w:p>
-    <w:p>
-      <w:r>
-        <w:rPr>
-          <w:lang w:val="es-AR"/>
-        </w:rPr>
-        <w:t>En este caso,</w:t>
-      </w:r>
-      <w:r>
-        <w:rPr>
-          <w:b/>
-          <w:sz w:val="28"/>
-          <w:szCs w:val="28"/>
-        </w:rPr>
-        <w:t xml:space="preserve"> </w:t>
-      </w:r>
-      <w:r>
-        <w:t>e</w:t>
-      </w:r>
-      <w:r>
-        <w:t>l b</w:t>
-      </w:r>
-      <w:r>
-        <w:t xml:space="preserve">anco tiene una cartera de </w:t>
-      </w:r>
-      <w:r>
-        <w:rPr>
-          <w:lang w:val="es-AR"/>
-        </w:rPr>
-        <w:t>usuarios Premium que son los que más valor traen a la empresa</w:t>
-      </w:r>
-      <w:r>
-        <w:rPr>
-          <w:lang w:val="es-AR"/>
-        </w:rPr>
-        <w:t xml:space="preserve"> y es por ello </w:t>
-      </w:r>
-      <w:proofErr w:type="gramStart"/>
-      <w:r>
-        <w:rPr>
-          <w:lang w:val="es-AR"/>
-        </w:rPr>
-        <w:t>que</w:t>
-      </w:r>
-      <w:proofErr w:type="gramEnd"/>
-      <w:r>
-        <w:rPr>
-          <w:lang w:val="es-AR"/>
-        </w:rPr>
-        <w:t xml:space="preserve"> es de suma importancia que estos clientes no se fuguen</w:t>
-      </w:r>
-      <w:r>
-        <w:rPr>
-          <w:lang w:val="es-AR"/>
-        </w:rPr>
-        <w:t xml:space="preserve">. </w:t>
-      </w:r>
-      <w:r>
-        <w:t xml:space="preserve">Actualmente la empresa no hace campañas proactivas de retención de clientes, simplemente una vez que el cliente manifiesta que se quiere ir, tratan de persuadirlo. </w:t>
-      </w:r>
-      <w:r>
-        <w:t xml:space="preserve">Es </w:t>
-      </w:r>
-      <w:r>
-        <w:lastRenderedPageBreak/>
-        <w:t xml:space="preserve">por todo lo antes explicado que </w:t>
-      </w:r>
-      <w:r>
-        <w:rPr>
-          <w:lang w:val="es-AR"/>
-        </w:rPr>
-        <w:t>el equipo de marketing necesita</w:t>
-      </w:r>
-      <w:r>
-        <w:rPr>
-          <w:lang w:val="es-AR"/>
-        </w:rPr>
-        <w:t xml:space="preserve"> predecir con anticipación </w:t>
-      </w:r>
-      <w:r>
-        <w:rPr>
-          <w:lang w:val="es-AR"/>
-        </w:rPr>
-        <w:t xml:space="preserve">de dos meses qué usuarios se darán de baja para poder enviarles un estímulo para </w:t>
-      </w:r>
-      <w:r>
-        <w:rPr>
-          <w:lang w:val="es-AR"/>
-        </w:rPr>
-        <w:t>evitar que dejen la empresa.</w:t>
-      </w:r>
-    </w:p>
-    <w:p>
-      <w:r>
-        <w:t>Para ello</w:t>
-      </w:r>
-      <w:r>
-        <w:t xml:space="preserve"> </w:t>
-      </w:r>
-      <w:r>
-        <w:t xml:space="preserve">se realiza </w:t>
-      </w:r>
-      <w:r>
-        <w:t>un modelo predictivo para elegir a los clientes a los que se hará una campaña de marketing preventiva de retención, antes que manifiesten su voluntad de darse de baja.</w:t>
-      </w:r>
-    </w:p>
-    <w:p>
-      <w:r>
-        <w:t>La capacidad de predecir que un</w:t>
-      </w:r>
-      <w:r>
-        <w:t xml:space="preserve"> </w:t>
-      </w:r>
-      <w:r>
-        <w:t>client</w:t>
-      </w:r>
-      <w:r>
-        <w:t xml:space="preserve">e </w:t>
-      </w:r>
-      <w:r>
-        <w:t>abandonará la empresa con alta probabilidad</w:t>
-      </w:r>
-      <w:r>
-        <w:t xml:space="preserve"> cuando aún </w:t>
-      </w:r>
-      <w:r>
-        <w:t xml:space="preserve">se </w:t>
-      </w:r>
-      <w:r>
-        <w:t>está a tiempo de hacer algo al respecto</w:t>
-      </w:r>
-      <w:r>
-        <w:t>,</w:t>
-      </w:r>
-      <w:r>
-        <w:t xml:space="preserve"> representa una enorme fuente potencial de </w:t>
-      </w:r>
-      <w:r>
-        <w:t>ahorro</w:t>
-      </w:r>
-      <w:r>
-        <w:t xml:space="preserve"> </w:t>
-      </w:r>
-      <w:r>
-        <w:t xml:space="preserve">y una ventaja comparativa </w:t>
-      </w:r>
-      <w:r>
-        <w:t>en relación con el</w:t>
-      </w:r>
-      <w:r>
-        <w:t xml:space="preserve"> resto de la industria, en este caso, bancaria</w:t>
-      </w:r>
-      <w:r>
-        <w:t>.</w:t>
-      </w:r>
-    </w:p>
     <w:p/>
     <w:p>
       <w:pPr>
         <w:pStyle w:val="Heading2"/>
       </w:pPr>
-      <w:bookmarkStart w:id="26" w:name="_Toc211124599"/>
+      <w:bookmarkStart w:id="27" w:name="_Toc211124599"/>
       <w:r>
         <w:t>3.4. Datos disponibles</w:t>
       </w:r>
-      <w:bookmarkEnd w:id="26"/>
+      <w:bookmarkEnd w:id="27"/>
     </w:p>
     <w:p>
       <w:r>
@@ -14049,7 +14695,7 @@
       <w:pPr>
         <w:pStyle w:val="Heading2"/>
       </w:pPr>
-      <w:bookmarkStart w:id="27" w:name="_Toc211124600"/>
+      <w:bookmarkStart w:id="28" w:name="_Toc211124600"/>
       <w:r>
         <w:t>3.</w:t>
       </w:r>
@@ -14059,15 +14705,12 @@
       <w:r>
         <w:t>. Creación de indicadores para medir la efectividad del proyecto</w:t>
       </w:r>
-      <w:bookmarkEnd w:id="27"/>
+      <w:bookmarkEnd w:id="28"/>
     </w:p>
     <w:p>
       <w:r>
-        <w:t xml:space="preserve">Para poder comparar los modelos se crea un estimador que representa la ganancia del programa de retención para el banco. Para ello se utiliza el valor promedio futuro de </w:t>
-      </w:r>
-      <w:r>
         <w:lastRenderedPageBreak/>
-        <w:t>ingresos que representa un usuario al banco y un valor de estímulo monetario con el cual se espera retener al 50% de los usuarios a los que sea enviado.</w:t>
+        <w:t>Para poder comparar los modelos se crea un estimador que representa la ganancia del programa de retención para el banco. Para ello se utiliza el valor promedio futuro de ingresos que representa un usuario al banco y un valor de estímulo monetario con el cual se espera retener al 50% de los usuarios a los que sea enviado.</w:t>
       </w:r>
     </w:p>
     <w:p>
@@ -14213,7 +14856,7 @@
           <w:bCs/>
         </w:rPr>
       </w:pPr>
-      <w:bookmarkStart w:id="28" w:name="_Toc211124601"/>
+      <w:bookmarkStart w:id="29" w:name="_Toc211124601"/>
       <w:r>
         <w:rPr>
           <w:rStyle w:val="Heading1Char"/>
@@ -14222,7 +14865,7 @@
         </w:rPr>
         <w:t>Resultados</w:t>
       </w:r>
-      <w:bookmarkEnd w:id="28"/>
+      <w:bookmarkEnd w:id="29"/>
     </w:p>
     <w:p>
       <w:pPr>
@@ -14320,6 +14963,7 @@
         <w:rPr>
           <w:lang w:val="es-AR"/>
         </w:rPr>
+        <w:lastRenderedPageBreak/>
         <w:t xml:space="preserve">Se observa que </w:t>
       </w:r>
       <w:proofErr w:type="spellStart"/>
@@ -14345,249 +14989,9 @@
           <w:numId w:val="21"/>
         </w:numPr>
       </w:pPr>
-      <w:bookmarkStart w:id="29" w:name="_Toc211124602"/>
-      <w:r>
-        <w:lastRenderedPageBreak/>
+      <w:bookmarkStart w:id="30" w:name="_Toc211124602"/>
+      <w:r>
         <w:t>Conclusiones</w:t>
-      </w:r>
-      <w:bookmarkEnd w:id="29"/>
-    </w:p>
-    <w:p>
-      <w:pPr>
-        <w:rPr>
-          <w:lang w:val="es-AR"/>
-        </w:rPr>
-      </w:pPr>
-      <w:r>
-        <w:rPr>
-          <w:lang w:val="es-AR"/>
-        </w:rPr>
-        <w:t>D</w:t>
-      </w:r>
-      <w:r>
-        <w:rPr>
-          <w:lang w:val="es-AR"/>
-        </w:rPr>
-        <w:t>e acuerdo con</w:t>
-      </w:r>
-      <w:r>
-        <w:rPr>
-          <w:lang w:val="es-AR"/>
-        </w:rPr>
-        <w:t xml:space="preserve"> lo</w:t>
-      </w:r>
-      <w:r>
-        <w:rPr>
-          <w:lang w:val="es-AR"/>
-        </w:rPr>
-        <w:t xml:space="preserve"> observa</w:t>
-      </w:r>
-      <w:r>
-        <w:rPr>
-          <w:lang w:val="es-AR"/>
-        </w:rPr>
-        <w:t>do,</w:t>
-      </w:r>
-      <w:r>
-        <w:rPr>
-          <w:lang w:val="es-AR"/>
-        </w:rPr>
-        <w:t xml:space="preserve"> realizar un análisis de riesgo </w:t>
-      </w:r>
-      <w:r>
-        <w:rPr>
-          <w:lang w:val="es-AR"/>
-        </w:rPr>
-        <w:t xml:space="preserve">de salida de un cliente genera efectivamente ventajas para el negocio, independientemente del modelo que se elija para generar el modelo predictivo. </w:t>
-      </w:r>
-    </w:p>
-    <w:p>
-      <w:pPr>
-        <w:rPr>
-          <w:lang w:val="es-AR"/>
-        </w:rPr>
-      </w:pPr>
-      <w:r>
-        <w:rPr>
-          <w:lang w:val="es-AR"/>
-        </w:rPr>
-        <w:t xml:space="preserve">Las posibilidades de generar modelos, de mejorar su ajuste a través de optimización de parámetros, de mejoras en la toma de muestras de los datos y derivados son diversas y numerosas. A lo largo del proceso de selección de modelos para su exposición surgieron </w:t>
-      </w:r>
-      <w:r>
-        <w:rPr>
-          <w:lang w:val="es-AR"/>
-        </w:rPr>
-        <w:t xml:space="preserve">una </w:t>
-      </w:r>
-      <w:r>
-        <w:rPr>
-          <w:lang w:val="es-AR"/>
-        </w:rPr>
-        <w:t>gran cantidad</w:t>
-      </w:r>
-      <w:r>
-        <w:rPr>
-          <w:lang w:val="es-AR"/>
-        </w:rPr>
-        <w:t xml:space="preserve"> </w:t>
-      </w:r>
-      <w:r>
-        <w:rPr>
-          <w:lang w:val="es-AR"/>
-        </w:rPr>
-        <w:t>de posibilidades</w:t>
-      </w:r>
-      <w:r>
-        <w:rPr>
-          <w:lang w:val="es-AR"/>
-        </w:rPr>
-        <w:t xml:space="preserve">, pero </w:t>
-      </w:r>
-      <w:r>
-        <w:rPr>
-          <w:lang w:val="es-AR"/>
-        </w:rPr>
-        <w:t>se tomaron en cuenta aquellas que se consideraron convenientes, sin embargo</w:t>
-      </w:r>
-      <w:r>
-        <w:rPr>
-          <w:lang w:val="es-AR"/>
-        </w:rPr>
-        <w:t>,</w:t>
-      </w:r>
-      <w:r>
-        <w:rPr>
-          <w:lang w:val="es-AR"/>
-        </w:rPr>
-        <w:t xml:space="preserve"> se comprueba que el universo de herramientas para una correcta estimación del riesgo </w:t>
-      </w:r>
-      <w:r>
-        <w:rPr>
-          <w:lang w:val="es-AR"/>
-        </w:rPr>
-        <w:t xml:space="preserve">es variado y que </w:t>
-      </w:r>
-      <w:r>
-        <w:rPr>
-          <w:lang w:val="es-AR"/>
-        </w:rPr>
-        <w:t>está</w:t>
-      </w:r>
-      <w:r>
-        <w:rPr>
-          <w:lang w:val="es-AR"/>
-        </w:rPr>
-        <w:t xml:space="preserve"> en continuo crecimiento.</w:t>
-      </w:r>
-    </w:p>
-    <w:p>
-      <w:pPr>
-        <w:rPr>
-          <w:lang w:val="es-AR"/>
-        </w:rPr>
-      </w:pPr>
-      <w:r>
-        <w:rPr>
-          <w:lang w:val="es-AR"/>
-        </w:rPr>
-        <w:t>Concretamente se observa que de los métodos estudiados el que mejor</w:t>
-      </w:r>
-      <w:r>
-        <w:rPr>
-          <w:lang w:val="es-AR"/>
-        </w:rPr>
-        <w:t>es</w:t>
-      </w:r>
-      <w:r>
-        <w:rPr>
-          <w:lang w:val="es-AR"/>
-        </w:rPr>
-        <w:t xml:space="preserve"> resultados arroja para este problema en específico y con estos datos es el de </w:t>
-      </w:r>
-      <w:proofErr w:type="spellStart"/>
-      <w:r>
-        <w:rPr>
-          <w:i/>
-          <w:iCs/>
-          <w:lang w:val="es-AR"/>
-        </w:rPr>
-        <w:t>LightGBM</w:t>
-      </w:r>
-      <w:proofErr w:type="spellEnd"/>
-      <w:r>
-        <w:rPr>
-          <w:lang w:val="es-AR"/>
-        </w:rPr>
-        <w:t xml:space="preserve"> de Microsoft</w:t>
-      </w:r>
-      <w:r>
-        <w:rPr>
-          <w:lang w:val="es-AR"/>
-        </w:rPr>
-        <w:t xml:space="preserve"> debido a</w:t>
-      </w:r>
-      <w:r>
-        <w:rPr>
-          <w:lang w:val="es-AR"/>
-        </w:rPr>
-        <w:t xml:space="preserve"> que</w:t>
-      </w:r>
-      <w:r>
-        <w:rPr>
-          <w:lang w:val="es-AR"/>
-        </w:rPr>
-        <w:t xml:space="preserve"> predice las mayores ganancias</w:t>
-      </w:r>
-      <w:r>
-        <w:rPr>
-          <w:lang w:val="es-AR"/>
-        </w:rPr>
-        <w:t xml:space="preserve">. </w:t>
-      </w:r>
-      <w:r>
-        <w:rPr>
-          <w:lang w:val="es-AR"/>
-        </w:rPr>
-        <w:t xml:space="preserve">Estos resultados resultan provisorios, a la espera de nuevas puestas a prueba </w:t>
-      </w:r>
-      <w:r>
-        <w:rPr>
-          <w:lang w:val="es-AR"/>
-        </w:rPr>
-        <w:t>para la estimación de otros riesgos o con la utilización de otros datos</w:t>
-      </w:r>
-      <w:r>
-        <w:rPr>
-          <w:lang w:val="es-AR"/>
-        </w:rPr>
-        <w:t>, que la confirmen o pongan nuevamente en discusión</w:t>
-      </w:r>
-      <w:r>
-        <w:rPr>
-          <w:lang w:val="es-AR"/>
-        </w:rPr>
-        <w:t xml:space="preserve">. </w:t>
-      </w:r>
-    </w:p>
-    <w:p>
-      <w:pPr>
-        <w:pStyle w:val="Heading2"/>
-      </w:pPr>
-      <w:bookmarkStart w:id="30" w:name="_Toc211124603"/>
-      <w:r>
-        <w:t xml:space="preserve">Líneas </w:t>
-      </w:r>
-      <w:r>
-        <w:t>f</w:t>
-      </w:r>
-      <w:r>
-        <w:t xml:space="preserve">uturas de </w:t>
-      </w:r>
-      <w:r>
-        <w:t>i</w:t>
-      </w:r>
-      <w:r>
-        <w:t>nvestigación</w:t>
       </w:r>
       <w:bookmarkEnd w:id="30"/>
     </w:p>
@@ -14601,57 +15005,43 @@
         <w:rPr>
           <w:lang w:val="es-AR"/>
         </w:rPr>
-        <w:t xml:space="preserve">Queda pendiente para próximas líneas de investigación el estudio de nuevos algoritmos de aprendizaje automático </w:t>
-      </w:r>
-      <w:r>
-        <w:rPr>
-          <w:lang w:val="es-AR"/>
-        </w:rPr>
-        <w:t xml:space="preserve">diferentes </w:t>
-      </w:r>
-      <w:r>
-        <w:rPr>
-          <w:lang w:val="es-AR"/>
-        </w:rPr>
-        <w:t>a l</w:t>
-      </w:r>
-      <w:r>
-        <w:rPr>
-          <w:lang w:val="es-AR"/>
-        </w:rPr>
-        <w:t xml:space="preserve">os </w:t>
-      </w:r>
-      <w:r>
-        <w:rPr>
-          <w:lang w:val="es-AR"/>
-        </w:rPr>
-        <w:t>aquí estudiad</w:t>
-      </w:r>
-      <w:r>
-        <w:rPr>
-          <w:lang w:val="es-AR"/>
-        </w:rPr>
-        <w:t>o</w:t>
-      </w:r>
-      <w:r>
-        <w:rPr>
-          <w:lang w:val="es-AR"/>
-        </w:rPr>
-        <w:t xml:space="preserve">s, tales como los algoritmos </w:t>
-      </w:r>
-      <w:proofErr w:type="spellStart"/>
-      <w:r>
-        <w:rPr>
-          <w:lang w:val="es-AR"/>
-        </w:rPr>
-        <w:t>XGBoost</w:t>
-      </w:r>
-      <w:proofErr w:type="spellEnd"/>
-      <w:r>
-        <w:rPr>
-          <w:lang w:val="es-AR"/>
-        </w:rPr>
-        <w:t xml:space="preserve">. </w:t>
+        <w:t>D</w:t>
+      </w:r>
+      <w:r>
+        <w:rPr>
+          <w:lang w:val="es-AR"/>
+        </w:rPr>
+        <w:t>e acuerdo con</w:t>
+      </w:r>
+      <w:r>
+        <w:rPr>
+          <w:lang w:val="es-AR"/>
+        </w:rPr>
+        <w:t xml:space="preserve"> lo</w:t>
+      </w:r>
+      <w:r>
+        <w:rPr>
+          <w:lang w:val="es-AR"/>
+        </w:rPr>
+        <w:t xml:space="preserve"> observa</w:t>
+      </w:r>
+      <w:r>
+        <w:rPr>
+          <w:lang w:val="es-AR"/>
+        </w:rPr>
+        <w:t>do,</w:t>
+      </w:r>
+      <w:r>
+        <w:rPr>
+          <w:lang w:val="es-AR"/>
+        </w:rPr>
+        <w:t xml:space="preserve"> realizar un análisis de riesgo </w:t>
+      </w:r>
+      <w:r>
+        <w:rPr>
+          <w:lang w:val="es-AR"/>
+        </w:rPr>
+        <w:t xml:space="preserve">de salida de un cliente genera efectivamente ventajas para el negocio, independientemente del modelo que se elija para generar el modelo predictivo. </w:t>
       </w:r>
     </w:p>
     <w:p>
@@ -14664,43 +15054,73 @@
         <w:rPr>
           <w:lang w:val="es-AR"/>
         </w:rPr>
-        <w:t xml:space="preserve">También podría ser interesante para próximos trabajos </w:t>
-      </w:r>
-      <w:r>
-        <w:rPr>
-          <w:lang w:val="es-AR"/>
-        </w:rPr>
-        <w:t xml:space="preserve">la utilización de </w:t>
-      </w:r>
-      <w:r>
-        <w:rPr>
-          <w:lang w:val="es-AR"/>
-        </w:rPr>
-        <w:t>máquinas</w:t>
-      </w:r>
-      <w:r>
-        <w:rPr>
-          <w:lang w:val="es-AR"/>
-        </w:rPr>
-        <w:t xml:space="preserve"> virtuales con más capacidad de procesamiento que permitirían más iteraciones a las optimizaciones bayesianas para mejorar la robuste</w:t>
-      </w:r>
-      <w:r>
-        <w:rPr>
-          <w:lang w:val="es-AR"/>
-        </w:rPr>
-        <w:t>z</w:t>
-      </w:r>
-      <w:r>
-        <w:rPr>
-          <w:lang w:val="es-AR"/>
-        </w:rPr>
-        <w:t xml:space="preserve"> de los modelos.</w:t>
+        <w:t xml:space="preserve">Las posibilidades de generar modelos, de mejorar su ajuste a través de optimización de parámetros, de mejoras en la toma de muestras de los datos y derivados son diversas y numerosas. A lo largo del proceso de selección de modelos para su exposición surgieron </w:t>
+      </w:r>
+      <w:r>
+        <w:rPr>
+          <w:lang w:val="es-AR"/>
+        </w:rPr>
+        <w:t xml:space="preserve">una </w:t>
+      </w:r>
+      <w:r>
+        <w:rPr>
+          <w:lang w:val="es-AR"/>
+        </w:rPr>
+        <w:t>gran cantidad</w:t>
       </w:r>
       <w:r>
         <w:rPr>
           <w:lang w:val="es-AR"/>
         </w:rPr>
         <w:t xml:space="preserve"> </w:t>
+      </w:r>
+      <w:r>
+        <w:rPr>
+          <w:lang w:val="es-AR"/>
+        </w:rPr>
+        <w:t>de posibilidades</w:t>
+      </w:r>
+      <w:r>
+        <w:rPr>
+          <w:lang w:val="es-AR"/>
+        </w:rPr>
+        <w:t xml:space="preserve">, pero </w:t>
+      </w:r>
+      <w:r>
+        <w:rPr>
+          <w:lang w:val="es-AR"/>
+        </w:rPr>
+        <w:t>se tomaron en cuenta aquellas que se consideraron convenientes, sin embargo</w:t>
+      </w:r>
+      <w:r>
+        <w:rPr>
+          <w:lang w:val="es-AR"/>
+        </w:rPr>
+        <w:t>,</w:t>
+      </w:r>
+      <w:r>
+        <w:rPr>
+          <w:lang w:val="es-AR"/>
+        </w:rPr>
+        <w:t xml:space="preserve"> se comprueba que el universo de herramientas para una correcta estimación del riesgo </w:t>
+      </w:r>
+      <w:r>
+        <w:rPr>
+          <w:lang w:val="es-AR"/>
+        </w:rPr>
+        <w:t xml:space="preserve">es variado y que </w:t>
+      </w:r>
+      <w:r>
+        <w:rPr>
+          <w:lang w:val="es-AR"/>
+        </w:rPr>
+        <w:t>está</w:t>
+      </w:r>
+      <w:r>
+        <w:rPr>
+          <w:lang w:val="es-AR"/>
+        </w:rPr>
+        <w:t xml:space="preserve"> en continuo crecimiento.</w:t>
       </w:r>
     </w:p>
     <w:p>
@@ -14713,103 +15133,77 @@
         <w:rPr>
           <w:lang w:val="es-AR"/>
         </w:rPr>
-        <w:t>Por último</w:t>
-      </w:r>
-      <w:r>
-        <w:rPr>
-          <w:lang w:val="es-AR"/>
-        </w:rPr>
-        <w:t>,</w:t>
-      </w:r>
-      <w:r>
-        <w:rPr>
-          <w:lang w:val="es-AR"/>
-        </w:rPr>
-        <w:t xml:space="preserve"> </w:t>
-      </w:r>
-      <w:r>
-        <w:rPr>
-          <w:lang w:val="es-AR"/>
-        </w:rPr>
-        <w:t>otra posibilidad de ampliar el estudio de la problemática de retención de clientes es</w:t>
-      </w:r>
-      <w:r>
-        <w:rPr>
-          <w:lang w:val="es-AR"/>
-        </w:rPr>
-        <w:t xml:space="preserve"> el poder probar la efectividad del estímulo y </w:t>
-      </w:r>
-      <w:r>
-        <w:rPr>
-          <w:lang w:val="es-AR"/>
-        </w:rPr>
-        <w:t>la relación entre la cantidad de dinero</w:t>
-      </w:r>
-      <w:r>
-        <w:rPr>
-          <w:lang w:val="es-AR"/>
-        </w:rPr>
-        <w:t xml:space="preserve"> propuesta </w:t>
-      </w:r>
-      <w:r>
-        <w:rPr>
-          <w:lang w:val="es-AR"/>
-        </w:rPr>
-        <w:t>para ese fin y cuantos usuarios efectivamente toman la decisión de quedarse. Sería conveniente personalizar el</w:t>
-      </w:r>
-      <w:r>
-        <w:rPr>
-          <w:lang w:val="es-AR"/>
-        </w:rPr>
-        <w:t xml:space="preserve"> programa por cliente o por grupos de clientes</w:t>
-      </w:r>
-      <w:r>
-        <w:rPr>
-          <w:lang w:val="es-AR"/>
-        </w:rPr>
-        <w:t xml:space="preserve"> para enviar el mínimo valor necesario para que </w:t>
-      </w:r>
-      <w:r>
-        <w:rPr>
-          <w:lang w:val="es-AR"/>
-        </w:rPr>
-        <w:t xml:space="preserve">éstos </w:t>
-      </w:r>
-      <w:r>
-        <w:rPr>
-          <w:lang w:val="es-AR"/>
-        </w:rPr>
-        <w:t xml:space="preserve">decidan quedarse y </w:t>
-      </w:r>
-      <w:r>
-        <w:rPr>
-          <w:lang w:val="es-AR"/>
-        </w:rPr>
-        <w:t xml:space="preserve">maximizando </w:t>
-      </w:r>
-      <w:r>
-        <w:rPr>
-          <w:lang w:val="es-AR"/>
-        </w:rPr>
-        <w:t>de es</w:t>
-      </w:r>
-      <w:r>
-        <w:rPr>
-          <w:lang w:val="es-AR"/>
-        </w:rPr>
-        <w:t>t</w:t>
-      </w:r>
-      <w:r>
-        <w:rPr>
-          <w:lang w:val="es-AR"/>
-        </w:rPr>
-        <w:t>a forma las ganancias</w:t>
-      </w:r>
-      <w:r>
-        <w:rPr>
-          <w:lang w:val="es-AR"/>
-        </w:rPr>
-        <w:t xml:space="preserve"> aún más</w:t>
+        <w:t>Concretamente se observa que de los métodos estudiados el que mejor</w:t>
+      </w:r>
+      <w:r>
+        <w:rPr>
+          <w:lang w:val="es-AR"/>
+        </w:rPr>
+        <w:t>es</w:t>
+      </w:r>
+      <w:r>
+        <w:rPr>
+          <w:lang w:val="es-AR"/>
+        </w:rPr>
+        <w:t xml:space="preserve"> resultados arroja para este problema en específico y con estos datos es el de </w:t>
+      </w:r>
+      <w:proofErr w:type="spellStart"/>
+      <w:r>
+        <w:rPr>
+          <w:i/>
+          <w:iCs/>
+          <w:lang w:val="es-AR"/>
+        </w:rPr>
+        <w:t>LightGBM</w:t>
+      </w:r>
+      <w:proofErr w:type="spellEnd"/>
+      <w:r>
+        <w:rPr>
+          <w:lang w:val="es-AR"/>
+        </w:rPr>
+        <w:t xml:space="preserve"> de Microsoft</w:t>
+      </w:r>
+      <w:r>
+        <w:rPr>
+          <w:lang w:val="es-AR"/>
+        </w:rPr>
+        <w:t xml:space="preserve"> debido a</w:t>
+      </w:r>
+      <w:r>
+        <w:rPr>
+          <w:lang w:val="es-AR"/>
+        </w:rPr>
+        <w:t xml:space="preserve"> que</w:t>
+      </w:r>
+      <w:r>
+        <w:rPr>
+          <w:lang w:val="es-AR"/>
+        </w:rPr>
+        <w:t xml:space="preserve"> predice las mayores ganancias</w:t>
+      </w:r>
+      <w:r>
+        <w:rPr>
+          <w:lang w:val="es-AR"/>
+        </w:rPr>
+        <w:t xml:space="preserve">. </w:t>
+      </w:r>
+      <w:r>
+        <w:rPr>
+          <w:lang w:val="es-AR"/>
+        </w:rPr>
+        <w:t xml:space="preserve">Estos resultados resultan provisorios, a la espera de nuevas puestas a prueba </w:t>
+      </w:r>
+      <w:r>
+        <w:rPr>
+          <w:lang w:val="es-AR"/>
+        </w:rPr>
+        <w:t>para la estimación de otros riesgos o con la utilización de otros datos</w:t>
+      </w:r>
+      <w:r>
+        <w:rPr>
+          <w:lang w:val="es-AR"/>
+        </w:rPr>
+        <w:t>, que la confirmen o pongan nuevamente en discusión</w:t>
       </w:r>
       <w:r>
         <w:rPr>
@@ -14820,6 +15214,255 @@
     </w:p>
     <w:p>
       <w:pPr>
+        <w:pStyle w:val="Heading2"/>
+      </w:pPr>
+      <w:bookmarkStart w:id="31" w:name="_Toc211124603"/>
+      <w:r>
+        <w:t xml:space="preserve">Líneas </w:t>
+      </w:r>
+      <w:r>
+        <w:t>f</w:t>
+      </w:r>
+      <w:r>
+        <w:t xml:space="preserve">uturas de </w:t>
+      </w:r>
+      <w:r>
+        <w:t>i</w:t>
+      </w:r>
+      <w:r>
+        <w:t>nvestigación</w:t>
+      </w:r>
+      <w:bookmarkEnd w:id="31"/>
+    </w:p>
+    <w:p>
+      <w:pPr>
+        <w:rPr>
+          <w:lang w:val="es-AR"/>
+        </w:rPr>
+      </w:pPr>
+      <w:r>
+        <w:rPr>
+          <w:lang w:val="es-AR"/>
+        </w:rPr>
+        <w:t xml:space="preserve">Queda pendiente para próximas líneas de investigación el estudio de nuevos algoritmos de aprendizaje automático </w:t>
+      </w:r>
+      <w:r>
+        <w:rPr>
+          <w:lang w:val="es-AR"/>
+        </w:rPr>
+        <w:t xml:space="preserve">diferentes </w:t>
+      </w:r>
+      <w:r>
+        <w:rPr>
+          <w:lang w:val="es-AR"/>
+        </w:rPr>
+        <w:t>a l</w:t>
+      </w:r>
+      <w:r>
+        <w:rPr>
+          <w:lang w:val="es-AR"/>
+        </w:rPr>
+        <w:t xml:space="preserve">os </w:t>
+      </w:r>
+      <w:r>
+        <w:rPr>
+          <w:lang w:val="es-AR"/>
+        </w:rPr>
+        <w:t>aquí estudiad</w:t>
+      </w:r>
+      <w:r>
+        <w:rPr>
+          <w:lang w:val="es-AR"/>
+        </w:rPr>
+        <w:t>o</w:t>
+      </w:r>
+      <w:r>
+        <w:rPr>
+          <w:lang w:val="es-AR"/>
+        </w:rPr>
+        <w:t xml:space="preserve">s, tales como los algoritmos </w:t>
+      </w:r>
+      <w:proofErr w:type="spellStart"/>
+      <w:r>
+        <w:rPr>
+          <w:lang w:val="es-AR"/>
+        </w:rPr>
+        <w:t>XGBoost</w:t>
+      </w:r>
+      <w:proofErr w:type="spellEnd"/>
+      <w:r>
+        <w:rPr>
+          <w:lang w:val="es-AR"/>
+        </w:rPr>
+        <w:t xml:space="preserve">. </w:t>
+      </w:r>
+    </w:p>
+    <w:p>
+      <w:pPr>
+        <w:rPr>
+          <w:lang w:val="es-AR"/>
+        </w:rPr>
+      </w:pPr>
+      <w:r>
+        <w:rPr>
+          <w:lang w:val="es-AR"/>
+        </w:rPr>
+        <w:t xml:space="preserve">También podría ser interesante para próximos trabajos </w:t>
+      </w:r>
+      <w:r>
+        <w:rPr>
+          <w:lang w:val="es-AR"/>
+        </w:rPr>
+        <w:t xml:space="preserve">la utilización de </w:t>
+      </w:r>
+      <w:r>
+        <w:rPr>
+          <w:lang w:val="es-AR"/>
+        </w:rPr>
+        <w:t>máquinas</w:t>
+      </w:r>
+      <w:r>
+        <w:rPr>
+          <w:lang w:val="es-AR"/>
+        </w:rPr>
+        <w:t xml:space="preserve"> virtuales con más capacidad de procesamiento que permitirían más iteraciones a las optimizaciones bayesianas para mejorar la robuste</w:t>
+      </w:r>
+      <w:r>
+        <w:rPr>
+          <w:lang w:val="es-AR"/>
+        </w:rPr>
+        <w:t>z</w:t>
+      </w:r>
+      <w:r>
+        <w:rPr>
+          <w:lang w:val="es-AR"/>
+        </w:rPr>
+        <w:t xml:space="preserve"> de los modelos.</w:t>
+      </w:r>
+      <w:r>
+        <w:rPr>
+          <w:lang w:val="es-AR"/>
+        </w:rPr>
+        <w:t xml:space="preserve"> </w:t>
+      </w:r>
+    </w:p>
+    <w:p>
+      <w:pPr>
+        <w:rPr>
+          <w:lang w:val="es-AR"/>
+        </w:rPr>
+      </w:pPr>
+      <w:r>
+        <w:rPr>
+          <w:lang w:val="es-AR"/>
+        </w:rPr>
+        <w:t>Por último</w:t>
+      </w:r>
+      <w:r>
+        <w:rPr>
+          <w:lang w:val="es-AR"/>
+        </w:rPr>
+        <w:t>,</w:t>
+      </w:r>
+      <w:r>
+        <w:rPr>
+          <w:lang w:val="es-AR"/>
+        </w:rPr>
+        <w:t xml:space="preserve"> </w:t>
+      </w:r>
+      <w:r>
+        <w:rPr>
+          <w:lang w:val="es-AR"/>
+        </w:rPr>
+        <w:t>otra posibilidad de ampliar el estudio de la problemática de retención de clientes es</w:t>
+      </w:r>
+      <w:r>
+        <w:rPr>
+          <w:lang w:val="es-AR"/>
+        </w:rPr>
+        <w:t xml:space="preserve"> el poder probar la efectividad del estímulo y </w:t>
+      </w:r>
+      <w:r>
+        <w:rPr>
+          <w:lang w:val="es-AR"/>
+        </w:rPr>
+        <w:t>la relación entre la cantidad de dinero</w:t>
+      </w:r>
+      <w:r>
+        <w:rPr>
+          <w:lang w:val="es-AR"/>
+        </w:rPr>
+        <w:t xml:space="preserve"> propuesta </w:t>
+      </w:r>
+      <w:r>
+        <w:rPr>
+          <w:lang w:val="es-AR"/>
+        </w:rPr>
+        <w:t>para ese fin y cuantos usuarios efectivamente toman la decisión de quedarse. Sería conveniente personalizar el</w:t>
+      </w:r>
+      <w:r>
+        <w:rPr>
+          <w:lang w:val="es-AR"/>
+        </w:rPr>
+        <w:t xml:space="preserve"> programa por cliente o por grupos de clientes</w:t>
+      </w:r>
+      <w:r>
+        <w:rPr>
+          <w:lang w:val="es-AR"/>
+        </w:rPr>
+        <w:t xml:space="preserve"> para enviar el mínimo valor necesario para que </w:t>
+      </w:r>
+      <w:r>
+        <w:rPr>
+          <w:lang w:val="es-AR"/>
+        </w:rPr>
+        <w:t xml:space="preserve">éstos </w:t>
+      </w:r>
+      <w:r>
+        <w:rPr>
+          <w:lang w:val="es-AR"/>
+        </w:rPr>
+        <w:t xml:space="preserve">decidan quedarse y </w:t>
+      </w:r>
+      <w:r>
+        <w:rPr>
+          <w:lang w:val="es-AR"/>
+        </w:rPr>
+        <w:t xml:space="preserve">maximizando </w:t>
+      </w:r>
+      <w:r>
+        <w:rPr>
+          <w:lang w:val="es-AR"/>
+        </w:rPr>
+        <w:t>de es</w:t>
+      </w:r>
+      <w:r>
+        <w:rPr>
+          <w:lang w:val="es-AR"/>
+        </w:rPr>
+        <w:t>t</w:t>
+      </w:r>
+      <w:r>
+        <w:rPr>
+          <w:lang w:val="es-AR"/>
+        </w:rPr>
+        <w:t>a forma las ganancias</w:t>
+      </w:r>
+      <w:r>
+        <w:rPr>
+          <w:lang w:val="es-AR"/>
+        </w:rPr>
+        <w:t xml:space="preserve"> aún más</w:t>
+      </w:r>
+      <w:r>
+        <w:rPr>
+          <w:lang w:val="es-AR"/>
+        </w:rPr>
+        <w:t xml:space="preserve">. </w:t>
+      </w:r>
+    </w:p>
+    <w:p>
+      <w:pPr>
         <w:spacing w:after="160" w:line="259" w:lineRule="auto"/>
         <w:jc w:val="left"/>
         <w:rPr>
@@ -14833,7 +15476,7 @@
         <w:br w:type="page"/>
       </w:r>
     </w:p>
-    <w:bookmarkStart w:id="31" w:name="_Toc211124604" w:displacedByCustomXml="next"/>
+    <w:bookmarkStart w:id="32" w:name="_Toc211124604" w:displacedByCustomXml="next"/>
     <w:sdt>
       <w:sdtPr>
         <w:rPr>
@@ -14856,7 +15499,7 @@
           <w:r>
             <w:t>Bibliografía</w:t>
           </w:r>
-          <w:bookmarkEnd w:id="31"/>
+          <w:bookmarkEnd w:id="32"/>
         </w:p>
         <w:sdt>
           <w:sdtPr>
@@ -15203,7 +15846,7 @@
           <w:lang w:val="es-AR"/>
         </w:rPr>
       </w:pPr>
-      <w:bookmarkStart w:id="32" w:name="_Toc106706667"/>
+      <w:bookmarkStart w:id="33" w:name="_Toc106706667"/>
       <w:r>
         <w:rPr>
           <w:lang w:val="es-AR"/>
@@ -15218,7 +15861,7 @@
           <w:lang w:val="es-AR"/>
         </w:rPr>
       </w:pPr>
-      <w:bookmarkStart w:id="33" w:name="_Toc211124605"/>
+      <w:bookmarkStart w:id="34" w:name="_Toc211124605"/>
       <w:r>
         <w:rPr>
           <w:lang w:val="es-AR"/>
@@ -15232,14 +15875,14 @@
         </w:rPr>
         <w:t>Anexo</w:t>
       </w:r>
-      <w:bookmarkEnd w:id="32"/>
+      <w:bookmarkEnd w:id="33"/>
       <w:r>
         <w:rPr>
           <w:lang w:val="es-AR"/>
         </w:rPr>
         <w:t>s</w:t>
       </w:r>
-      <w:bookmarkEnd w:id="33"/>
+      <w:bookmarkEnd w:id="34"/>
     </w:p>
     <w:p>
       <w:pPr>
@@ -15248,7 +15891,7 @@
           <w:lang w:val="es-AR"/>
         </w:rPr>
       </w:pPr>
-      <w:bookmarkStart w:id="34" w:name="_Toc211124606"/>
+      <w:bookmarkStart w:id="35" w:name="_Toc211124606"/>
       <w:r>
         <w:rPr>
           <w:lang w:val="es-AR"/>
@@ -15299,7 +15942,7 @@
         </w:rPr>
         <w:t>.</w:t>
       </w:r>
-      <w:bookmarkEnd w:id="34"/>
+      <w:bookmarkEnd w:id="35"/>
       <w:r>
         <w:rPr>
           <w:lang w:val="es-AR"/>
@@ -15661,39 +16304,31 @@
             </w:r>
             <w:r>
               <w:lastRenderedPageBreak/>
-              <w:t xml:space="preserve">son clientes de Paquete </w:t>
+              <w:t xml:space="preserve">son clientes de Paquete Premium,  el </w:t>
+            </w:r>
+            <w:proofErr w:type="spellStart"/>
+            <w:r>
+              <w:t>area</w:t>
+            </w:r>
+            <w:proofErr w:type="spellEnd"/>
+            <w:r>
+              <w:t xml:space="preserve"> de marketing solo considera vip a menos </w:t>
             </w:r>
             <w:proofErr w:type="gramStart"/>
             <w:r>
-              <w:t>Premium,  el</w:t>
+              <w:t>del  2</w:t>
             </w:r>
             <w:proofErr w:type="gramEnd"/>
             <w:r>
-              <w:t xml:space="preserve"> </w:t>
-            </w:r>
-            <w:proofErr w:type="spellStart"/>
-            <w:r>
-              <w:t>area</w:t>
-            </w:r>
-            <w:proofErr w:type="spellEnd"/>
-            <w:r>
-              <w:t xml:space="preserve"> de marketing solo considera vip a menos </w:t>
+              <w:t xml:space="preserve">% </w:t>
             </w:r>
             <w:proofErr w:type="gramStart"/>
             <w:r>
-              <w:t>del  2</w:t>
+              <w:t>de los paquete premium</w:t>
             </w:r>
             <w:proofErr w:type="gramEnd"/>
             <w:r>
-              <w:t xml:space="preserve">% de los paquete </w:t>
-            </w:r>
-            <w:proofErr w:type="gramStart"/>
-            <w:r>
-              <w:t>premium ,</w:t>
-            </w:r>
-            <w:proofErr w:type="gramEnd"/>
-            <w:r>
-              <w:t xml:space="preserve"> y da a estos clientes VIP un trato a puertas cerradas.</w:t>
+              <w:t xml:space="preserve"> , y da a estos clientes VIP un trato a puertas cerradas.</w:t>
             </w:r>
           </w:p>
         </w:tc>
@@ -15709,7 +16344,6 @@
           </w:tcPr>
           <w:p>
             <w:r>
-              <w:lastRenderedPageBreak/>
               <w:t>5</w:t>
             </w:r>
           </w:p>
@@ -17140,7 +17774,6 @@
           </w:tcPr>
           <w:p>
             <w:r>
-              <w:lastRenderedPageBreak/>
               <w:t>31</w:t>
             </w:r>
           </w:p>
@@ -18862,27 +19495,11 @@
             </w:r>
             <w:proofErr w:type="gramEnd"/>
             <w:r>
-              <w:t xml:space="preserve"> automáticos debitados durante el mes en las </w:t>
-            </w:r>
-            <w:proofErr w:type="gramStart"/>
-            <w:r>
-              <w:t xml:space="preserve">cuentas  </w:t>
+              <w:t xml:space="preserve"> automáticos debitados durante el mes en las cuentas  </w:t>
             </w:r>
             <w:r>
               <w:lastRenderedPageBreak/>
-              <w:t>(</w:t>
-            </w:r>
-            <w:proofErr w:type="gramEnd"/>
-            <w:r>
-              <w:t xml:space="preserve"> no tarjetas de </w:t>
-            </w:r>
-            <w:proofErr w:type="gramStart"/>
-            <w:r>
-              <w:t>crédito )</w:t>
-            </w:r>
-            <w:proofErr w:type="gramEnd"/>
-            <w:r>
-              <w:t xml:space="preserve"> . Todo está convertido a pesos argentinos, al valor de la fecha de cierre del </w:t>
+              <w:t xml:space="preserve">( no tarjetas de crédito ) . Todo está convertido a pesos argentinos, al valor de la fecha de cierre del </w:t>
             </w:r>
             <w:proofErr w:type="spellStart"/>
             <w:r>
@@ -18922,7 +19539,6 @@
           </w:tcPr>
           <w:p>
             <w:r>
-              <w:lastRenderedPageBreak/>
               <w:t>61</w:t>
             </w:r>
           </w:p>
@@ -19025,15 +19641,7 @@
             </w:r>
             <w:proofErr w:type="gramEnd"/>
             <w:r>
-              <w:t xml:space="preserve"> automáticos debitados durante el mes en la tarjeta de crédito </w:t>
-            </w:r>
-            <w:proofErr w:type="gramStart"/>
-            <w:r>
-              <w:t>VISA .</w:t>
-            </w:r>
-            <w:proofErr w:type="gramEnd"/>
-            <w:r>
-              <w:t xml:space="preserve"> Todo está convertido a pesos argentinos, al valor de la fecha de cierre del </w:t>
+              <w:t xml:space="preserve"> automáticos debitados durante el mes en la tarjeta de crédito VISA . Todo está convertido a pesos argentinos, al valor de la fecha de cierre del </w:t>
             </w:r>
             <w:proofErr w:type="spellStart"/>
             <w:r>
@@ -19191,15 +19799,7 @@
             </w:r>
             <w:proofErr w:type="gramEnd"/>
             <w:r>
-              <w:t xml:space="preserve"> automáticos debitados durante el mes en la tarjeta de crédito </w:t>
-            </w:r>
-            <w:proofErr w:type="gramStart"/>
-            <w:r>
-              <w:t>MasterCard .</w:t>
-            </w:r>
-            <w:proofErr w:type="gramEnd"/>
-            <w:r>
-              <w:t xml:space="preserve"> Todo está convertido a pesos argentinos, al valor de la fecha de cierre del </w:t>
+              <w:t xml:space="preserve"> automáticos debitados durante el mes en la tarjeta de crédito MasterCard . Todo está convertido a pesos argentinos, al valor de la fecha de cierre del </w:t>
             </w:r>
             <w:proofErr w:type="spellStart"/>
             <w:r>
@@ -22127,21 +22727,16 @@
             <w:hideMark/>
           </w:tcPr>
           <w:p>
+            <w:r>
+              <w:t>{ 0</w:t>
+            </w:r>
             <w:proofErr w:type="gramStart"/>
             <w:r>
-              <w:t>{ 0,  6</w:t>
+              <w:t>,  6</w:t>
             </w:r>
             <w:proofErr w:type="gramEnd"/>
             <w:r>
-              <w:t xml:space="preserve">, 7, </w:t>
-            </w:r>
-            <w:proofErr w:type="gramStart"/>
-            <w:r>
-              <w:t>9 }</w:t>
-            </w:r>
-            <w:proofErr w:type="gramEnd"/>
-            <w:r>
-              <w:t xml:space="preserve">   indica el estado de la cuenta de la tarjeta de crédito. 0 abierta,  6 en proceso de cierre, 7 en proceso avanzado de cierre, 9 cuenta cerrada.   </w:t>
+              <w:t xml:space="preserve">, 7, 9 }   indica el estado de la cuenta de la tarjeta de crédito. 0 abierta,  6 en proceso de cierre, 7 en proceso avanzado de cierre, 9 cuenta cerrada.   </w:t>
             </w:r>
             <w:proofErr w:type="gramStart"/>
             <w:r>
@@ -23511,21 +24106,16 @@
             <w:hideMark/>
           </w:tcPr>
           <w:p>
+            <w:r>
+              <w:t>{ 0</w:t>
+            </w:r>
             <w:proofErr w:type="gramStart"/>
             <w:r>
-              <w:t>{ 0,  6</w:t>
+              <w:t>,  6</w:t>
             </w:r>
             <w:proofErr w:type="gramEnd"/>
             <w:r>
-              <w:t xml:space="preserve">, 7, </w:t>
-            </w:r>
-            <w:proofErr w:type="gramStart"/>
-            <w:r>
-              <w:t>9 }</w:t>
-            </w:r>
-            <w:proofErr w:type="gramEnd"/>
-            <w:r>
-              <w:t xml:space="preserve">   indica el estado de la cuenta de la tarjeta de crédito. 0 abierta,  6 en proceso de cierre, 7 en proceso avanzado de cierre, 9 cuenta cerrada.   </w:t>
+              <w:t xml:space="preserve">, 7, 9 }   indica el estado de la cuenta de la tarjeta de crédito. 0 abierta,  6 en proceso de cierre, 7 en proceso avanzado de cierre, 9 cuenta cerrada.   </w:t>
             </w:r>
             <w:proofErr w:type="gramStart"/>
             <w:r>
@@ -23550,7 +24140,6 @@
           </w:tcPr>
           <w:p>
             <w:r>
-              <w:lastRenderedPageBreak/>
               <w:t>138</w:t>
             </w:r>
           </w:p>
@@ -24310,8 +24899,8 @@
           <w:lang w:val="es-AR"/>
         </w:rPr>
       </w:pPr>
-      <w:bookmarkStart w:id="35" w:name="_Toc106706668"/>
-      <w:bookmarkStart w:id="36" w:name="_Toc211124607"/>
+      <w:bookmarkStart w:id="36" w:name="_Toc106706668"/>
+      <w:bookmarkStart w:id="37" w:name="_Toc211124607"/>
       <w:r>
         <w:rPr>
           <w:lang w:val="es-AR"/>
@@ -24366,8 +24955,8 @@
         </w:rPr>
         <w:t>proximación a la data.</w:t>
       </w:r>
-      <w:bookmarkEnd w:id="35"/>
       <w:bookmarkEnd w:id="36"/>
+      <w:bookmarkEnd w:id="37"/>
       <w:r>
         <w:rPr>
           <w:lang w:val="es-AR"/>
@@ -24516,7 +25105,6 @@
         <w:t xml:space="preserve">- </w:t>
       </w:r>
       <w:proofErr w:type="spellStart"/>
-      <w:proofErr w:type="gramStart"/>
       <w:r>
         <w:rPr>
           <w:lang w:val="es-AR"/>
@@ -24528,14 +25116,7 @@
         <w:rPr>
           <w:lang w:val="es-AR"/>
         </w:rPr>
-        <w:t>(</w:t>
-      </w:r>
-      <w:proofErr w:type="gramEnd"/>
-      <w:r>
-        <w:rPr>
-          <w:lang w:val="es-AR"/>
-        </w:rPr>
-        <w:t>"C:/Users/fiore/Documents/fiore facultad/TESINA/</w:t>
+        <w:t>("C:/Users/fiore/Documents/fiore facultad/TESINA/</w:t>
       </w:r>
       <w:proofErr w:type="spellStart"/>
       <w:r>
@@ -24989,7 +25570,6 @@
         </w:rPr>
       </w:pPr>
       <w:proofErr w:type="spellStart"/>
-      <w:proofErr w:type="gramStart"/>
       <w:r>
         <w:rPr>
           <w:lang w:val="es-AR"/>
@@ -25004,7 +25584,6 @@
         <w:t>(</w:t>
       </w:r>
       <w:proofErr w:type="spellStart"/>
-      <w:proofErr w:type="gramEnd"/>
       <w:r>
         <w:rPr>
           <w:lang w:val="es-AR"/>
@@ -25068,7 +25647,6 @@
         </w:rPr>
       </w:pPr>
       <w:proofErr w:type="spellStart"/>
-      <w:proofErr w:type="gramStart"/>
       <w:r>
         <w:rPr>
           <w:lang w:val="es-AR"/>
@@ -25084,7 +25662,6 @@
         <w:t>(</w:t>
       </w:r>
       <w:proofErr w:type="spellStart"/>
-      <w:proofErr w:type="gramEnd"/>
       <w:r>
         <w:rPr>
           <w:lang w:val="es-AR"/>
@@ -25409,6 +25986,67 @@
       </w:r>
     </w:p>
   </w:comment>
+  <w:comment w:id="16" w:author="Franco Nahuel  Olivero" w:date="2025-10-22T01:54:00Z" w:initials="FO">
+    <w:p>
+      <w:pPr>
+        <w:pStyle w:val="CommentText"/>
+        <w:jc w:val="left"/>
+      </w:pPr>
+      <w:r>
+        <w:rPr>
+          <w:rStyle w:val="CommentReference"/>
+        </w:rPr>
+        <w:annotationRef/>
+      </w:r>
+      <w:r>
+        <w:t>Hacer referenica a paper nordico</w:t>
+      </w:r>
+      <w:r>
+        <w:br/>
+        <w:t>Fitting and Forecasting Mortality Rates for Nordic Countries w LC method (conclusiones)</w:t>
+      </w:r>
+      <w:r>
+        <w:br/>
+      </w:r>
+      <w:r>
+        <w:br/>
+      </w:r>
+    </w:p>
+  </w:comment>
+  <w:comment w:id="18" w:author="Franco Nahuel  Olivero" w:date="2025-10-22T02:19:00Z" w:initials="FO">
+    <w:p>
+      <w:pPr>
+        <w:pStyle w:val="CommentText"/>
+        <w:jc w:val="left"/>
+      </w:pPr>
+      <w:r>
+        <w:rPr>
+          <w:rStyle w:val="CommentReference"/>
+        </w:rPr>
+        <w:annotationRef/>
+      </w:r>
+      <w:r>
+        <w:t>Agregar referencia a algo de estadística actuarial.</w:t>
+      </w:r>
+    </w:p>
+  </w:comment>
+  <w:comment w:id="20" w:author="Franco Nahuel  Olivero" w:date="2025-10-22T02:25:00Z" w:initials="FO">
+    <w:p>
+      <w:pPr>
+        <w:pStyle w:val="CommentText"/>
+        <w:jc w:val="left"/>
+      </w:pPr>
+      <w:r>
+        <w:rPr>
+          <w:rStyle w:val="CommentReference"/>
+        </w:rPr>
+        <w:annotationRef/>
+      </w:r>
+      <w:r>
+        <w:t>Agregar alguna referencia a machine learning</w:t>
+      </w:r>
+    </w:p>
+  </w:comment>
 </w:comments>
 </file>
 
@@ -25418,6 +26056,9 @@
   <w15:commentEx w15:paraId="5974F7F9" w15:done="0"/>
   <w15:commentEx w15:paraId="5DCA3EC6" w15:done="0"/>
   <w15:commentEx w15:paraId="08B45DEE" w15:done="0"/>
+  <w15:commentEx w15:paraId="29D05234" w15:done="0"/>
+  <w15:commentEx w15:paraId="635AEAC8" w15:done="0"/>
+  <w15:commentEx w15:paraId="1594A81A" w15:done="0"/>
 </w15:commentsEx>
 </file>
 
@@ -25427,6 +26068,9 @@
   <w16cex:commentExtensible w16cex:durableId="7D30E899" w16cex:dateUtc="2025-10-11T23:32:00Z"/>
   <w16cex:commentExtensible w16cex:durableId="151BF756" w16cex:dateUtc="2025-10-21T14:30:00Z"/>
   <w16cex:commentExtensible w16cex:durableId="7BF68A02" w16cex:dateUtc="2025-10-21T14:36:00Z"/>
+  <w16cex:commentExtensible w16cex:durableId="105C3644" w16cex:dateUtc="2025-10-22T04:54:00Z"/>
+  <w16cex:commentExtensible w16cex:durableId="280FA6EA" w16cex:dateUtc="2025-10-22T05:19:00Z"/>
+  <w16cex:commentExtensible w16cex:durableId="5D425B85" w16cex:dateUtc="2025-10-22T05:25:00Z"/>
 </w16cex:commentsExtensible>
 </file>
 
@@ -25436,6 +26080,9 @@
   <w16cid:commentId w16cid:paraId="5974F7F9" w16cid:durableId="7D30E899"/>
   <w16cid:commentId w16cid:paraId="5DCA3EC6" w16cid:durableId="151BF756"/>
   <w16cid:commentId w16cid:paraId="08B45DEE" w16cid:durableId="7BF68A02"/>
+  <w16cid:commentId w16cid:paraId="29D05234" w16cid:durableId="105C3644"/>
+  <w16cid:commentId w16cid:paraId="635AEAC8" w16cid:durableId="280FA6EA"/>
+  <w16cid:commentId w16cid:paraId="1594A81A" w16cid:durableId="5D425B85"/>
 </w16cid:commentsIds>
 </file>
 
@@ -30199,12 +30846,226 @@
 </file>
 
 <file path=customXml/item1.xml><?xml version="1.0" encoding="utf-8"?>
-<p:properties xmlns:p="http://schemas.microsoft.com/office/2006/metadata/properties" xmlns:xsi="http://www.w3.org/2001/XMLSchema-instance" xmlns:pc="http://schemas.microsoft.com/office/infopath/2007/PartnerControls">
-  <documentManagement/>
-</p:properties>
+<b:Sources xmlns:b="http://schemas.openxmlformats.org/officeDocument/2006/bibliography" xmlns="http://schemas.openxmlformats.org/officeDocument/2006/bibliography" SelectedStyle="\APASixthEditionOfficeOnline.xsl" StyleName="APA" Version="6">
+  <b:Source>
+    <b:Tag>Bre94</b:Tag>
+    <b:SourceType>Misc</b:SourceType>
+    <b:Guid>{CE0F26A3-CCBE-4E7C-8316-F9DF384D77E8}</b:Guid>
+    <b:Title>Bagging Predictors</b:Title>
+    <b:Year>1994</b:Year>
+    <b:Publisher>University of California</b:Publisher>
+    <b:Month>Septiembre</b:Month>
+    <b:Author>
+      <b:Author>
+        <b:NameList>
+          <b:Person>
+            <b:Last>Breiman</b:Last>
+            <b:First>Leo </b:First>
+          </b:Person>
+        </b:NameList>
+      </b:Author>
+    </b:Author>
+    <b:URL>https://www.stat.berkeley.edu/~breiman/bagging.pdf</b:URL>
+    <b:RefOrder>5</b:RefOrder>
+  </b:Source>
+  <b:Source>
+    <b:Tag>Pra</b:Tag>
+    <b:SourceType>DocumentFromInternetSite</b:SourceType>
+    <b:Guid>{226015A7-4FBE-4ED5-AF7C-7B863DE0F95C}</b:Guid>
+    <b:Title>towardsdatascience</b:Title>
+    <b:Author>
+      <b:Author>
+        <b:NameList>
+          <b:Person>
+            <b:Last>Gumpta</b:Last>
+            <b:First>Prashant</b:First>
+          </b:Person>
+        </b:NameList>
+      </b:Author>
+    </b:Author>
+    <b:URL>https://towardsdatascience.com/cross-validation-in-machine-learning-72924a69872f</b:URL>
+    <b:RefOrder>9</b:RefOrder>
+  </b:Source>
+  <b:Source>
+    <b:Tag>Epi14</b:Tag>
+    <b:SourceType>Report</b:SourceType>
+    <b:Guid>{0E0B3AB7-4E5C-4923-9395-322425B5F759}</b:Guid>
+    <b:Title>Regresión logística</b:Title>
+    <b:Year>2014</b:Year>
+    <b:Author>
+      <b:Author>
+        <b:Corporate>Epidat 4</b:Corporate>
+      </b:Author>
+    </b:Author>
+    <b:URL>https://www.sergas.es/Saude-publica/Documents/1898/Ayuda_Epidat4_Regresion_logistica_Octubre2014.pdf</b:URL>
+    <b:RefOrder>2</b:RefOrder>
+  </b:Source>
+  <b:Source>
+    <b:Tag>Hos00</b:Tag>
+    <b:SourceType>Book</b:SourceType>
+    <b:Guid>{32EEFC27-A3E2-43FF-B3A8-E04DD337BBEC}</b:Guid>
+    <b:Title>Applied logistic regression. 2nd Edition</b:Title>
+    <b:Year>2000</b:Year>
+    <b:Publisher>John Wiley &amp; Sons, Inc</b:Publisher>
+    <b:City>New York </b:City>
+    <b:Author>
+      <b:Author>
+        <b:NameList>
+          <b:Person>
+            <b:Last>Hosmer</b:Last>
+            <b:First>D.W.</b:First>
+            <b:Middle>and Lemeshow, S</b:Middle>
+          </b:Person>
+        </b:NameList>
+      </b:Author>
+    </b:Author>
+    <b:RefOrder>1</b:RefOrder>
+  </b:Source>
+  <b:Source>
+    <b:Tag>Ava</b:Tag>
+    <b:SourceType>InternetSite</b:SourceType>
+    <b:Guid>{9F092E07-0C94-4BAB-9726-65215D4DADC6}</b:Guid>
+    <b:Author>
+      <b:Author>
+        <b:Corporate>Avaus</b:Corporate>
+      </b:Author>
+    </b:Author>
+    <b:URL>https://www.avaus.com/blog/predicting-customer-churn/</b:URL>
+    <b:RefOrder>10</b:RefOrder>
+  </b:Source>
+  <b:Source>
+    <b:Tag>Dun07</b:Tag>
+    <b:SourceType>Report</b:SourceType>
+    <b:Guid>{BA74171D-BD8C-4F0E-B5BD-A39B6A0C2228}</b:Guid>
+    <b:Title>A Practitioner's Guide to Generalized Linear Models.Third Edition</b:Title>
+    <b:Year>2007.</b:Year>
+    <b:Publisher>CAS</b:Publisher>
+    <b:Author>
+      <b:Author>
+        <b:NameList>
+          <b:Person>
+            <b:Last>Duncan Anderson</b:Last>
+            <b:First>FIA</b:First>
+            <b:Middle>Sholom Feldblum, FCAS Claudine Modlin, FCAS Doris Schirmacher, FCAS Ernesto Schirmacher, ASA Neeza Thandi, FCAS.</b:Middle>
+          </b:Person>
+        </b:NameList>
+      </b:Author>
+    </b:Author>
+    <b:RefOrder>11</b:RefOrder>
+  </b:Source>
+  <b:Source>
+    <b:Tag>Wik</b:Tag>
+    <b:SourceType>InternetSite</b:SourceType>
+    <b:Guid>{E3B66483-AE02-4F3C-93A1-551148ACB6BB}</b:Guid>
+    <b:Title>Wikipedia</b:Title>
+    <b:URL>https://commons.wikimedia.org/wiki/File:Overfitting.svg</b:URL>
+    <b:RefOrder>8</b:RefOrder>
+  </b:Source>
+  <b:Source>
+    <b:Tag>Kas18</b:Tag>
+    <b:SourceType>ElectronicSource</b:SourceType>
+    <b:Guid>{3A04B21C-F90D-4D56-B486-10CF3901B4A2}</b:Guid>
+    <b:Title>Penalized Logistic Regression Essentials in R: Ridge, Lasso and Elastic Net</b:Title>
+    <b:Year>2018</b:Year>
+    <b:Month>marzo</b:Month>
+    <b:Day>11</b:Day>
+    <b:URL>http://www.sthda.com/english/articles/36-classification-methods-essentials/149-penalized-logistic-regression-essentials-in-r-ridge-lasso-and-elastic-net/</b:URL>
+    <b:Author>
+      <b:Author>
+        <b:NameList>
+          <b:Person>
+            <b:Last>Kassambara</b:Last>
+          </b:Person>
+        </b:NameList>
+      </b:Author>
+    </b:Author>
+    <b:RefOrder>12</b:RefOrder>
+  </b:Source>
+  <b:Source>
+    <b:Tag>Rob</b:Tag>
+    <b:SourceType>Book</b:SourceType>
+    <b:Guid>{ADB0DA63-767E-4812-8EA8-288886FD991A}</b:Guid>
+    <b:Title>Boosting. Foundations and Algorithms</b:Title>
+    <b:City>Cambridge</b:City>
+    <b:Author>
+      <b:Author>
+        <b:NameList>
+          <b:Person>
+            <b:Last>Freund</b:Last>
+            <b:First>Robert</b:First>
+            <b:Middle>E. Schapire. Yoav</b:Middle>
+          </b:Person>
+        </b:NameList>
+      </b:Author>
+    </b:Author>
+    <b:Publisher>The MIT Press</b:Publisher>
+    <b:RefOrder>7</b:RefOrder>
+  </b:Source>
+  <b:Source>
+    <b:Tag>Dep</b:Tag>
+    <b:SourceType>Misc</b:SourceType>
+    <b:Guid>{447F143E-33A8-4A1F-AF70-D2136B3F0C25}</b:Guid>
+    <b:Author>
+      <b:Author>
+        <b:Corporate>Departamento de Matemáticas, Facultad de exactas, Universidad de Buenos Aires</b:Corporate>
+      </b:Author>
+    </b:Author>
+    <b:URL>http://www.dm.uba.ar/materias/modelos_lineales_generalizados_Mae/2005/1/glm5.pdf</b:URL>
+    <b:Title>Modelos Lineales Generalizados</b:Title>
+    <b:Year>2005</b:Year>
+    <b:RefOrder>3</b:RefOrder>
+  </b:Source>
+  <b:Source>
+    <b:Tag>Joa20</b:Tag>
+    <b:SourceType>DocumentFromInternetSite</b:SourceType>
+    <b:Guid>{96EEE33E-9EBD-4366-8F70-35F3695D41AA}</b:Guid>
+    <b:Author>
+      <b:Author>
+        <b:NameList>
+          <b:Person>
+            <b:Last>Rodrigo Amat</b:Last>
+            <b:First>Joaquín</b:First>
+          </b:Person>
+        </b:NameList>
+      </b:Author>
+    </b:Author>
+    <b:Year>2020</b:Year>
+    <b:Month>Abril</b:Month>
+    <b:URL>https://www.cienciadedatos.net/documentos/62_optimizacion_bayesiana_hiperparametros.html</b:URL>
+    <b:RefOrder>6</b:RefOrder>
+  </b:Source>
+  <b:Source>
+    <b:Tag>Jav21</b:Tag>
+    <b:SourceType>Book</b:SourceType>
+    <b:Guid>{D4BD5DF1-D47D-4BD7-9386-54004396EEFE}</b:Guid>
+    <b:Author>
+      <b:Author>
+        <b:NameList>
+          <b:Person>
+            <b:Last>Morales</b:Last>
+            <b:First>Javier</b:First>
+          </b:Person>
+        </b:NameList>
+      </b:Author>
+    </b:Author>
+    <b:Title>Modelos Estadísticos</b:Title>
+    <b:Year>2021</b:Year>
+    <b:Publisher>Universidad Miguel Hernández de Elche</b:Publisher>
+    <b:RefOrder>4</b:RefOrder>
+  </b:Source>
+</b:Sources>
 </file>
 
 <file path=customXml/item2.xml><?xml version="1.0" encoding="utf-8"?>
+<?mso-contentType ?>
+<FormTemplates xmlns="http://schemas.microsoft.com/sharepoint/v3/contenttype/forms">
+  <Display>DocumentLibraryForm</Display>
+  <Edit>DocumentLibraryForm</Edit>
+  <New>DocumentLibraryForm</New>
+</FormTemplates>
+</file>
+
+<file path=customXml/item3.xml><?xml version="1.0" encoding="utf-8"?>
 <ct:contentTypeSchema xmlns:ct="http://schemas.microsoft.com/office/2006/metadata/contentType" xmlns:ma="http://schemas.microsoft.com/office/2006/metadata/properties/metaAttributes" ct:_="" ma:_="" ma:contentTypeName="Document" ma:contentTypeID="0x010100A2306A7D4FC0A54D89FD687522C675B8" ma:contentTypeVersion="12" ma:contentTypeDescription="Create a new document." ma:contentTypeScope="" ma:versionID="9e799f54800fb4dd8879fdd4c9c24940">
   <xsd:schema xmlns:xsd="http://www.w3.org/2001/XMLSchema" xmlns:xs="http://www.w3.org/2001/XMLSchema" xmlns:p="http://schemas.microsoft.com/office/2006/metadata/properties" xmlns:ns3="4071d13c-3c62-4ad7-98d1-61fd6f431151" xmlns:ns4="20657b50-6615-4985-8441-013a3e6b4e33" targetNamespace="http://schemas.microsoft.com/office/2006/metadata/properties" ma:root="true" ma:fieldsID="1a060815c53d84784b10735a3ae40da9" ns3:_="" ns4:_="">
     <xsd:import namespace="4071d13c-3c62-4ad7-98d1-61fd6f431151"/>
@@ -30421,236 +31282,29 @@
 </ct:contentTypeSchema>
 </file>
 
-<file path=customXml/item3.xml><?xml version="1.0" encoding="utf-8"?>
-<?mso-contentType ?>
-<FormTemplates xmlns="http://schemas.microsoft.com/sharepoint/v3/contenttype/forms">
-  <Display>DocumentLibraryForm</Display>
-  <Edit>DocumentLibraryForm</Edit>
-  <New>DocumentLibraryForm</New>
-</FormTemplates>
-</file>
-
 <file path=customXml/item4.xml><?xml version="1.0" encoding="utf-8"?>
-<b:Sources xmlns:b="http://schemas.openxmlformats.org/officeDocument/2006/bibliography" xmlns="http://schemas.openxmlformats.org/officeDocument/2006/bibliography" SelectedStyle="\APASixthEditionOfficeOnline.xsl" StyleName="APA" Version="6">
-  <b:Source>
-    <b:Tag>Bre94</b:Tag>
-    <b:SourceType>Misc</b:SourceType>
-    <b:Guid>{CE0F26A3-CCBE-4E7C-8316-F9DF384D77E8}</b:Guid>
-    <b:Title>Bagging Predictors</b:Title>
-    <b:Year>1994</b:Year>
-    <b:Publisher>University of California</b:Publisher>
-    <b:Month>Septiembre</b:Month>
-    <b:Author>
-      <b:Author>
-        <b:NameList>
-          <b:Person>
-            <b:Last>Breiman</b:Last>
-            <b:First>Leo </b:First>
-          </b:Person>
-        </b:NameList>
-      </b:Author>
-    </b:Author>
-    <b:URL>https://www.stat.berkeley.edu/~breiman/bagging.pdf</b:URL>
-    <b:RefOrder>5</b:RefOrder>
-  </b:Source>
-  <b:Source>
-    <b:Tag>Pra</b:Tag>
-    <b:SourceType>DocumentFromInternetSite</b:SourceType>
-    <b:Guid>{226015A7-4FBE-4ED5-AF7C-7B863DE0F95C}</b:Guid>
-    <b:Title>towardsdatascience</b:Title>
-    <b:Author>
-      <b:Author>
-        <b:NameList>
-          <b:Person>
-            <b:Last>Gumpta</b:Last>
-            <b:First>Prashant</b:First>
-          </b:Person>
-        </b:NameList>
-      </b:Author>
-    </b:Author>
-    <b:URL>https://towardsdatascience.com/cross-validation-in-machine-learning-72924a69872f</b:URL>
-    <b:RefOrder>9</b:RefOrder>
-  </b:Source>
-  <b:Source>
-    <b:Tag>Epi14</b:Tag>
-    <b:SourceType>Report</b:SourceType>
-    <b:Guid>{0E0B3AB7-4E5C-4923-9395-322425B5F759}</b:Guid>
-    <b:Title>Regresión logística</b:Title>
-    <b:Year>2014</b:Year>
-    <b:Author>
-      <b:Author>
-        <b:Corporate>Epidat 4</b:Corporate>
-      </b:Author>
-    </b:Author>
-    <b:URL>https://www.sergas.es/Saude-publica/Documents/1898/Ayuda_Epidat4_Regresion_logistica_Octubre2014.pdf</b:URL>
-    <b:RefOrder>2</b:RefOrder>
-  </b:Source>
-  <b:Source>
-    <b:Tag>Hos00</b:Tag>
-    <b:SourceType>Book</b:SourceType>
-    <b:Guid>{32EEFC27-A3E2-43FF-B3A8-E04DD337BBEC}</b:Guid>
-    <b:Title>Applied logistic regression. 2nd Edition</b:Title>
-    <b:Year>2000</b:Year>
-    <b:Publisher>John Wiley &amp; Sons, Inc</b:Publisher>
-    <b:City>New York </b:City>
-    <b:Author>
-      <b:Author>
-        <b:NameList>
-          <b:Person>
-            <b:Last>Hosmer</b:Last>
-            <b:First>D.W.</b:First>
-            <b:Middle>and Lemeshow, S</b:Middle>
-          </b:Person>
-        </b:NameList>
-      </b:Author>
-    </b:Author>
-    <b:RefOrder>1</b:RefOrder>
-  </b:Source>
-  <b:Source>
-    <b:Tag>Ava</b:Tag>
-    <b:SourceType>InternetSite</b:SourceType>
-    <b:Guid>{9F092E07-0C94-4BAB-9726-65215D4DADC6}</b:Guid>
-    <b:Author>
-      <b:Author>
-        <b:Corporate>Avaus</b:Corporate>
-      </b:Author>
-    </b:Author>
-    <b:URL>https://www.avaus.com/blog/predicting-customer-churn/</b:URL>
-    <b:RefOrder>10</b:RefOrder>
-  </b:Source>
-  <b:Source>
-    <b:Tag>Dun07</b:Tag>
-    <b:SourceType>Report</b:SourceType>
-    <b:Guid>{BA74171D-BD8C-4F0E-B5BD-A39B6A0C2228}</b:Guid>
-    <b:Title>A Practitioner's Guide to Generalized Linear Models.Third Edition</b:Title>
-    <b:Year>2007.</b:Year>
-    <b:Publisher>CAS</b:Publisher>
-    <b:Author>
-      <b:Author>
-        <b:NameList>
-          <b:Person>
-            <b:Last>Duncan Anderson</b:Last>
-            <b:First>FIA</b:First>
-            <b:Middle>Sholom Feldblum, FCAS Claudine Modlin, FCAS Doris Schirmacher, FCAS Ernesto Schirmacher, ASA Neeza Thandi, FCAS.</b:Middle>
-          </b:Person>
-        </b:NameList>
-      </b:Author>
-    </b:Author>
-    <b:RefOrder>11</b:RefOrder>
-  </b:Source>
-  <b:Source>
-    <b:Tag>Wik</b:Tag>
-    <b:SourceType>InternetSite</b:SourceType>
-    <b:Guid>{E3B66483-AE02-4F3C-93A1-551148ACB6BB}</b:Guid>
-    <b:Title>Wikipedia</b:Title>
-    <b:URL>https://commons.wikimedia.org/wiki/File:Overfitting.svg</b:URL>
-    <b:RefOrder>8</b:RefOrder>
-  </b:Source>
-  <b:Source>
-    <b:Tag>Kas18</b:Tag>
-    <b:SourceType>ElectronicSource</b:SourceType>
-    <b:Guid>{3A04B21C-F90D-4D56-B486-10CF3901B4A2}</b:Guid>
-    <b:Title>Penalized Logistic Regression Essentials in R: Ridge, Lasso and Elastic Net</b:Title>
-    <b:Year>2018</b:Year>
-    <b:Month>marzo</b:Month>
-    <b:Day>11</b:Day>
-    <b:URL>http://www.sthda.com/english/articles/36-classification-methods-essentials/149-penalized-logistic-regression-essentials-in-r-ridge-lasso-and-elastic-net/</b:URL>
-    <b:Author>
-      <b:Author>
-        <b:NameList>
-          <b:Person>
-            <b:Last>Kassambara</b:Last>
-          </b:Person>
-        </b:NameList>
-      </b:Author>
-    </b:Author>
-    <b:RefOrder>12</b:RefOrder>
-  </b:Source>
-  <b:Source>
-    <b:Tag>Rob</b:Tag>
-    <b:SourceType>Book</b:SourceType>
-    <b:Guid>{ADB0DA63-767E-4812-8EA8-288886FD991A}</b:Guid>
-    <b:Title>Boosting. Foundations and Algorithms</b:Title>
-    <b:City>Cambridge</b:City>
-    <b:Author>
-      <b:Author>
-        <b:NameList>
-          <b:Person>
-            <b:Last>Freund</b:Last>
-            <b:First>Robert</b:First>
-            <b:Middle>E. Schapire. Yoav</b:Middle>
-          </b:Person>
-        </b:NameList>
-      </b:Author>
-    </b:Author>
-    <b:Publisher>The MIT Press</b:Publisher>
-    <b:RefOrder>7</b:RefOrder>
-  </b:Source>
-  <b:Source>
-    <b:Tag>Dep</b:Tag>
-    <b:SourceType>Misc</b:SourceType>
-    <b:Guid>{447F143E-33A8-4A1F-AF70-D2136B3F0C25}</b:Guid>
-    <b:Author>
-      <b:Author>
-        <b:Corporate>Departamento de Matemáticas, Facultad de exactas, Universidad de Buenos Aires</b:Corporate>
-      </b:Author>
-    </b:Author>
-    <b:URL>http://www.dm.uba.ar/materias/modelos_lineales_generalizados_Mae/2005/1/glm5.pdf</b:URL>
-    <b:Title>Modelos Lineales Generalizados</b:Title>
-    <b:Year>2005</b:Year>
-    <b:RefOrder>3</b:RefOrder>
-  </b:Source>
-  <b:Source>
-    <b:Tag>Joa20</b:Tag>
-    <b:SourceType>DocumentFromInternetSite</b:SourceType>
-    <b:Guid>{96EEE33E-9EBD-4366-8F70-35F3695D41AA}</b:Guid>
-    <b:Author>
-      <b:Author>
-        <b:NameList>
-          <b:Person>
-            <b:Last>Rodrigo Amat</b:Last>
-            <b:First>Joaquín</b:First>
-          </b:Person>
-        </b:NameList>
-      </b:Author>
-    </b:Author>
-    <b:Year>2020</b:Year>
-    <b:Month>Abril</b:Month>
-    <b:URL>https://www.cienciadedatos.net/documentos/62_optimizacion_bayesiana_hiperparametros.html</b:URL>
-    <b:RefOrder>6</b:RefOrder>
-  </b:Source>
-  <b:Source>
-    <b:Tag>Jav21</b:Tag>
-    <b:SourceType>Book</b:SourceType>
-    <b:Guid>{D4BD5DF1-D47D-4BD7-9386-54004396EEFE}</b:Guid>
-    <b:Author>
-      <b:Author>
-        <b:NameList>
-          <b:Person>
-            <b:Last>Morales</b:Last>
-            <b:First>Javier</b:First>
-          </b:Person>
-        </b:NameList>
-      </b:Author>
-    </b:Author>
-    <b:Title>Modelos Estadísticos</b:Title>
-    <b:Year>2021</b:Year>
-    <b:Publisher>Universidad Miguel Hernández de Elche</b:Publisher>
-    <b:RefOrder>4</b:RefOrder>
-  </b:Source>
-</b:Sources>
+<p:properties xmlns:p="http://schemas.microsoft.com/office/2006/metadata/properties" xmlns:xsi="http://www.w3.org/2001/XMLSchema-instance" xmlns:pc="http://schemas.microsoft.com/office/infopath/2007/PartnerControls">
+  <documentManagement/>
+</p:properties>
 </file>
 
 <file path=customXml/itemProps1.xml><?xml version="1.0" encoding="utf-8"?>
-<ds:datastoreItem xmlns:ds="http://schemas.openxmlformats.org/officeDocument/2006/customXml" ds:itemID="{D0A4F509-FFBA-43E3-8DFA-035109D26F37}">
+<ds:datastoreItem xmlns:ds="http://schemas.openxmlformats.org/officeDocument/2006/customXml" ds:itemID="{E8B755DF-2A69-436B-93E7-63038DEEF5E9}">
   <ds:schemaRefs>
-    <ds:schemaRef ds:uri="http://schemas.microsoft.com/office/2006/metadata/properties"/>
-    <ds:schemaRef ds:uri="http://schemas.microsoft.com/office/infopath/2007/PartnerControls"/>
+    <ds:schemaRef ds:uri="http://schemas.openxmlformats.org/officeDocument/2006/bibliography"/>
   </ds:schemaRefs>
 </ds:datastoreItem>
 </file>
 
 <file path=customXml/itemProps2.xml><?xml version="1.0" encoding="utf-8"?>
+<ds:datastoreItem xmlns:ds="http://schemas.openxmlformats.org/officeDocument/2006/customXml" ds:itemID="{8B74864E-CF63-4F24-9CD8-35513C3E63B6}">
+  <ds:schemaRefs>
+    <ds:schemaRef ds:uri="http://schemas.microsoft.com/sharepoint/v3/contenttype/forms"/>
+  </ds:schemaRefs>
+</ds:datastoreItem>
+</file>
+
+<file path=customXml/itemProps3.xml><?xml version="1.0" encoding="utf-8"?>
 <ds:datastoreItem xmlns:ds="http://schemas.openxmlformats.org/officeDocument/2006/customXml" ds:itemID="{EF79E8D3-FC6E-4BFF-9553-6EB21C65B4FE}">
   <ds:schemaRefs>
     <ds:schemaRef ds:uri="http://schemas.microsoft.com/office/2006/metadata/contentType"/>
@@ -30669,18 +31323,11 @@
 </ds:datastoreItem>
 </file>
 
-<file path=customXml/itemProps3.xml><?xml version="1.0" encoding="utf-8"?>
-<ds:datastoreItem xmlns:ds="http://schemas.openxmlformats.org/officeDocument/2006/customXml" ds:itemID="{8B74864E-CF63-4F24-9CD8-35513C3E63B6}">
+<file path=customXml/itemProps4.xml><?xml version="1.0" encoding="utf-8"?>
+<ds:datastoreItem xmlns:ds="http://schemas.openxmlformats.org/officeDocument/2006/customXml" ds:itemID="{D0A4F509-FFBA-43E3-8DFA-035109D26F37}">
   <ds:schemaRefs>
-    <ds:schemaRef ds:uri="http://schemas.microsoft.com/sharepoint/v3/contenttype/forms"/>
-  </ds:schemaRefs>
-</ds:datastoreItem>
-</file>
-
-<file path=customXml/itemProps4.xml><?xml version="1.0" encoding="utf-8"?>
-<ds:datastoreItem xmlns:ds="http://schemas.openxmlformats.org/officeDocument/2006/customXml" ds:itemID="{E8B755DF-2A69-436B-93E7-63038DEEF5E9}">
-  <ds:schemaRefs>
-    <ds:schemaRef ds:uri="http://schemas.openxmlformats.org/officeDocument/2006/bibliography"/>
+    <ds:schemaRef ds:uri="http://schemas.microsoft.com/office/2006/metadata/properties"/>
+    <ds:schemaRef ds:uri="http://schemas.microsoft.com/office/infopath/2007/PartnerControls"/>
   </ds:schemaRefs>
 </ds:datastoreItem>
 </file>
</xml_diff>

<commit_message>
final tunning - left to update ARIMAs
</commit_message>
<xml_diff>
--- a/Docs/Tesina_de_grado_Franco_Olivero_v1.2.docx
+++ b/Docs/Tesina_de_grado_Franco_Olivero_v1.2.docx
@@ -34,7 +34,7 @@
           <w:lang w:val="en-US"/>
         </w:rPr>
         <w:drawing>
-          <wp:inline distT="0" distB="0" distL="0" distR="0" wp14:anchorId="018FE07F" wp14:editId="4FDC1E02">
+          <wp:inline distT="0" distB="0" distL="0" distR="0" wp14:anchorId="018FE07F" wp14:editId="6E6C8ECE">
             <wp:extent cx="1673352" cy="1481328"/>
             <wp:effectExtent l="0" t="0" r="3175" b="5080"/>
             <wp:docPr id="1" name="image2.jpg" descr="http://www.econ.uba.ar/www/institutos/epistemologia/fsdf.jpg"/>
@@ -12926,7 +12926,13 @@
         </m:r>
       </m:oMath>
       <w:r>
-        <w:t xml:space="preserve"> para obtener una solución única de los parámetros. </w:t>
+        <w:t xml:space="preserve"> para obtener una solución única de los parámetros</w:t>
+      </w:r>
+      <w:r>
+        <w:t>. Estas restricciones “normalizan” los parámetros</w:t>
+      </w:r>
+      <w:r>
+        <w:t xml:space="preserve">. </w:t>
       </w:r>
       <w:r>
         <w:t xml:space="preserve"> Luego, e</w:t>
@@ -13328,7 +13334,13 @@
         <w:t xml:space="preserve">. En general, </w:t>
       </w:r>
       <w:r>
-        <w:t>en la práctica este modelo se suele corresponder con un ARIMA</w:t>
+        <w:t xml:space="preserve">en la práctica este modelo se suele corresponder con un </w:t>
+      </w:r>
+      <w:r>
+        <w:t xml:space="preserve">modelo </w:t>
+      </w:r>
+      <w:r>
+        <w:t>ARIMA</w:t>
       </w:r>
       <w:r>
         <w:t>(</w:t>
@@ -13340,7 +13352,19 @@
         <w:t xml:space="preserve">,1,0), </w:t>
       </w:r>
       <w:r>
-        <w:t>conocido como un modelo de camino aleatorio con tendencia constante. Este enfoque implica que el nivel de mortalidad (</w:t>
+        <w:t xml:space="preserve">conocido como un modelo de camino aleatorio </w:t>
+      </w:r>
+      <w:r>
+        <w:t xml:space="preserve">al cual se le suma una </w:t>
+      </w:r>
+      <w:r>
+        <w:t>constante</w:t>
+      </w:r>
+      <w:r>
+        <w:t xml:space="preserve"> que representa la </w:t>
+      </w:r>
+      <w:r>
+        <w:t>tendencia. Este enfoque implica que el nivel de mortalidad (</w:t>
       </w:r>
       <m:oMath>
         <m:sSub>
@@ -13479,7 +13503,6 @@
       </w:pPr>
       <w:bookmarkStart w:id="22" w:name="_Toc213252080"/>
       <w:r>
-        <w:lastRenderedPageBreak/>
         <w:t>Aprendizaje Automático</w:t>
       </w:r>
       <w:bookmarkEnd w:id="22"/>
@@ -13669,17 +13692,14 @@
         <w:t xml:space="preserve">y una variable </w:t>
       </w:r>
       <w:r>
+        <w:lastRenderedPageBreak/>
         <w:t>objetivo observable</w:t>
       </w:r>
       <w:r>
         <w:t xml:space="preserve">. </w:t>
       </w:r>
       <w:r>
-        <w:t xml:space="preserve">A continuación, se describen los algoritmos principales a tratar, y </w:t>
-      </w:r>
-      <w:r>
-        <w:lastRenderedPageBreak/>
-        <w:t>algunas de las problemáticas en el desempeño de estos modelos junto con sus posibles soluciones.</w:t>
+        <w:t>A continuación, se describen los algoritmos principales a tratar, y algunas de las problemáticas en el desempeño de estos modelos junto con sus posibles soluciones.</w:t>
       </w:r>
     </w:p>
     <w:p>
@@ -13858,6 +13878,7 @@
         <w:rPr>
           <w:noProof/>
         </w:rPr>
+        <w:lastRenderedPageBreak/>
         <w:drawing>
           <wp:inline distT="0" distB="0" distL="0" distR="0" wp14:anchorId="2ABC59B3" wp14:editId="32F153D4">
             <wp:extent cx="2059816" cy="2035834"/>
@@ -14104,6 +14125,7 @@
           <w:noProof/>
           <w:lang w:val="en-US"/>
         </w:rPr>
+        <w:lastRenderedPageBreak/>
         <w:drawing>
           <wp:inline distT="0" distB="0" distL="0" distR="0" wp14:anchorId="622DBA1C" wp14:editId="0DEC7B38">
             <wp:extent cx="2939810" cy="2498978"/>
@@ -14197,7 +14219,6 @@
         </w:numPr>
       </w:pPr>
       <w:r>
-        <w:lastRenderedPageBreak/>
         <w:t>max_depth: Define la profundidad máxima del árbol de decisión. Controla la complejidad del modelo y previene el sobreajuste. Permite capturar relaciones moderadamente no lineales sin perder capacidad de generalización.</w:t>
       </w:r>
     </w:p>
@@ -18407,7 +18428,19 @@
         <w:rPr>
           <w:rFonts w:eastAsiaTheme="majorEastAsia"/>
         </w:rPr>
-        <w:t>Si se usa el multiplicador estimado por aprendizaje automático junto con el modelo de LC se puede plantear:</w:t>
+        <w:t xml:space="preserve">Si se </w:t>
+      </w:r>
+      <w:r>
+        <w:rPr>
+          <w:rFonts w:eastAsiaTheme="majorEastAsia"/>
+        </w:rPr>
+        <w:t xml:space="preserve">combina </w:t>
+      </w:r>
+      <w:r>
+        <w:rPr>
+          <w:rFonts w:eastAsiaTheme="majorEastAsia"/>
+        </w:rPr>
+        <w:t>el multiplicador estimado por aprendizaje automático junto con el modelo de LC se puede plantear:</w:t>
       </w:r>
     </w:p>
     <w:p>
@@ -19848,6 +19881,246 @@
     <w:p>
       <w:pPr>
         <w:rPr>
+          <w:rFonts w:eastAsiaTheme="majorEastAsia"/>
+        </w:rPr>
+      </w:pPr>
+      <w:r>
+        <w:rPr>
+          <w:rFonts w:eastAsiaTheme="majorEastAsia"/>
+        </w:rPr>
+        <w:t>L</w:t>
+      </w:r>
+      <w:r>
+        <w:rPr>
+          <w:rFonts w:eastAsiaTheme="majorEastAsia"/>
+        </w:rPr>
+        <w:t xml:space="preserve">os parámetros </w:t>
+      </w:r>
+      <m:oMath>
+        <m:sSubSup>
+          <m:sSubSupPr>
+            <m:ctrlPr>
+              <w:rPr>
+                <w:rFonts w:ascii="Cambria Math" w:hAnsi="Cambria Math"/>
+                <w:i/>
+                <w:sz w:val="20"/>
+                <w:szCs w:val="20"/>
+                <w:lang w:val="en-US"/>
+              </w:rPr>
+            </m:ctrlPr>
+          </m:sSubSupPr>
+          <m:e>
+            <m:acc>
+              <m:accPr>
+                <m:ctrlPr>
+                  <w:rPr>
+                    <w:rFonts w:ascii="Cambria Math" w:hAnsi="Cambria Math"/>
+                    <w:i/>
+                    <w:sz w:val="20"/>
+                    <w:szCs w:val="20"/>
+                    <w:lang w:val="en-US"/>
+                  </w:rPr>
+                </m:ctrlPr>
+              </m:accPr>
+              <m:e>
+                <m:r>
+                  <w:rPr>
+                    <w:rFonts w:ascii="Cambria Math" w:hAnsi="Cambria Math"/>
+                    <w:sz w:val="20"/>
+                    <w:szCs w:val="20"/>
+                    <w:lang w:val="en-US"/>
+                  </w:rPr>
+                  <m:t>a</m:t>
+                </m:r>
+              </m:e>
+            </m:acc>
+          </m:e>
+          <m:sub>
+            <m:r>
+              <w:rPr>
+                <w:rFonts w:ascii="Cambria Math" w:hAnsi="Cambria Math"/>
+                <w:sz w:val="20"/>
+                <w:szCs w:val="20"/>
+                <w:lang w:val="en-US"/>
+              </w:rPr>
+              <m:t>x</m:t>
+            </m:r>
+          </m:sub>
+          <m:sup>
+            <m:r>
+              <w:rPr>
+                <w:rFonts w:ascii="Cambria Math" w:eastAsiaTheme="majorEastAsia" w:hAnsi="Cambria Math"/>
+                <w:sz w:val="20"/>
+                <w:szCs w:val="20"/>
+                <w:lang w:val="en-US"/>
+              </w:rPr>
+              <m:t>ψ</m:t>
+            </m:r>
+          </m:sup>
+        </m:sSubSup>
+        <m:r>
+          <w:rPr>
+            <w:rFonts w:ascii="Cambria Math" w:hAnsi="Cambria Math"/>
+            <w:sz w:val="20"/>
+            <w:szCs w:val="20"/>
+          </w:rPr>
+          <m:t>,</m:t>
+        </m:r>
+        <m:sSubSup>
+          <m:sSubSupPr>
+            <m:ctrlPr>
+              <w:rPr>
+                <w:rFonts w:ascii="Cambria Math" w:hAnsi="Cambria Math"/>
+                <w:i/>
+                <w:sz w:val="20"/>
+                <w:szCs w:val="20"/>
+                <w:lang w:val="en-US"/>
+              </w:rPr>
+            </m:ctrlPr>
+          </m:sSubSupPr>
+          <m:e>
+            <m:acc>
+              <m:accPr>
+                <m:ctrlPr>
+                  <w:rPr>
+                    <w:rFonts w:ascii="Cambria Math" w:hAnsi="Cambria Math"/>
+                    <w:i/>
+                    <w:sz w:val="20"/>
+                    <w:szCs w:val="20"/>
+                    <w:lang w:val="en-US"/>
+                  </w:rPr>
+                </m:ctrlPr>
+              </m:accPr>
+              <m:e>
+                <m:r>
+                  <w:rPr>
+                    <w:rFonts w:ascii="Cambria Math" w:hAnsi="Cambria Math"/>
+                    <w:sz w:val="20"/>
+                    <w:szCs w:val="20"/>
+                    <w:lang w:val="en-US"/>
+                  </w:rPr>
+                  <m:t>b</m:t>
+                </m:r>
+              </m:e>
+            </m:acc>
+          </m:e>
+          <m:sub>
+            <m:r>
+              <w:rPr>
+                <w:rFonts w:ascii="Cambria Math" w:hAnsi="Cambria Math"/>
+                <w:sz w:val="20"/>
+                <w:szCs w:val="20"/>
+                <w:lang w:val="en-US"/>
+              </w:rPr>
+              <m:t>x</m:t>
+            </m:r>
+          </m:sub>
+          <m:sup>
+            <m:r>
+              <w:rPr>
+                <w:rFonts w:ascii="Cambria Math" w:eastAsiaTheme="majorEastAsia" w:hAnsi="Cambria Math"/>
+                <w:sz w:val="20"/>
+                <w:szCs w:val="20"/>
+                <w:lang w:val="en-US"/>
+              </w:rPr>
+              <m:t>ψ</m:t>
+            </m:r>
+          </m:sup>
+        </m:sSubSup>
+        <m:sSubSup>
+          <m:sSubSupPr>
+            <m:ctrlPr>
+              <w:rPr>
+                <w:rFonts w:ascii="Cambria Math" w:hAnsi="Cambria Math"/>
+                <w:i/>
+                <w:sz w:val="20"/>
+                <w:szCs w:val="20"/>
+                <w:lang w:val="en-US"/>
+              </w:rPr>
+            </m:ctrlPr>
+          </m:sSubSupPr>
+          <m:e>
+            <m:r>
+              <w:rPr>
+                <w:rFonts w:ascii="Cambria Math" w:hAnsi="Cambria Math"/>
+                <w:sz w:val="20"/>
+                <w:szCs w:val="20"/>
+              </w:rPr>
+              <m:t xml:space="preserve"> y </m:t>
+            </m:r>
+            <m:acc>
+              <m:accPr>
+                <m:ctrlPr>
+                  <w:rPr>
+                    <w:rFonts w:ascii="Cambria Math" w:hAnsi="Cambria Math"/>
+                    <w:i/>
+                    <w:sz w:val="20"/>
+                    <w:szCs w:val="20"/>
+                    <w:lang w:val="en-US"/>
+                  </w:rPr>
+                </m:ctrlPr>
+              </m:accPr>
+              <m:e>
+                <m:r>
+                  <w:rPr>
+                    <w:rFonts w:ascii="Cambria Math" w:hAnsi="Cambria Math"/>
+                    <w:sz w:val="20"/>
+                    <w:szCs w:val="20"/>
+                    <w:lang w:val="en-US"/>
+                  </w:rPr>
+                  <m:t>k</m:t>
+                </m:r>
+              </m:e>
+            </m:acc>
+          </m:e>
+          <m:sub>
+            <m:r>
+              <w:rPr>
+                <w:rFonts w:ascii="Cambria Math" w:hAnsi="Cambria Math"/>
+                <w:sz w:val="20"/>
+                <w:szCs w:val="20"/>
+                <w:lang w:val="en-US"/>
+              </w:rPr>
+              <m:t>t</m:t>
+            </m:r>
+          </m:sub>
+          <m:sup>
+            <m:r>
+              <w:rPr>
+                <w:rFonts w:ascii="Cambria Math" w:eastAsiaTheme="majorEastAsia" w:hAnsi="Cambria Math"/>
+                <w:sz w:val="20"/>
+                <w:szCs w:val="20"/>
+                <w:lang w:val="en-US"/>
+              </w:rPr>
+              <m:t>ψ</m:t>
+            </m:r>
+          </m:sup>
+        </m:sSubSup>
+      </m:oMath>
+      <w:r>
+        <w:rPr>
+          <w:rFonts w:eastAsiaTheme="majorEastAsia"/>
+          <w:sz w:val="20"/>
+          <w:szCs w:val="20"/>
+        </w:rPr>
+        <w:t xml:space="preserve"> </w:t>
+      </w:r>
+      <w:r>
+        <w:rPr>
+          <w:rFonts w:eastAsiaTheme="majorEastAsia"/>
+        </w:rPr>
+        <w:t xml:space="preserve">se interpretan </w:t>
+      </w:r>
+      <w:r>
+        <w:rPr>
+          <w:rFonts w:eastAsiaTheme="majorEastAsia"/>
+        </w:rPr>
+        <w:t xml:space="preserve">de manera similar al modelo tradicional. </w:t>
+      </w:r>
+    </w:p>
+    <w:p>
+      <w:pPr>
+        <w:rPr>
           <w:rStyle w:val="Heading1Char"/>
         </w:rPr>
       </w:pPr>
@@ -19855,7 +20128,13 @@
         <w:rPr>
           <w:rFonts w:eastAsiaTheme="majorEastAsia"/>
         </w:rPr>
-        <w:t xml:space="preserve">De manera similar al modelo tradicional, los parámetros se interpretan de la misma manera y los factores </w:t>
+        <w:t>L</w:t>
+      </w:r>
+      <w:r>
+        <w:rPr>
+          <w:rFonts w:eastAsiaTheme="majorEastAsia"/>
+        </w:rPr>
+        <w:t xml:space="preserve">os factores </w:t>
       </w:r>
       <m:oMath>
         <m:sSubSup>
@@ -20082,19 +20361,22 @@
         <w:t>L</w:t>
       </w:r>
       <w:r>
-        <w:t>os datos utilizados corresponden a la población italiana para el período 1872–202</w:t>
+        <w:t xml:space="preserve">os datos utilizados corresponden a la población </w:t>
+      </w:r>
+      <w:r>
+        <w:t xml:space="preserve">de Italia </w:t>
+      </w:r>
+      <w:r>
+        <w:t>para el período 1872–202</w:t>
       </w:r>
       <w:r>
         <w:t>2</w:t>
       </w:r>
       <w:r>
-        <w:t>. Para cada observación se dispone de información sobre el género, la edad alcanzada, el año calendario de observación y, en consecuencia, el año de nacimiento.</w:t>
-      </w:r>
-      <w:r>
-        <w:t xml:space="preserve"> S</w:t>
-      </w:r>
-      <w:r>
-        <w:t>e incluye</w:t>
+        <w:t>. Para cada observación se dispone de información sobre el género, la edad alcanzada, el año calendario de observación y, en consecuencia, el año de nacimiento</w:t>
+      </w:r>
+      <w:r>
+        <w:t>, y</w:t>
       </w:r>
       <w:r>
         <w:t xml:space="preserve"> </w:t>
@@ -20150,14 +20432,86 @@
         <w:rPr>
           <w:rFonts w:eastAsiaTheme="majorEastAsia"/>
         </w:rPr>
-        <w:t xml:space="preserve">En relación con el tratamiento de los datos, la información original se dividió en dos conjuntos: un conjunto de entrenamiento, correspondiente al período [1906-2015], y un conjunto de validación, para el período [2016-2022]. Los años anteriores a 1906 se </w:t>
+        <w:t>En relación con el tratamiento de los datos, la información original se dividió en dos conjuntos</w:t>
+      </w:r>
+      <w:r>
+        <w:rPr>
+          <w:rFonts w:eastAsiaTheme="majorEastAsia"/>
+        </w:rPr>
+        <w:t xml:space="preserve"> principales</w:t>
+      </w:r>
+      <w:r>
+        <w:rPr>
+          <w:rFonts w:eastAsiaTheme="majorEastAsia"/>
+        </w:rPr>
+        <w:t>: un conjunto de entrenamiento, correspondiente al período [19</w:t>
+      </w:r>
+      <w:r>
+        <w:rPr>
+          <w:rFonts w:eastAsiaTheme="majorEastAsia"/>
+        </w:rPr>
+        <w:t>60</w:t>
+      </w:r>
+      <w:r>
+        <w:rPr>
+          <w:rFonts w:eastAsiaTheme="majorEastAsia"/>
+        </w:rPr>
+        <w:t>-20</w:t>
+      </w:r>
+      <w:r>
+        <w:rPr>
+          <w:rFonts w:eastAsiaTheme="majorEastAsia"/>
+        </w:rPr>
+        <w:t>10</w:t>
+      </w:r>
+      <w:r>
+        <w:rPr>
+          <w:rFonts w:eastAsiaTheme="majorEastAsia"/>
+        </w:rPr>
+        <w:t>], y un conjunto de validación, para el período [20</w:t>
+      </w:r>
+      <w:r>
+        <w:rPr>
+          <w:rFonts w:eastAsiaTheme="majorEastAsia"/>
+        </w:rPr>
+        <w:t>11</w:t>
+      </w:r>
+      <w:r>
+        <w:rPr>
+          <w:rFonts w:eastAsiaTheme="majorEastAsia"/>
+        </w:rPr>
+        <w:t>-20</w:t>
+      </w:r>
+      <w:r>
+        <w:rPr>
+          <w:rFonts w:eastAsiaTheme="majorEastAsia"/>
+        </w:rPr>
+        <w:t>19</w:t>
+      </w:r>
+      <w:r>
+        <w:rPr>
+          <w:rFonts w:eastAsiaTheme="majorEastAsia"/>
+        </w:rPr>
+        <w:t>]. Los años anteriores a 19</w:t>
+      </w:r>
+      <w:r>
+        <w:rPr>
+          <w:rFonts w:eastAsiaTheme="majorEastAsia"/>
+        </w:rPr>
+        <w:t>60</w:t>
+      </w:r>
+      <w:r>
+        <w:rPr>
+          <w:rFonts w:eastAsiaTheme="majorEastAsia"/>
+        </w:rPr>
+        <w:t xml:space="preserve"> se </w:t>
       </w:r>
       <w:commentRangeStart w:id="46"/>
       <w:r>
         <w:rPr>
           <w:rFonts w:eastAsiaTheme="majorEastAsia"/>
         </w:rPr>
-        <w:t>excluyeron del análisis debido a la baja calidad de los datos identificada en la documentación consultada.</w:t>
+        <w:t xml:space="preserve">excluyeron del análisis </w:t>
       </w:r>
       <w:commentRangeEnd w:id="46"/>
       <w:r>
@@ -20169,6 +20523,66 @@
         </w:rPr>
         <w:commentReference w:id="46"/>
       </w:r>
+      <w:r>
+        <w:rPr>
+          <w:rFonts w:eastAsiaTheme="majorEastAsia"/>
+        </w:rPr>
+        <w:t xml:space="preserve">para evitar distorsiones en las estimaciones debido a los períodos de guerra y postguerra. Por otro lado, los datos del año 2020 en adelante se excluyeron para evitar sesgos en los resultados debido a los períodos de pandemia por </w:t>
+      </w:r>
+      <w:r>
+        <w:rPr>
+          <w:rFonts w:eastAsiaTheme="majorEastAsia"/>
+        </w:rPr>
+        <w:t>COVID</w:t>
+      </w:r>
+      <w:r>
+        <w:rPr>
+          <w:rFonts w:eastAsiaTheme="majorEastAsia"/>
+        </w:rPr>
+        <w:t>. El tratamiento de estas cohortes requeriría ajustes fuera del alcance de esta tesina. Por último</w:t>
+      </w:r>
+      <w:r>
+        <w:rPr>
+          <w:rFonts w:eastAsiaTheme="majorEastAsia"/>
+        </w:rPr>
+        <w:t>, se observó que para la mayoría de las cohortes no existía información disponible para edades superiores a los 10</w:t>
+      </w:r>
+      <w:r>
+        <w:rPr>
+          <w:rFonts w:eastAsiaTheme="majorEastAsia"/>
+        </w:rPr>
+        <w:t>0</w:t>
+      </w:r>
+      <w:r>
+        <w:rPr>
+          <w:rFonts w:eastAsiaTheme="majorEastAsia"/>
+        </w:rPr>
+        <w:t xml:space="preserve"> años, por lo que se definió </w:t>
+      </w:r>
+      <w:r>
+        <w:rPr>
+          <w:rFonts w:eastAsiaTheme="majorEastAsia"/>
+        </w:rPr>
+        <w:t xml:space="preserve">este número como </w:t>
+      </w:r>
+      <w:r>
+        <w:rPr>
+          <w:rFonts w:eastAsiaTheme="majorEastAsia"/>
+        </w:rPr>
+        <w:t>un límite máximo de eda</w:t>
+      </w:r>
+      <w:r>
+        <w:rPr>
+          <w:rFonts w:eastAsiaTheme="majorEastAsia"/>
+        </w:rPr>
+        <w:t>d</w:t>
+      </w:r>
+      <w:r>
+        <w:rPr>
+          <w:rFonts w:eastAsiaTheme="majorEastAsia"/>
+        </w:rPr>
+        <w:t>.</w:t>
+      </w:r>
     </w:p>
     <w:p>
       <w:pPr>
@@ -20180,44 +20594,31 @@
         <w:rPr>
           <w:rFonts w:eastAsiaTheme="majorEastAsia"/>
         </w:rPr>
-        <w:t>Asimismo, se observó que para la mayoría de las cohortes no existía información disponible para edades superiores a los 10</w:t>
-      </w:r>
-      <w:r>
-        <w:rPr>
-          <w:rFonts w:eastAsiaTheme="majorEastAsia"/>
-        </w:rPr>
-        <w:t>0</w:t>
-      </w:r>
-      <w:r>
-        <w:rPr>
-          <w:rFonts w:eastAsiaTheme="majorEastAsia"/>
-        </w:rPr>
-        <w:t xml:space="preserve"> años, por lo que se definió un límite máximo de edad igual a 10</w:t>
-      </w:r>
-      <w:r>
-        <w:rPr>
-          <w:rFonts w:eastAsiaTheme="majorEastAsia"/>
-        </w:rPr>
-        <w:t>0</w:t>
-      </w:r>
-      <w:r>
-        <w:rPr>
-          <w:rFonts w:eastAsiaTheme="majorEastAsia"/>
-        </w:rPr>
-        <w:t xml:space="preserve"> años.</w:t>
-      </w:r>
-    </w:p>
-    <w:p>
-      <w:pPr>
-        <w:rPr>
-          <w:rFonts w:eastAsiaTheme="majorEastAsia"/>
-        </w:rPr>
-      </w:pPr>
-      <w:r>
-        <w:rPr>
-          <w:rFonts w:eastAsiaTheme="majorEastAsia"/>
-        </w:rPr>
-        <w:t xml:space="preserve">Con los datos de entrenamiento se estimaron los multiplicadores </w:t>
+        <w:t>Con los datos de entrenamiento</w:t>
+      </w:r>
+      <w:r>
+        <w:rPr>
+          <w:rFonts w:eastAsiaTheme="majorEastAsia"/>
+        </w:rPr>
+        <w:t xml:space="preserve">, se optimizaron los hiperparámetros de los algoritmos </w:t>
+      </w:r>
+      <w:r>
+        <w:rPr>
+          <w:rFonts w:eastAsiaTheme="majorEastAsia"/>
+        </w:rPr>
+        <w:t>Decision Tree, Random Forest y Gradient Boosting</w:t>
+      </w:r>
+      <w:r>
+        <w:rPr>
+          <w:rFonts w:eastAsiaTheme="majorEastAsia"/>
+        </w:rPr>
+        <w:t xml:space="preserve">. Luego </w:t>
+      </w:r>
+      <w:r>
+        <w:rPr>
+          <w:rFonts w:eastAsiaTheme="majorEastAsia"/>
+        </w:rPr>
+        <w:t xml:space="preserve">se estimaron los multiplicadores </w:t>
       </w:r>
       <w:r>
         <w:rPr>
@@ -20519,125 +20920,97 @@
         <w:rPr>
           <w:rFonts w:eastAsiaTheme="majorEastAsia"/>
         </w:rPr>
-        <w:t>correspondientes a los algoritmos</w:t>
-      </w:r>
-      <w:r>
-        <w:rPr>
-          <w:rFonts w:eastAsiaTheme="majorEastAsia"/>
-        </w:rPr>
-        <w:t>,</w:t>
-      </w:r>
-      <w:r>
-        <w:rPr>
-          <w:rFonts w:eastAsiaTheme="majorEastAsia"/>
-        </w:rPr>
         <w:t xml:space="preserve"> </w:t>
       </w:r>
       <w:r>
         <w:rPr>
           <w:rFonts w:eastAsiaTheme="majorEastAsia"/>
         </w:rPr>
-        <w:t>D</w:t>
-      </w:r>
-      <w:r>
-        <w:rPr>
-          <w:rFonts w:eastAsiaTheme="majorEastAsia"/>
-        </w:rPr>
-        <w:t xml:space="preserve">ecision </w:t>
-      </w:r>
-      <w:r>
-        <w:rPr>
-          <w:rFonts w:eastAsiaTheme="majorEastAsia"/>
-        </w:rPr>
-        <w:t>T</w:t>
-      </w:r>
-      <w:r>
-        <w:rPr>
-          <w:rFonts w:eastAsiaTheme="majorEastAsia"/>
-        </w:rPr>
-        <w:t xml:space="preserve">ree, </w:t>
-      </w:r>
-      <w:r>
-        <w:rPr>
-          <w:rFonts w:eastAsiaTheme="majorEastAsia"/>
-        </w:rPr>
-        <w:t>R</w:t>
-      </w:r>
-      <w:r>
-        <w:rPr>
-          <w:rFonts w:eastAsiaTheme="majorEastAsia"/>
-        </w:rPr>
-        <w:t xml:space="preserve">andom </w:t>
-      </w:r>
-      <w:r>
-        <w:rPr>
-          <w:rFonts w:eastAsiaTheme="majorEastAsia"/>
-        </w:rPr>
-        <w:t>F</w:t>
-      </w:r>
-      <w:r>
-        <w:rPr>
-          <w:rFonts w:eastAsiaTheme="majorEastAsia"/>
-        </w:rPr>
-        <w:t xml:space="preserve">orest y </w:t>
-      </w:r>
-      <w:r>
-        <w:rPr>
-          <w:rFonts w:eastAsiaTheme="majorEastAsia"/>
-        </w:rPr>
-        <w:t>G</w:t>
-      </w:r>
-      <w:r>
-        <w:rPr>
-          <w:rFonts w:eastAsiaTheme="majorEastAsia"/>
-        </w:rPr>
-        <w:t xml:space="preserve">radient </w:t>
-      </w:r>
-      <w:r>
-        <w:rPr>
-          <w:rFonts w:eastAsiaTheme="majorEastAsia"/>
-        </w:rPr>
-        <w:t>B</w:t>
-      </w:r>
-      <w:r>
-        <w:rPr>
-          <w:rFonts w:eastAsiaTheme="majorEastAsia"/>
-        </w:rPr>
-        <w:t>oosting</w:t>
-      </w:r>
-      <w:r>
-        <w:rPr>
-          <w:rFonts w:eastAsiaTheme="majorEastAsia"/>
-        </w:rPr>
-        <w:t>, respectivamente</w:t>
-      </w:r>
-      <w:r>
-        <w:rPr>
-          <w:rFonts w:eastAsiaTheme="majorEastAsia"/>
-        </w:rPr>
-        <w:t>.</w:t>
-      </w:r>
-      <w:r>
-        <w:rPr>
-          <w:rFonts w:eastAsiaTheme="majorEastAsia"/>
-        </w:rPr>
-        <w:t xml:space="preserve"> Los hiperparámetros se seleccionaron de forma arbitraria</w:t>
-      </w:r>
-      <w:r>
-        <w:rPr>
-          <w:rFonts w:eastAsiaTheme="majorEastAsia"/>
-        </w:rPr>
-        <w:t xml:space="preserve"> </w:t>
-      </w:r>
-      <w:r>
-        <w:rPr>
-          <w:rFonts w:eastAsiaTheme="majorEastAsia"/>
-        </w:rPr>
-        <w:t xml:space="preserve">dado que la dimensión del espacio de predictores y la cantidad de datos disponibles no justificaban una optimización exhaustiva. La configuración de cada algoritmo se describe a continuación: </w:t>
+        <w:t>de cada modelo</w:t>
+      </w:r>
+      <w:r>
+        <w:rPr>
+          <w:rFonts w:eastAsiaTheme="majorEastAsia"/>
+        </w:rPr>
+        <w:t xml:space="preserve">. </w:t>
       </w:r>
     </w:p>
     <w:p>
       <w:pPr>
+        <w:rPr>
+          <w:rFonts w:eastAsiaTheme="majorEastAsia"/>
+        </w:rPr>
+      </w:pPr>
+      <w:r>
+        <w:rPr>
+          <w:rFonts w:eastAsiaTheme="majorEastAsia"/>
+        </w:rPr>
+        <w:lastRenderedPageBreak/>
+        <w:t>L</w:t>
+      </w:r>
+      <w:r>
+        <w:rPr>
+          <w:rFonts w:eastAsiaTheme="majorEastAsia"/>
+        </w:rPr>
+        <w:t>a optimización de cada algoritmo</w:t>
+      </w:r>
+      <w:r>
+        <w:rPr>
+          <w:rFonts w:eastAsiaTheme="majorEastAsia"/>
+        </w:rPr>
+        <w:t xml:space="preserve"> se realizó mediante el método validación cruzada</w:t>
+      </w:r>
+      <w:r>
+        <w:rPr>
+          <w:rFonts w:eastAsiaTheme="majorEastAsia"/>
+        </w:rPr>
+        <w:t xml:space="preserve"> descripto en la sección </w:t>
+      </w:r>
+      <w:commentRangeStart w:id="47"/>
+      <w:r>
+        <w:rPr>
+          <w:rFonts w:eastAsiaTheme="majorEastAsia"/>
+        </w:rPr>
+        <w:t xml:space="preserve">XXXX </w:t>
+      </w:r>
+      <w:commentRangeEnd w:id="47"/>
+      <w:r>
+        <w:rPr>
+          <w:rStyle w:val="CommentReference"/>
+          <w:rFonts w:eastAsiaTheme="majorEastAsia"/>
+          <w:sz w:val="24"/>
+          <w:szCs w:val="24"/>
+        </w:rPr>
+        <w:commentReference w:id="47"/>
+      </w:r>
+      <w:r>
+        <w:rPr>
+          <w:rFonts w:eastAsiaTheme="majorEastAsia"/>
+        </w:rPr>
+        <w:t>utilizando las siguientes combinaciones posibles de hiperparámetros:</w:t>
+      </w:r>
+    </w:p>
+    <w:p>
+      <w:pPr>
+        <w:rPr>
+          <w:rFonts w:eastAsiaTheme="majorEastAsia"/>
+        </w:rPr>
+      </w:pPr>
+      <w:r>
+        <w:rPr>
+          <w:rFonts w:eastAsiaTheme="majorEastAsia"/>
+        </w:rPr>
+        <w:t>Como resultado, se obtuvieron las siguientes configuraciones:</w:t>
+      </w:r>
+      <w:r>
+        <w:rPr>
+          <w:rFonts w:eastAsiaTheme="majorEastAsia"/>
+        </w:rPr>
+        <w:t xml:space="preserve"> </w:t>
+      </w:r>
+    </w:p>
+    <w:p>
+      <w:pPr>
         <w:jc w:val="center"/>
         <w:rPr>
           <w:rFonts w:eastAsiaTheme="majorEastAsia"/>
@@ -20648,7 +21021,6 @@
           <w:rFonts w:eastAsiaTheme="majorEastAsia"/>
           <w:noProof/>
         </w:rPr>
-        <w:lastRenderedPageBreak/>
         <w:drawing>
           <wp:inline distT="0" distB="0" distL="0" distR="0" wp14:anchorId="7D514F0A" wp14:editId="55AF6E45">
             <wp:extent cx="3174365" cy="1837690"/>
@@ -20735,7 +21107,19 @@
         <w:rPr>
           <w:rFonts w:eastAsiaTheme="majorEastAsia"/>
         </w:rPr>
-        <w:t>por 30 años</w:t>
+        <w:t xml:space="preserve">por </w:t>
+      </w:r>
+      <w:r>
+        <w:rPr>
+          <w:rFonts w:eastAsiaTheme="majorEastAsia"/>
+        </w:rPr>
+        <w:t xml:space="preserve">54 </w:t>
+      </w:r>
+      <w:r>
+        <w:rPr>
+          <w:rFonts w:eastAsiaTheme="majorEastAsia"/>
+        </w:rPr>
+        <w:t>años</w:t>
       </w:r>
       <w:r>
         <w:rPr>
@@ -20753,7 +21137,13 @@
         <w:rPr>
           <w:rFonts w:eastAsiaTheme="majorEastAsia"/>
         </w:rPr>
-        <w:t>2016</w:t>
+        <w:t>20</w:t>
+      </w:r>
+      <w:r>
+        <w:rPr>
+          <w:rFonts w:eastAsiaTheme="majorEastAsia"/>
+        </w:rPr>
+        <w:t>11</w:t>
       </w:r>
       <w:r>
         <w:rPr>
@@ -20765,7 +21155,13 @@
         <w:rPr>
           <w:rFonts w:eastAsiaTheme="majorEastAsia"/>
         </w:rPr>
-        <w:t>45</w:t>
+        <w:t>6</w:t>
+      </w:r>
+      <w:r>
+        <w:rPr>
+          <w:rFonts w:eastAsiaTheme="majorEastAsia"/>
+        </w:rPr>
+        <w:t>5</w:t>
       </w:r>
       <w:r>
         <w:rPr>
@@ -20831,37 +21227,55 @@
         <w:rPr>
           <w:rFonts w:eastAsiaTheme="majorEastAsia"/>
         </w:rPr>
-        <w:t xml:space="preserve">Lee-Carter, se estimó </w:t>
-      </w:r>
-      <w:r>
-        <w:rPr>
-          <w:rFonts w:eastAsiaTheme="majorEastAsia"/>
-        </w:rPr>
-        <w:t xml:space="preserve">primero </w:t>
-      </w:r>
-      <w:r>
-        <w:rPr>
-          <w:rFonts w:eastAsiaTheme="majorEastAsia"/>
-        </w:rPr>
-        <w:t xml:space="preserve">la tendencia </w:t>
-      </w:r>
-      <w:r>
-        <w:rPr>
-          <w:rFonts w:eastAsiaTheme="majorEastAsia"/>
-        </w:rPr>
-        <w:t xml:space="preserve">temporal </w:t>
-      </w:r>
-      <w:r>
-        <w:rPr>
-          <w:rFonts w:eastAsiaTheme="majorEastAsia"/>
-        </w:rPr>
-        <w:t xml:space="preserve">general de </w:t>
-      </w:r>
-      <w:r>
-        <w:rPr>
-          <w:rFonts w:eastAsiaTheme="majorEastAsia"/>
-        </w:rPr>
-        <w:t xml:space="preserve">la </w:t>
+        <w:t xml:space="preserve">Lee-Carter, </w:t>
+      </w:r>
+      <w:r>
+        <w:rPr>
+          <w:rFonts w:eastAsiaTheme="majorEastAsia"/>
+        </w:rPr>
+        <w:t xml:space="preserve">primero se proyectaron las </w:t>
+      </w:r>
+      <w:r>
+        <w:rPr>
+          <w:rFonts w:eastAsiaTheme="majorEastAsia"/>
+        </w:rPr>
+        <w:t>tendencia</w:t>
+      </w:r>
+      <w:r>
+        <w:rPr>
+          <w:rFonts w:eastAsiaTheme="majorEastAsia"/>
+        </w:rPr>
+        <w:t>s</w:t>
+      </w:r>
+      <w:r>
+        <w:rPr>
+          <w:rFonts w:eastAsiaTheme="majorEastAsia"/>
+        </w:rPr>
+        <w:t xml:space="preserve"> </w:t>
+      </w:r>
+      <w:r>
+        <w:rPr>
+          <w:rFonts w:eastAsiaTheme="majorEastAsia"/>
+        </w:rPr>
+        <w:t>temporal</w:t>
+      </w:r>
+      <w:r>
+        <w:rPr>
+          <w:rFonts w:eastAsiaTheme="majorEastAsia"/>
+        </w:rPr>
+        <w:t>es</w:t>
+      </w:r>
+      <w:r>
+        <w:rPr>
+          <w:rFonts w:eastAsiaTheme="majorEastAsia"/>
+        </w:rPr>
+        <w:t xml:space="preserve"> </w:t>
+      </w:r>
+      <w:r>
+        <w:rPr>
+          <w:rFonts w:eastAsiaTheme="majorEastAsia"/>
+        </w:rPr>
+        <w:t xml:space="preserve">de </w:t>
       </w:r>
       <w:r>
         <w:rPr>
@@ -21001,15 +21415,15 @@
           <w:rFonts w:eastAsiaTheme="majorEastAsia"/>
         </w:rPr>
       </w:pPr>
-      <w:commentRangeStart w:id="47"/>
       <w:commentRangeStart w:id="48"/>
+      <w:commentRangeStart w:id="49"/>
       <w:r>
         <w:rPr>
           <w:rFonts w:eastAsiaTheme="majorEastAsia"/>
         </w:rPr>
         <w:t>Se obtuvieron los siguientes modelos ARIMA para cada modelo:</w:t>
       </w:r>
-      <w:commentRangeEnd w:id="47"/>
+      <w:commentRangeEnd w:id="48"/>
       <w:r>
         <w:rPr>
           <w:rStyle w:val="CommentReference"/>
@@ -21017,9 +21431,9 @@
           <w:sz w:val="24"/>
           <w:szCs w:val="24"/>
         </w:rPr>
-        <w:commentReference w:id="47"/>
-      </w:r>
-      <w:commentRangeEnd w:id="48"/>
+        <w:commentReference w:id="48"/>
+      </w:r>
+      <w:commentRangeEnd w:id="49"/>
       <w:r>
         <w:rPr>
           <w:rStyle w:val="CommentReference"/>
@@ -21027,7 +21441,7 @@
           <w:sz w:val="24"/>
           <w:szCs w:val="24"/>
         </w:rPr>
-        <w:commentReference w:id="48"/>
+        <w:commentReference w:id="49"/>
       </w:r>
     </w:p>
     <w:p>
@@ -21040,7 +21454,19 @@
         <w:rPr>
           <w:rFonts w:eastAsiaTheme="majorEastAsia"/>
         </w:rPr>
-        <w:t>La elección de los parámetros se realizó de forma arbitraria considerando los criterios estadísticos de información de Akaike y Bayesiano (AIC y BIC).</w:t>
+        <w:t>La elección de los parámetros se realizó de forma arbitraria</w:t>
+      </w:r>
+      <w:r>
+        <w:rPr>
+          <w:rFonts w:eastAsiaTheme="majorEastAsia"/>
+        </w:rPr>
+        <w:t>, priorizando la metodología propuesta por Lee-Carter. C</w:t>
+      </w:r>
+      <w:r>
+        <w:rPr>
+          <w:rFonts w:eastAsiaTheme="majorEastAsia"/>
+        </w:rPr>
+        <w:t>onsiderando los criterios estadísticos de información de Akaike y Bayesiano (AIC y BIC).</w:t>
       </w:r>
     </w:p>
     <w:p>
@@ -21085,14 +21511,14 @@
         </w:rPr>
         <w:t xml:space="preserve"> en la </w:t>
       </w:r>
-      <w:commentRangeStart w:id="49"/>
+      <w:commentRangeStart w:id="50"/>
       <w:r>
         <w:rPr>
           <w:rFonts w:eastAsiaTheme="majorEastAsia"/>
         </w:rPr>
         <w:t xml:space="preserve">sección </w:t>
       </w:r>
-      <w:commentRangeEnd w:id="49"/>
+      <w:commentRangeEnd w:id="50"/>
       <w:r>
         <w:rPr>
           <w:rStyle w:val="CommentReference"/>
@@ -21100,7 +21526,7 @@
           <w:sz w:val="24"/>
           <w:szCs w:val="24"/>
         </w:rPr>
-        <w:commentReference w:id="49"/>
+        <w:commentReference w:id="50"/>
       </w:r>
       <w:r>
         <w:rPr>
@@ -21207,11 +21633,11 @@
           <w:numId w:val="17"/>
         </w:numPr>
       </w:pPr>
-      <w:bookmarkStart w:id="50" w:name="_Toc213252095"/>
+      <w:bookmarkStart w:id="51" w:name="_Toc213252095"/>
       <w:r>
         <w:t>Herramientas estadísticas de validación</w:t>
       </w:r>
-      <w:bookmarkEnd w:id="50"/>
+      <w:bookmarkEnd w:id="51"/>
     </w:p>
     <w:p>
       <w:r>
@@ -21233,6 +21659,7 @@
         <w:rPr>
           <w:rFonts w:eastAsiaTheme="majorEastAsia"/>
         </w:rPr>
+        <w:lastRenderedPageBreak/>
         <w:t xml:space="preserve">El multiplicador de aprendizaje automático </w:t>
       </w:r>
       <m:oMath>
@@ -21328,14 +21755,14 @@
         </w:rPr>
         <w:t xml:space="preserve"> expuesto en la </w:t>
       </w:r>
-      <w:commentRangeStart w:id="51"/>
+      <w:commentRangeStart w:id="52"/>
       <w:r>
         <w:rPr>
           <w:rFonts w:eastAsiaTheme="majorEastAsia"/>
         </w:rPr>
         <w:t xml:space="preserve">sección 3.1 </w:t>
       </w:r>
-      <w:commentRangeEnd w:id="51"/>
+      <w:commentRangeEnd w:id="52"/>
       <w:r>
         <w:rPr>
           <w:rStyle w:val="CommentReference"/>
@@ -21343,7 +21770,7 @@
           <w:sz w:val="24"/>
           <w:szCs w:val="24"/>
         </w:rPr>
-        <w:commentReference w:id="51"/>
+        <w:commentReference w:id="52"/>
       </w:r>
       <w:r>
         <w:rPr>
@@ -21361,14 +21788,7 @@
         <w:rPr>
           <w:rFonts w:eastAsiaTheme="majorEastAsia"/>
         </w:rPr>
-        <w:t xml:space="preserve">. Su función principal es corregir residuos sistemáticos y capturar patrones no identificados por la estructura paramétrica del modelo tradicional de LC. La variación relativa en las tasas centrales de </w:t>
-      </w:r>
-      <w:r>
-        <w:rPr>
-          <w:rFonts w:eastAsiaTheme="majorEastAsia"/>
-        </w:rPr>
-        <w:lastRenderedPageBreak/>
-        <w:t>mortalidad que resulta del ajuste por aprendizaje automático se puede se expresar como:</w:t>
+        <w:t>. Su función principal es corregir residuos sistemáticos y capturar patrones no identificados por la estructura paramétrica del modelo tradicional de LC. La variación relativa en las tasas centrales de mortalidad que resulta del ajuste por aprendizaje automático se puede se expresar como:</w:t>
       </w:r>
     </w:p>
     <w:p>
@@ -22180,14 +22600,14 @@
         </w:rPr>
         <w:t>en términos relativos</w:t>
       </w:r>
-      <w:commentRangeStart w:id="52"/>
+      <w:commentRangeStart w:id="53"/>
       <w:r>
         <w:rPr>
           <w:rFonts w:eastAsiaTheme="majorEastAsia"/>
         </w:rPr>
         <w:t>:</w:t>
       </w:r>
-      <w:commentRangeEnd w:id="52"/>
+      <w:commentRangeEnd w:id="53"/>
       <w:r>
         <w:rPr>
           <w:rStyle w:val="CommentReference"/>
@@ -22195,7 +22615,7 @@
           <w:sz w:val="24"/>
           <w:szCs w:val="24"/>
         </w:rPr>
-        <w:commentReference w:id="52"/>
+        <w:commentReference w:id="53"/>
       </w:r>
     </w:p>
     <w:p>
@@ -22694,7 +23114,19 @@
         <w:rPr>
           <w:rFonts w:eastAsiaTheme="majorEastAsia"/>
         </w:rPr>
-        <w:t>Por otro lado, la raíz del error cuadrático medio (RMSE) mide la precisión de las predicciones al cuantificar la distancia promedio entre los valores observados y los estimados por el modelo. Se calcula como la raíz cuadrada del promedio de los errores al cuadrado, expresándose en las mismas unidades que la variable que se busca estimar.</w:t>
+        <w:t xml:space="preserve">Por otro lado, la raíz del error cuadrático medio (RMSE) mide la precisión de las predicciones al cuantificar la distancia promedio entre los valores observados y los estimados por el modelo. Se calcula como la raíz cuadrada del promedio de los errores </w:t>
+      </w:r>
+      <w:r>
+        <w:rPr>
+          <w:rFonts w:eastAsiaTheme="majorEastAsia"/>
+        </w:rPr>
+        <w:t xml:space="preserve">cuadrados. Esta métrica se expresa </w:t>
+      </w:r>
+      <w:r>
+        <w:rPr>
+          <w:rFonts w:eastAsiaTheme="majorEastAsia"/>
+        </w:rPr>
+        <w:t>en las mismas unidades que la variable que se busca estimar.</w:t>
       </w:r>
       <w:r>
         <w:rPr>
@@ -22706,16 +23138,28 @@
         <w:rPr>
           <w:rFonts w:eastAsiaTheme="majorEastAsia"/>
         </w:rPr>
-        <w:t xml:space="preserve">Un valor bajo de RMSE indica un mejor ajuste, ya que los residuos están, en promedio, más próximos a cero. Esta métrica permite evaluar directamente qué tan cerca están las predicciones de los valores reales, siendo una medida de precisión más que de </w:t>
-      </w:r>
-      <w:commentRangeStart w:id="53"/>
+        <w:t>Un valor bajo de RMSE indica un mejor ajuste, ya que los residuos están, en promedio, más próximos a cero</w:t>
+      </w:r>
+      <w:r>
+        <w:rPr>
+          <w:rFonts w:eastAsiaTheme="majorEastAsia"/>
+        </w:rPr>
+        <w:t xml:space="preserve">. Esto último </w:t>
+      </w:r>
+      <w:r>
+        <w:rPr>
+          <w:rFonts w:eastAsiaTheme="majorEastAsia"/>
+        </w:rPr>
+        <w:t xml:space="preserve">permite evaluar directamente qué tan cerca están las predicciones de los valores reales, siendo una medida de precisión más que de </w:t>
+      </w:r>
+      <w:commentRangeStart w:id="54"/>
       <w:r>
         <w:rPr>
           <w:rFonts w:eastAsiaTheme="majorEastAsia"/>
         </w:rPr>
         <w:t>correlación</w:t>
       </w:r>
-      <w:commentRangeEnd w:id="53"/>
+      <w:commentRangeEnd w:id="54"/>
       <w:r>
         <w:rPr>
           <w:rStyle w:val="CommentReference"/>
@@ -22723,7 +23167,7 @@
           <w:sz w:val="24"/>
           <w:szCs w:val="24"/>
         </w:rPr>
-        <w:commentReference w:id="53"/>
+        <w:commentReference w:id="54"/>
       </w:r>
       <w:r>
         <w:rPr>
@@ -22731,12 +23175,14 @@
         </w:rPr>
         <w:t>.</w:t>
       </w:r>
-      <w:r>
-        <w:rPr>
-          <w:rFonts w:eastAsiaTheme="majorEastAsia"/>
-        </w:rPr>
-        <w:footnoteReference w:id="2"/>
-      </w:r>
+    </w:p>
+    <w:p>
+      <w:pPr>
+        <w:pStyle w:val="ListParagraph"/>
+        <w:rPr>
+          <w:rFonts w:eastAsiaTheme="majorEastAsia"/>
+        </w:rPr>
+      </w:pPr>
     </w:p>
     <w:p>
       <w:pPr>
@@ -22774,6 +23220,7 @@
               <w:szCs w:val="20"/>
               <w:lang w:val="en-US"/>
             </w:rPr>
+            <w:lastRenderedPageBreak/>
             <m:t>RMSE</m:t>
           </m:r>
           <m:r>
@@ -23107,7 +23554,6 @@
               <w:szCs w:val="20"/>
               <w:lang w:val="en-US"/>
             </w:rPr>
-            <w:lastRenderedPageBreak/>
             <m:t>RMSLE</m:t>
           </m:r>
           <m:r>
@@ -23410,6 +23856,14 @@
           <w:rFonts w:eastAsiaTheme="majorEastAsia"/>
         </w:rPr>
       </w:pPr>
+    </w:p>
+    <w:p>
+      <w:pPr>
+        <w:pStyle w:val="ListParagraph"/>
+        <w:rPr>
+          <w:rFonts w:eastAsiaTheme="majorEastAsia"/>
+        </w:rPr>
+      </w:pPr>
       <w:r>
         <w:rPr>
           <w:rFonts w:eastAsiaTheme="majorEastAsia"/>
@@ -23420,46 +23874,31 @@
         <w:rPr>
           <w:rFonts w:eastAsiaTheme="majorEastAsia"/>
         </w:rPr>
-        <w:t xml:space="preserve">RMSE se basa en </w:t>
-      </w:r>
-      <m:oMath>
-        <m:sSub>
-          <m:sSubPr>
-            <m:ctrlPr>
-              <w:rPr>
-                <w:rFonts w:ascii="Cambria Math" w:eastAsiaTheme="majorEastAsia" w:hAnsi="Cambria Math"/>
-              </w:rPr>
-            </m:ctrlPr>
-          </m:sSubPr>
-          <m:e>
-            <m:r>
-              <w:rPr>
-                <w:rFonts w:ascii="Cambria Math" w:eastAsiaTheme="majorEastAsia" w:hAnsi="Cambria Math"/>
-              </w:rPr>
-              <m:t>m</m:t>
-            </m:r>
-          </m:e>
-          <m:sub>
-            <m:r>
-              <w:rPr>
-                <w:rFonts w:ascii="Cambria Math" w:eastAsiaTheme="majorEastAsia" w:hAnsi="Cambria Math"/>
-              </w:rPr>
-              <m:t>x</m:t>
-            </m:r>
-          </m:sub>
-        </m:sSub>
-      </m:oMath>
-      <w:r>
-        <w:rPr>
-          <w:rFonts w:eastAsiaTheme="majorEastAsia"/>
-        </w:rPr>
-        <w:t xml:space="preserve"> </w:t>
-      </w:r>
-      <w:r>
-        <w:rPr>
-          <w:rFonts w:eastAsiaTheme="majorEastAsia"/>
-        </w:rPr>
-        <w:t xml:space="preserve">y asigna un peso relativamente mayor a los errores en edades avanzadas, </w:t>
+        <w:t>RMS</w:t>
+      </w:r>
+      <w:r>
+        <w:rPr>
+          <w:rFonts w:eastAsiaTheme="majorEastAsia"/>
+        </w:rPr>
+        <w:t>L</w:t>
+      </w:r>
+      <w:r>
+        <w:rPr>
+          <w:rFonts w:eastAsiaTheme="majorEastAsia"/>
+        </w:rPr>
+        <w:t xml:space="preserve">E </w:t>
+      </w:r>
+      <w:r>
+        <w:rPr>
+          <w:rFonts w:eastAsiaTheme="majorEastAsia"/>
+        </w:rPr>
+        <w:t>a diferencia del RMSE,</w:t>
+      </w:r>
+      <w:r>
+        <w:rPr>
+          <w:rFonts w:eastAsiaTheme="majorEastAsia"/>
+        </w:rPr>
+        <w:t xml:space="preserve"> asigna un peso relativamente mayor a los errores en edades avanzadas, </w:t>
       </w:r>
       <w:r>
         <w:rPr>
@@ -23473,14 +23912,14 @@
         </w:rPr>
         <w:t xml:space="preserve">un peso relativamente mayor a los errores en edades </w:t>
       </w:r>
-      <w:commentRangeStart w:id="54"/>
+      <w:commentRangeStart w:id="55"/>
       <w:r>
         <w:rPr>
           <w:rFonts w:eastAsiaTheme="majorEastAsia"/>
         </w:rPr>
         <w:t>jóvenes.</w:t>
       </w:r>
-      <w:commentRangeEnd w:id="54"/>
+      <w:commentRangeEnd w:id="55"/>
       <w:r>
         <w:rPr>
           <w:rStyle w:val="CommentReference"/>
@@ -23488,7 +23927,7 @@
           <w:sz w:val="24"/>
           <w:szCs w:val="24"/>
         </w:rPr>
-        <w:commentReference w:id="54"/>
+        <w:commentReference w:id="55"/>
       </w:r>
     </w:p>
     <w:p>
@@ -23535,7 +23974,7 @@
           <w:rFonts w:eastAsiaTheme="majorEastAsia"/>
         </w:rPr>
       </w:pPr>
-      <w:bookmarkStart w:id="55" w:name="_Toc213252096"/>
+      <w:bookmarkStart w:id="56" w:name="_Toc213252096"/>
       <w:r>
         <w:rPr>
           <w:rFonts w:eastAsiaTheme="majorEastAsia"/>
@@ -23555,7 +23994,7 @@
         </w:rPr>
         <w:t>Ajuste a los Datos</w:t>
       </w:r>
-      <w:bookmarkEnd w:id="55"/>
+      <w:bookmarkEnd w:id="56"/>
     </w:p>
     <w:p>
       <w:pPr>
@@ -23680,14 +24119,14 @@
         </w:rPr>
         <w:t xml:space="preserve"> en la </w:t>
       </w:r>
-      <w:commentRangeStart w:id="56"/>
+      <w:commentRangeStart w:id="57"/>
       <w:r>
         <w:rPr>
           <w:rFonts w:eastAsiaTheme="majorEastAsia"/>
         </w:rPr>
         <w:t>sección 3.1</w:t>
       </w:r>
-      <w:commentRangeEnd w:id="56"/>
+      <w:commentRangeEnd w:id="57"/>
       <w:r>
         <w:rPr>
           <w:rStyle w:val="CommentReference"/>
@@ -23695,7 +24134,7 @@
           <w:sz w:val="24"/>
           <w:szCs w:val="24"/>
         </w:rPr>
-        <w:commentReference w:id="56"/>
+        <w:commentReference w:id="57"/>
       </w:r>
       <w:r>
         <w:rPr>
@@ -23744,7 +24183,19 @@
         <w:rPr>
           <w:rFonts w:eastAsiaTheme="majorEastAsia"/>
         </w:rPr>
-        <w:t>En otras palabras, se pueden ver los errores relativos del modelo junto con patrones de sub/sobre estimación de tasas de mortalidad para los distintos grupos de edades y cohortes observadas.</w:t>
+        <w:t xml:space="preserve">En otras palabras, se pueden ver los errores </w:t>
+      </w:r>
+      <w:r>
+        <w:rPr>
+          <w:rFonts w:eastAsiaTheme="majorEastAsia"/>
+        </w:rPr>
+        <w:t xml:space="preserve">de estimación </w:t>
+      </w:r>
+      <w:r>
+        <w:rPr>
+          <w:rFonts w:eastAsiaTheme="majorEastAsia"/>
+        </w:rPr>
+        <w:t>relativos del modelo junto con patrones de sub/sobre estimación de tasas de mortalidad para los distintos grupos de edades y cohortes observadas.</w:t>
       </w:r>
     </w:p>
     <w:p>
@@ -24066,7 +24517,7 @@
         </w:rPr>
         <w:lastRenderedPageBreak/>
         <w:drawing>
-          <wp:inline distT="0" distB="0" distL="0" distR="0" wp14:anchorId="0CDA70CF" wp14:editId="0274A49F">
+          <wp:inline distT="0" distB="0" distL="0" distR="0" wp14:anchorId="0CDA70CF" wp14:editId="647EC586">
             <wp:extent cx="5283100" cy="6623290"/>
             <wp:effectExtent l="19050" t="19050" r="13335" b="25400"/>
             <wp:docPr id="674080132" name="Picture 13" descr="A screenshot of a graph&#10;&#10;AI-generated content may be incorrect."/>
@@ -24126,7 +24577,7 @@
         </w:rPr>
         <w:t xml:space="preserve">Ilustración 4.3.1 - </w:t>
       </w:r>
-      <w:commentRangeStart w:id="57"/>
+      <w:commentRangeStart w:id="58"/>
       <w:r>
         <w:rPr>
           <w:rFonts w:eastAsiaTheme="majorEastAsia"/>
@@ -24137,7 +24588,7 @@
         </w:rPr>
         <w:t>Fuente de elaboración propia</w:t>
       </w:r>
-      <w:commentRangeEnd w:id="57"/>
+      <w:commentRangeEnd w:id="58"/>
       <w:r>
         <w:rPr>
           <w:rStyle w:val="CommentReference"/>
@@ -24145,7 +24596,7 @@
           <w:sz w:val="24"/>
           <w:szCs w:val="24"/>
         </w:rPr>
-        <w:commentReference w:id="57"/>
+        <w:commentReference w:id="58"/>
       </w:r>
       <w:r>
         <w:rPr>
@@ -25131,7 +25582,7 @@
           <w:rFonts w:eastAsiaTheme="majorEastAsia"/>
         </w:rPr>
       </w:pPr>
-      <w:bookmarkStart w:id="58" w:name="_Toc213252097"/>
+      <w:bookmarkStart w:id="59" w:name="_Toc213252097"/>
       <w:r>
         <w:rPr>
           <w:rFonts w:eastAsiaTheme="majorEastAsia"/>
@@ -25139,7 +25590,7 @@
         <w:lastRenderedPageBreak/>
         <w:t>Resultados de Proyecciones</w:t>
       </w:r>
-      <w:bookmarkEnd w:id="58"/>
+      <w:bookmarkEnd w:id="59"/>
     </w:p>
     <w:p>
       <w:pPr>
@@ -25154,7 +25605,7 @@
           <w:lang w:val="en-US" w:eastAsia="en-US"/>
         </w:rPr>
         <w:drawing>
-          <wp:inline distT="0" distB="0" distL="0" distR="0" wp14:anchorId="0DEC86CC" wp14:editId="5C3543BE">
+          <wp:inline distT="0" distB="0" distL="0" distR="0" wp14:anchorId="0DEC86CC" wp14:editId="029335AC">
             <wp:extent cx="5399405" cy="7374890"/>
             <wp:effectExtent l="19050" t="19050" r="10795" b="16510"/>
             <wp:docPr id="1235418700" name="Picture 3" descr="A graph of a graph&#10;&#10;AI-generated content may be incorrect."/>
@@ -25224,7 +25675,7 @@
           <w:b/>
         </w:rPr>
       </w:pPr>
-      <w:bookmarkStart w:id="59" w:name="_Toc213252098"/>
+      <w:bookmarkStart w:id="60" w:name="_Toc213252098"/>
       <w:r>
         <w:rPr>
           <w:rStyle w:val="Heading1Char"/>
@@ -25233,10 +25684,10 @@
         <w:lastRenderedPageBreak/>
         <w:t>Conclusiones</w:t>
       </w:r>
-      <w:bookmarkEnd w:id="59"/>
+      <w:bookmarkEnd w:id="60"/>
     </w:p>
     <w:p>
-      <w:commentRangeStart w:id="60"/>
+      <w:commentRangeStart w:id="61"/>
       <w:r>
         <w:t xml:space="preserve">Los resultados muestran que la incorporación de algoritmos de </w:t>
       </w:r>
@@ -25351,14 +25802,14 @@
       <w:r>
         <w:t xml:space="preserve"> como herramientas complementarias para el modelado actuarial de la mortalidad, especialmente útiles para identificar efectos de cohorte y patrones no lineales que los modelos tradicionales no capturan plenamente.</w:t>
       </w:r>
-      <w:commentRangeEnd w:id="60"/>
+      <w:commentRangeEnd w:id="61"/>
       <w:r>
         <w:rPr>
           <w:rStyle w:val="CommentReference"/>
           <w:sz w:val="24"/>
           <w:szCs w:val="24"/>
         </w:rPr>
-        <w:commentReference w:id="60"/>
+        <w:commentReference w:id="61"/>
       </w:r>
     </w:p>
     <w:p>
@@ -25380,7 +25831,7 @@
           <w:b/>
         </w:rPr>
       </w:pPr>
-      <w:bookmarkStart w:id="61" w:name="_Toc213252099"/>
+      <w:bookmarkStart w:id="62" w:name="_Toc213252099"/>
       <w:r>
         <w:rPr>
           <w:rStyle w:val="Heading1Char"/>
@@ -25416,7 +25867,7 @@
         </w:rPr>
         <w:t>nvestigación</w:t>
       </w:r>
-      <w:bookmarkEnd w:id="61"/>
+      <w:bookmarkEnd w:id="62"/>
     </w:p>
     <w:p/>
     <w:p>
@@ -25436,7 +25887,7 @@
         <w:br w:type="page"/>
       </w:r>
     </w:p>
-    <w:bookmarkStart w:id="62" w:name="_Toc213252100" w:displacedByCustomXml="next"/>
+    <w:bookmarkStart w:id="63" w:name="_Toc213252100" w:displacedByCustomXml="next"/>
     <w:sdt>
       <w:sdtPr>
         <w:rPr>
@@ -25465,7 +25916,7 @@
             </w:rPr>
             <w:t>Bibliografía</w:t>
           </w:r>
-          <w:bookmarkEnd w:id="62"/>
+          <w:bookmarkEnd w:id="63"/>
         </w:p>
         <w:sdt>
           <w:sdtPr>
@@ -25526,7 +25977,7 @@
           <w:lang w:val="en-US"/>
         </w:rPr>
       </w:pPr>
-      <w:bookmarkStart w:id="63" w:name="_Toc106706667"/>
+      <w:bookmarkStart w:id="64" w:name="_Toc106706667"/>
       <w:r>
         <w:rPr>
           <w:lang w:val="en-US"/>
@@ -25541,7 +25992,7 @@
           <w:lang w:val="es-AR"/>
         </w:rPr>
       </w:pPr>
-      <w:bookmarkStart w:id="64" w:name="_Toc213252101"/>
+      <w:bookmarkStart w:id="65" w:name="_Toc213252101"/>
       <w:r>
         <w:rPr>
           <w:lang w:val="es-AR"/>
@@ -25555,14 +26006,14 @@
         </w:rPr>
         <w:t>Anexo</w:t>
       </w:r>
-      <w:bookmarkEnd w:id="63"/>
+      <w:bookmarkEnd w:id="64"/>
       <w:r>
         <w:rPr>
           <w:lang w:val="es-AR"/>
         </w:rPr>
         <w:t>s</w:t>
       </w:r>
-      <w:bookmarkEnd w:id="64"/>
+      <w:bookmarkEnd w:id="65"/>
     </w:p>
     <w:p>
       <w:pPr>
@@ -25571,7 +26022,7 @@
           <w:lang w:val="es-AR"/>
         </w:rPr>
       </w:pPr>
-      <w:bookmarkStart w:id="65" w:name="_Toc213252102"/>
+      <w:bookmarkStart w:id="66" w:name="_Toc213252102"/>
       <w:r>
         <w:rPr>
           <w:lang w:val="es-AR"/>
@@ -25608,7 +26059,7 @@
         </w:rPr>
         <w:t>descripción de las variables disponibles en el dataset.</w:t>
       </w:r>
-      <w:bookmarkEnd w:id="65"/>
+      <w:bookmarkEnd w:id="66"/>
       <w:r>
         <w:rPr>
           <w:lang w:val="es-AR"/>
@@ -25623,8 +26074,8 @@
           <w:lang w:val="es-AR"/>
         </w:rPr>
       </w:pPr>
-      <w:bookmarkStart w:id="66" w:name="_Toc106706668"/>
-      <w:bookmarkStart w:id="67" w:name="_Toc213252103"/>
+      <w:bookmarkStart w:id="67" w:name="_Toc106706668"/>
+      <w:bookmarkStart w:id="68" w:name="_Toc213252103"/>
       <w:r>
         <w:rPr>
           <w:lang w:val="es-AR"/>
@@ -25679,8 +26130,8 @@
         </w:rPr>
         <w:t>proximación a la data.</w:t>
       </w:r>
-      <w:bookmarkEnd w:id="66"/>
       <w:bookmarkEnd w:id="67"/>
+      <w:bookmarkEnd w:id="68"/>
       <w:r>
         <w:rPr>
           <w:lang w:val="es-AR"/>
@@ -26066,7 +26517,7 @@
       </w:r>
     </w:p>
   </w:comment>
-  <w:comment w:id="47" w:author="Franco Nahuel  Olivero" w:date="2025-11-05T15:59:00Z" w:initials="FO">
+  <w:comment w:id="47" w:author="Franco Nahuel  Olivero" w:date="2025-11-12T22:55:00Z" w:initials="FO">
     <w:p>
       <w:pPr>
         <w:pStyle w:val="CommentText"/>
@@ -26079,11 +26530,11 @@
         <w:annotationRef/>
       </w:r>
       <w:r>
-        <w:t>completar</w:t>
+        <w:t>referenciar</w:t>
       </w:r>
     </w:p>
   </w:comment>
-  <w:comment w:id="48" w:author="Franco Nahuel  Olivero" w:date="2025-11-05T16:26:00Z" w:initials="FO">
+  <w:comment w:id="48" w:author="Franco Nahuel  Olivero" w:date="2025-11-05T15:59:00Z" w:initials="FO">
     <w:p>
       <w:pPr>
         <w:pStyle w:val="CommentText"/>
@@ -26096,11 +26547,11 @@
         <w:annotationRef/>
       </w:r>
       <w:r>
-        <w:t>Ver si se puede referenciar anexo, y poner ahí proyecciones/estimaciones de kappa</w:t>
+        <w:t>completar</w:t>
       </w:r>
     </w:p>
   </w:comment>
-  <w:comment w:id="49" w:author="Franco Nahuel  Olivero" w:date="2025-11-04T14:23:00Z" w:initials="FO">
+  <w:comment w:id="49" w:author="Franco Nahuel  Olivero" w:date="2025-11-05T16:26:00Z" w:initials="FO">
     <w:p>
       <w:pPr>
         <w:pStyle w:val="CommentText"/>
@@ -26113,11 +26564,11 @@
         <w:annotationRef/>
       </w:r>
       <w:r>
-        <w:t>linkear</w:t>
+        <w:t>Ver si se puede referenciar anexo, y poner ahí proyecciones/estimaciones de kappa</w:t>
       </w:r>
     </w:p>
   </w:comment>
-  <w:comment w:id="51" w:author="Franco Nahuel  Olivero" w:date="2025-11-04T21:53:00Z" w:initials="FO">
+  <w:comment w:id="50" w:author="Franco Nahuel  Olivero" w:date="2025-11-04T14:23:00Z" w:initials="FO">
     <w:p>
       <w:pPr>
         <w:pStyle w:val="CommentText"/>
@@ -26130,11 +26581,11 @@
         <w:annotationRef/>
       </w:r>
       <w:r>
-        <w:t>Agregar link</w:t>
+        <w:t>linkear</w:t>
       </w:r>
     </w:p>
   </w:comment>
-  <w:comment w:id="52" w:author="Franco Nahuel  Olivero" w:date="2025-11-04T05:13:00Z" w:initials="FO">
+  <w:comment w:id="52" w:author="Franco Nahuel  Olivero" w:date="2025-11-04T21:53:00Z" w:initials="FO">
     <w:p>
       <w:pPr>
         <w:pStyle w:val="CommentText"/>
@@ -26147,11 +26598,11 @@
         <w:annotationRef/>
       </w:r>
       <w:r>
-        <w:t>Pendiente</w:t>
+        <w:t>Agregar link</w:t>
       </w:r>
     </w:p>
   </w:comment>
-  <w:comment w:id="53" w:author="Franco Nahuel  Olivero" w:date="2025-11-05T02:17:00Z" w:initials="FO">
+  <w:comment w:id="53" w:author="Franco Nahuel  Olivero" w:date="2025-11-04T05:13:00Z" w:initials="FO">
     <w:p>
       <w:pPr>
         <w:pStyle w:val="CommentText"/>
@@ -26164,11 +26615,11 @@
         <w:annotationRef/>
       </w:r>
       <w:r>
-        <w:t>Completar referencia con pagina</w:t>
+        <w:t>Pendiente</w:t>
       </w:r>
     </w:p>
   </w:comment>
-  <w:comment w:id="54" w:author="Franco Nahuel  Olivero" w:date="2025-11-05T03:28:00Z" w:initials="FO">
+  <w:comment w:id="54" w:author="Franco Nahuel  Olivero" w:date="2025-11-05T02:17:00Z" w:initials="FO">
     <w:p>
       <w:pPr>
         <w:pStyle w:val="CommentText"/>
@@ -26181,11 +26632,11 @@
         <w:annotationRef/>
       </w:r>
       <w:r>
-        <w:t>Agregar referencia a levantessi y pizzo russo</w:t>
+        <w:t>Completar referencia con pagina</w:t>
       </w:r>
     </w:p>
   </w:comment>
-  <w:comment w:id="56" w:author="Franco Nahuel  Olivero" w:date="2025-11-05T15:44:00Z" w:initials="FO">
+  <w:comment w:id="55" w:author="Franco Nahuel  Olivero" w:date="2025-11-05T03:28:00Z" w:initials="FO">
     <w:p>
       <w:pPr>
         <w:pStyle w:val="CommentText"/>
@@ -26198,11 +26649,11 @@
         <w:annotationRef/>
       </w:r>
       <w:r>
-        <w:t>Referenciar</w:t>
+        <w:t>Agregar referencia a levantessi y pizzo russo</w:t>
       </w:r>
     </w:p>
   </w:comment>
-  <w:comment w:id="57" w:author="Franco Nahuel  Olivero" w:date="2025-11-05T15:56:00Z" w:initials="FO">
+  <w:comment w:id="57" w:author="Franco Nahuel  Olivero" w:date="2025-11-05T15:44:00Z" w:initials="FO">
     <w:p>
       <w:pPr>
         <w:pStyle w:val="CommentText"/>
@@ -26215,11 +26666,28 @@
         <w:annotationRef/>
       </w:r>
       <w:r>
-        <w:t>completar</w:t>
+        <w:t>Referenciar</w:t>
       </w:r>
     </w:p>
   </w:comment>
-  <w:comment w:id="60" w:author="Franco Nahuel  Olivero" w:date="2025-11-04T04:22:00Z" w:initials="FO">
+  <w:comment w:id="58" w:author="Franco Nahuel  Olivero" w:date="2025-11-05T15:56:00Z" w:initials="FO">
+    <w:p>
+      <w:pPr>
+        <w:pStyle w:val="CommentText"/>
+        <w:jc w:val="left"/>
+      </w:pPr>
+      <w:r>
+        <w:rPr>
+          <w:rStyle w:val="CommentReference"/>
+        </w:rPr>
+        <w:annotationRef/>
+      </w:r>
+      <w:r>
+        <w:t>completar</w:t>
+      </w:r>
+    </w:p>
+  </w:comment>
+  <w:comment w:id="61" w:author="Franco Nahuel  Olivero" w:date="2025-11-04T04:22:00Z" w:initials="FO">
     <w:p>
       <w:pPr>
         <w:pStyle w:val="CommentText"/>
@@ -26261,6 +26729,7 @@
   <w15:commentEx w15:paraId="384B88DC" w15:done="0"/>
   <w15:commentEx w15:paraId="1A707849" w15:done="0"/>
   <w15:commentEx w15:paraId="38829E5C" w15:done="0"/>
+  <w15:commentEx w15:paraId="1DB39D72" w15:done="0"/>
   <w15:commentEx w15:paraId="03DF6750" w15:done="0"/>
   <w15:commentEx w15:paraId="14E5A73E" w15:paraIdParent="03DF6750" w15:done="0"/>
   <w15:commentEx w15:paraId="6B2A32BF" w15:done="0"/>
@@ -26296,6 +26765,7 @@
   <w16cex:commentExtensible w16cex:durableId="630FCF03" w16cex:dateUtc="2025-11-04T04:08:00Z"/>
   <w16cex:commentExtensible w16cex:durableId="5469508D" w16cex:dateUtc="2025-11-07T06:39:00Z"/>
   <w16cex:commentExtensible w16cex:durableId="4F1386A7" w16cex:dateUtc="2025-11-05T18:57:00Z"/>
+  <w16cex:commentExtensible w16cex:durableId="0BB32EE1" w16cex:dateUtc="2025-11-13T01:55:00Z"/>
   <w16cex:commentExtensible w16cex:durableId="59CE6C07" w16cex:dateUtc="2025-11-05T18:59:00Z"/>
   <w16cex:commentExtensible w16cex:durableId="4F20B557" w16cex:dateUtc="2025-11-05T19:26:00Z"/>
   <w16cex:commentExtensible w16cex:durableId="3F75653C" w16cex:dateUtc="2025-11-04T17:23:00Z"/>
@@ -26331,6 +26801,7 @@
   <w16cid:commentId w16cid:paraId="384B88DC" w16cid:durableId="630FCF03"/>
   <w16cid:commentId w16cid:paraId="1A707849" w16cid:durableId="5469508D"/>
   <w16cid:commentId w16cid:paraId="38829E5C" w16cid:durableId="4F1386A7"/>
+  <w16cid:commentId w16cid:paraId="1DB39D72" w16cid:durableId="0BB32EE1"/>
   <w16cid:commentId w16cid:paraId="03DF6750" w16cid:durableId="59CE6C07"/>
   <w16cid:commentId w16cid:paraId="14E5A73E" w16cid:durableId="4F20B557"/>
   <w16cid:commentId w16cid:paraId="6B2A32BF" w16cid:durableId="3F75653C"/>
@@ -26443,28 +26914,6 @@
           <m:t>.</m:t>
         </m:r>
       </m:oMath>
-    </w:p>
-  </w:footnote>
-  <w:footnote w:id="2">
-    <w:p>
-      <w:pPr>
-        <w:pStyle w:val="FootnoteText"/>
-      </w:pPr>
-      <w:r>
-        <w:rPr>
-          <w:rStyle w:val="FootnoteReference"/>
-        </w:rPr>
-        <w:footnoteRef/>
-      </w:r>
-      <w:r>
-        <w:t xml:space="preserve"> </w:t>
-      </w:r>
-      <w:r>
-        <w:rPr>
-          <w:rFonts w:eastAsiaTheme="majorEastAsia"/>
-        </w:rPr>
-        <w:t>Kuhn y Johnson (2013)</w:t>
-      </w:r>
     </w:p>
   </w:footnote>
 </w:footnotes>
@@ -32938,21 +33387,6 @@
 </file>
 
 <file path=customXml/item1.xml><?xml version="1.0" encoding="utf-8"?>
-<?mso-contentType ?>
-<FormTemplates xmlns="http://schemas.microsoft.com/sharepoint/v3/contenttype/forms">
-  <Display>DocumentLibraryForm</Display>
-  <Edit>DocumentLibraryForm</Edit>
-  <New>DocumentLibraryForm</New>
-</FormTemplates>
-</file>
-
-<file path=customXml/item2.xml><?xml version="1.0" encoding="utf-8"?>
-<p:properties xmlns:p="http://schemas.microsoft.com/office/2006/metadata/properties" xmlns:xsi="http://www.w3.org/2001/XMLSchema-instance" xmlns:pc="http://schemas.microsoft.com/office/infopath/2007/PartnerControls">
-  <documentManagement/>
-</p:properties>
-</file>
-
-<file path=customXml/item3.xml><?xml version="1.0" encoding="utf-8"?>
 <b:Sources xmlns:b="http://schemas.openxmlformats.org/officeDocument/2006/bibliography" xmlns="http://schemas.openxmlformats.org/officeDocument/2006/bibliography" SelectedStyle="\APASixthEditionOfficeOnline.xsl" StyleName="APA" Version="6">
   <b:Source>
     <b:Tag>Bre94</b:Tag>
@@ -33161,6 +33595,21 @@
     <b:RefOrder>12</b:RefOrder>
   </b:Source>
 </b:Sources>
+</file>
+
+<file path=customXml/item2.xml><?xml version="1.0" encoding="utf-8"?>
+<p:properties xmlns:p="http://schemas.microsoft.com/office/2006/metadata/properties" xmlns:xsi="http://www.w3.org/2001/XMLSchema-instance" xmlns:pc="http://schemas.microsoft.com/office/infopath/2007/PartnerControls">
+  <documentManagement/>
+</p:properties>
+</file>
+
+<file path=customXml/item3.xml><?xml version="1.0" encoding="utf-8"?>
+<?mso-contentType ?>
+<FormTemplates xmlns="http://schemas.microsoft.com/sharepoint/v3/contenttype/forms">
+  <Display>DocumentLibraryForm</Display>
+  <Edit>DocumentLibraryForm</Edit>
+  <New>DocumentLibraryForm</New>
+</FormTemplates>
 </file>
 
 <file path=customXml/item4.xml><?xml version="1.0" encoding="utf-8"?>
@@ -33381,9 +33830,9 @@
 </file>
 
 <file path=customXml/itemProps1.xml><?xml version="1.0" encoding="utf-8"?>
-<ds:datastoreItem xmlns:ds="http://schemas.openxmlformats.org/officeDocument/2006/customXml" ds:itemID="{8B74864E-CF63-4F24-9CD8-35513C3E63B6}">
+<ds:datastoreItem xmlns:ds="http://schemas.openxmlformats.org/officeDocument/2006/customXml" ds:itemID="{9BDC425E-9D3C-4D0E-B578-BDF0BDEB0E2A}">
   <ds:schemaRefs>
-    <ds:schemaRef ds:uri="http://schemas.microsoft.com/sharepoint/v3/contenttype/forms"/>
+    <ds:schemaRef ds:uri="http://schemas.openxmlformats.org/officeDocument/2006/bibliography"/>
   </ds:schemaRefs>
 </ds:datastoreItem>
 </file>
@@ -33398,9 +33847,9 @@
 </file>
 
 <file path=customXml/itemProps3.xml><?xml version="1.0" encoding="utf-8"?>
-<ds:datastoreItem xmlns:ds="http://schemas.openxmlformats.org/officeDocument/2006/customXml" ds:itemID="{9BDC425E-9D3C-4D0E-B578-BDF0BDEB0E2A}">
+<ds:datastoreItem xmlns:ds="http://schemas.openxmlformats.org/officeDocument/2006/customXml" ds:itemID="{8B74864E-CF63-4F24-9CD8-35513C3E63B6}">
   <ds:schemaRefs>
-    <ds:schemaRef ds:uri="http://schemas.openxmlformats.org/officeDocument/2006/bibliography"/>
+    <ds:schemaRef ds:uri="http://schemas.microsoft.com/sharepoint/v3/contenttype/forms"/>
   </ds:schemaRefs>
 </ds:datastoreItem>
 </file>

</xml_diff>